<commit_message>
Demonstrate JVM Class Loaders using String, ArrayList, and User-Defined Class  #3
</commit_message>
<xml_diff>
--- a/Java Virtual Machine.docx
+++ b/Java Virtual Machine.docx
@@ -20,11 +20,15 @@
       <w:pPr>
         <w:jc w:val="center"/>
         <w:rPr>
-          <w:lang w:val="en-US"/>
-        </w:rPr>
-      </w:pPr>
-      <w:r>
-        <w:rPr>
+          <w:b/>
+          <w:bCs/>
+          <w:lang w:val="en-US"/>
+        </w:rPr>
+      </w:pPr>
+      <w:r>
+        <w:rPr>
+          <w:b/>
+          <w:bCs/>
           <w:lang w:val="en-US"/>
         </w:rPr>
         <w:t>JVM</w:t>
@@ -32,14 +36,6 @@
     </w:p>
     <w:p>
       <w:pPr>
-        <w:jc w:val="center"/>
-        <w:rPr>
-          <w:lang w:val="en-US"/>
-        </w:rPr>
-      </w:pPr>
-    </w:p>
-    <w:p>
-      <w:pPr>
         <w:rPr>
           <w:b/>
           <w:bCs/>
@@ -65,7 +61,13 @@
         <w:rPr>
           <w:lang w:val="en-US"/>
         </w:rPr>
-        <w:t xml:space="preserve">It ‘s a software simulation that does not have physical exitance and can perform operations like physical machine. </w:t>
+        <w:t>It’s</w:t>
+      </w:r>
+      <w:r>
+        <w:rPr>
+          <w:lang w:val="en-US"/>
+        </w:rPr>
+        <w:t xml:space="preserve"> a software simulation that does not have physical exitance and can perform operations like physical machine. </w:t>
       </w:r>
     </w:p>
     <w:p>
@@ -248,6 +250,109 @@
       </w:r>
     </w:p>
     <w:p>
+      <w:r>
+        <w:rPr>
+          <w:b/>
+          <w:bCs/>
+          <w:lang w:val="en-US"/>
+        </w:rPr>
+        <w:t>JAVA Development Tool Kit (JDK):</w:t>
+      </w:r>
+      <w:r>
+        <w:rPr>
+          <w:b/>
+          <w:bCs/>
+        </w:rPr>
+        <w:t xml:space="preserve"> </w:t>
+      </w:r>
+      <w:r>
+        <w:t>is a software development environment that provides tools, libraries, and runtime components required to develop, compile, debug, and run Java applications.</w:t>
+      </w:r>
+    </w:p>
+    <w:p/>
+    <w:p>
+      <w:pPr>
+        <w:jc w:val="center"/>
+        <w:rPr>
+          <w:lang w:val="en-US"/>
+        </w:rPr>
+      </w:pPr>
+      <w:r>
+        <w:rPr>
+          <w:noProof/>
+          <w:lang w:val="en-US"/>
+        </w:rPr>
+        <w:drawing>
+          <wp:inline distT="0" distB="0" distL="0" distR="0" wp14:anchorId="4F0E02B0" wp14:editId="3ED050F4">
+            <wp:extent cx="6390640" cy="4572000"/>
+            <wp:effectExtent l="0" t="0" r="0" b="0"/>
+            <wp:docPr id="1423963372" name="Picture 1"/>
+            <wp:cNvGraphicFramePr>
+              <a:graphicFrameLocks xmlns:a="http://schemas.openxmlformats.org/drawingml/2006/main" noChangeAspect="1"/>
+            </wp:cNvGraphicFramePr>
+            <a:graphic xmlns:a="http://schemas.openxmlformats.org/drawingml/2006/main">
+              <a:graphicData uri="http://schemas.openxmlformats.org/drawingml/2006/picture">
+                <pic:pic xmlns:pic="http://schemas.openxmlformats.org/drawingml/2006/picture">
+                  <pic:nvPicPr>
+                    <pic:cNvPr id="1423963372" name="Picture 1423963372"/>
+                    <pic:cNvPicPr/>
+                  </pic:nvPicPr>
+                  <pic:blipFill>
+                    <a:blip r:embed="rId7">
+                      <a:extLst>
+                        <a:ext uri="{28A0092B-C50C-407E-A947-70E740481C1C}">
+                          <a14:useLocalDpi xmlns:a14="http://schemas.microsoft.com/office/drawing/2010/main" val="0"/>
+                        </a:ext>
+                      </a:extLst>
+                    </a:blip>
+                    <a:stretch>
+                      <a:fillRect/>
+                    </a:stretch>
+                  </pic:blipFill>
+                  <pic:spPr>
+                    <a:xfrm>
+                      <a:off x="0" y="0"/>
+                      <a:ext cx="6390640" cy="4572000"/>
+                    </a:xfrm>
+                    <a:prstGeom prst="rect">
+                      <a:avLst/>
+                    </a:prstGeom>
+                  </pic:spPr>
+                </pic:pic>
+              </a:graphicData>
+            </a:graphic>
+          </wp:inline>
+        </w:drawing>
+      </w:r>
+    </w:p>
+    <w:p>
+      <w:pPr>
+        <w:rPr>
+          <w:b/>
+          <w:bCs/>
+          <w:lang w:val="en-US"/>
+        </w:rPr>
+      </w:pPr>
+    </w:p>
+    <w:p>
+      <w:pPr>
+        <w:rPr>
+          <w:b/>
+          <w:bCs/>
+          <w:lang w:val="en-US"/>
+        </w:rPr>
+      </w:pPr>
+    </w:p>
+    <w:p>
+      <w:pPr>
+        <w:rPr>
+          <w:b/>
+          <w:bCs/>
+          <w:lang w:val="en-US"/>
+        </w:rPr>
+      </w:pPr>
+    </w:p>
+    <w:p>
       <w:pPr>
         <w:rPr>
           <w:lang w:val="en-US"/>
@@ -540,6 +645,225 @@
     <w:p>
       <w:pPr>
         <w:pStyle w:val="ListParagraph"/>
+      </w:pPr>
+    </w:p>
+    <w:p>
+      <w:pPr>
+        <w:pStyle w:val="ListParagraph"/>
+      </w:pPr>
+    </w:p>
+    <w:p>
+      <w:pPr>
+        <w:pStyle w:val="ListParagraph"/>
+        <w:ind w:left="0"/>
+        <w:jc w:val="center"/>
+      </w:pPr>
+      <w:r>
+        <w:rPr>
+          <w:noProof/>
+        </w:rPr>
+        <w:drawing>
+          <wp:inline distT="0" distB="0" distL="0" distR="0" wp14:anchorId="5C44160F" wp14:editId="6CD25F63">
+            <wp:extent cx="6438900" cy="3714750"/>
+            <wp:effectExtent l="0" t="0" r="0" b="0"/>
+            <wp:docPr id="725757202" name="Picture 1"/>
+            <wp:cNvGraphicFramePr>
+              <a:graphicFrameLocks xmlns:a="http://schemas.openxmlformats.org/drawingml/2006/main" noChangeAspect="1"/>
+            </wp:cNvGraphicFramePr>
+            <a:graphic xmlns:a="http://schemas.openxmlformats.org/drawingml/2006/main">
+              <a:graphicData uri="http://schemas.openxmlformats.org/drawingml/2006/picture">
+                <pic:pic xmlns:pic="http://schemas.openxmlformats.org/drawingml/2006/picture">
+                  <pic:nvPicPr>
+                    <pic:cNvPr id="725757202" name=""/>
+                    <pic:cNvPicPr/>
+                  </pic:nvPicPr>
+                  <pic:blipFill>
+                    <a:blip r:embed="rId8"/>
+                    <a:stretch>
+                      <a:fillRect/>
+                    </a:stretch>
+                  </pic:blipFill>
+                  <pic:spPr>
+                    <a:xfrm>
+                      <a:off x="0" y="0"/>
+                      <a:ext cx="6438900" cy="3714750"/>
+                    </a:xfrm>
+                    <a:prstGeom prst="rect">
+                      <a:avLst/>
+                    </a:prstGeom>
+                  </pic:spPr>
+                </pic:pic>
+              </a:graphicData>
+            </a:graphic>
+          </wp:inline>
+        </w:drawing>
+      </w:r>
+    </w:p>
+    <w:p>
+      <w:pPr>
+        <w:pStyle w:val="ListParagraph"/>
+        <w:ind w:left="0"/>
+        <w:jc w:val="center"/>
+      </w:pPr>
+    </w:p>
+    <w:p>
+      <w:pPr>
+        <w:pStyle w:val="ListParagraph"/>
+        <w:ind w:left="0"/>
+        <w:jc w:val="center"/>
+      </w:pPr>
+    </w:p>
+    <w:p>
+      <w:pPr>
+        <w:pStyle w:val="ListParagraph"/>
+        <w:ind w:left="0"/>
+        <w:jc w:val="center"/>
+      </w:pPr>
+    </w:p>
+    <w:p>
+      <w:pPr>
+        <w:pStyle w:val="ListParagraph"/>
+        <w:ind w:left="0"/>
+        <w:jc w:val="center"/>
+      </w:pPr>
+      <w:r>
+        <w:rPr>
+          <w:noProof/>
+        </w:rPr>
+        <w:lastRenderedPageBreak/>
+        <w:drawing>
+          <wp:inline distT="0" distB="0" distL="0" distR="0" wp14:anchorId="67680AEB" wp14:editId="6DD7049F">
+            <wp:extent cx="6390640" cy="4838700"/>
+            <wp:effectExtent l="0" t="0" r="0" b="0"/>
+            <wp:docPr id="529262967" name="Picture 1"/>
+            <wp:cNvGraphicFramePr>
+              <a:graphicFrameLocks xmlns:a="http://schemas.openxmlformats.org/drawingml/2006/main" noChangeAspect="1"/>
+            </wp:cNvGraphicFramePr>
+            <a:graphic xmlns:a="http://schemas.openxmlformats.org/drawingml/2006/main">
+              <a:graphicData uri="http://schemas.openxmlformats.org/drawingml/2006/picture">
+                <pic:pic xmlns:pic="http://schemas.openxmlformats.org/drawingml/2006/picture">
+                  <pic:nvPicPr>
+                    <pic:cNvPr id="529262967" name=""/>
+                    <pic:cNvPicPr/>
+                  </pic:nvPicPr>
+                  <pic:blipFill>
+                    <a:blip r:embed="rId9"/>
+                    <a:stretch>
+                      <a:fillRect/>
+                    </a:stretch>
+                  </pic:blipFill>
+                  <pic:spPr>
+                    <a:xfrm>
+                      <a:off x="0" y="0"/>
+                      <a:ext cx="6390640" cy="4838700"/>
+                    </a:xfrm>
+                    <a:prstGeom prst="rect">
+                      <a:avLst/>
+                    </a:prstGeom>
+                  </pic:spPr>
+                </pic:pic>
+              </a:graphicData>
+            </a:graphic>
+          </wp:inline>
+        </w:drawing>
+      </w:r>
+    </w:p>
+    <w:p>
+      <w:pPr>
+        <w:pStyle w:val="ListParagraph"/>
+      </w:pPr>
+    </w:p>
+    <w:p>
+      <w:pPr>
+        <w:pStyle w:val="ListParagraph"/>
+        <w:ind w:left="0"/>
+        <w:jc w:val="center"/>
+        <w:rPr>
+          <w:b/>
+          <w:bCs/>
+        </w:rPr>
+      </w:pPr>
+      <w:r>
+        <w:rPr>
+          <w:noProof/>
+        </w:rPr>
+        <w:drawing>
+          <wp:inline distT="0" distB="0" distL="0" distR="0" wp14:anchorId="4757E856" wp14:editId="6EE9CE10">
+            <wp:extent cx="6390640" cy="3692525"/>
+            <wp:effectExtent l="0" t="0" r="0" b="3175"/>
+            <wp:docPr id="1572536237" name="Picture 1"/>
+            <wp:cNvGraphicFramePr>
+              <a:graphicFrameLocks xmlns:a="http://schemas.openxmlformats.org/drawingml/2006/main" noChangeAspect="1"/>
+            </wp:cNvGraphicFramePr>
+            <a:graphic xmlns:a="http://schemas.openxmlformats.org/drawingml/2006/main">
+              <a:graphicData uri="http://schemas.openxmlformats.org/drawingml/2006/picture">
+                <pic:pic xmlns:pic="http://schemas.openxmlformats.org/drawingml/2006/picture">
+                  <pic:nvPicPr>
+                    <pic:cNvPr id="1572536237" name=""/>
+                    <pic:cNvPicPr/>
+                  </pic:nvPicPr>
+                  <pic:blipFill>
+                    <a:blip r:embed="rId10"/>
+                    <a:stretch>
+                      <a:fillRect/>
+                    </a:stretch>
+                  </pic:blipFill>
+                  <pic:spPr>
+                    <a:xfrm>
+                      <a:off x="0" y="0"/>
+                      <a:ext cx="6390640" cy="3692525"/>
+                    </a:xfrm>
+                    <a:prstGeom prst="rect">
+                      <a:avLst/>
+                    </a:prstGeom>
+                  </pic:spPr>
+                </pic:pic>
+              </a:graphicData>
+            </a:graphic>
+          </wp:inline>
+        </w:drawing>
+      </w:r>
+    </w:p>
+    <w:p>
+      <w:pPr>
+        <w:pStyle w:val="ListParagraph"/>
+        <w:rPr>
+          <w:b/>
+          <w:bCs/>
+        </w:rPr>
+      </w:pPr>
+    </w:p>
+    <w:p>
+      <w:pPr>
+        <w:pStyle w:val="ListParagraph"/>
+      </w:pPr>
+    </w:p>
+    <w:p>
+      <w:pPr>
+        <w:pStyle w:val="ListParagraph"/>
+      </w:pPr>
+      <w:r>
+        <w:rPr>
+          <w:b/>
+          <w:bCs/>
+        </w:rPr>
+        <w:t>Initialization</w:t>
+      </w:r>
+      <w:r>
+        <w:t>:</w:t>
+      </w:r>
+      <w:r>
+        <w:t xml:space="preserve"> is the final phase of the class loading process in which the JVM assigns actual values to static variables and executes static blocks of a class.</w:t>
+      </w:r>
+    </w:p>
+    <w:p>
+      <w:pPr>
+        <w:pStyle w:val="ListParagraph"/>
+      </w:pPr>
+    </w:p>
+    <w:p>
+      <w:pPr>
+        <w:pStyle w:val="ListParagraph"/>
         <w:rPr>
           <w:lang w:val="en-US"/>
         </w:rPr>
@@ -561,15 +885,25 @@
       </w:pPr>
       <w:r>
         <w:rPr>
+          <w:b/>
+          <w:bCs/>
           <w:lang w:val="en-US"/>
         </w:rPr>
         <w:t>Linking</w:t>
       </w:r>
       <w:r>
         <w:rPr>
-          <w:lang w:val="en-US"/>
-        </w:rPr>
-        <w:t xml:space="preserve">: </w:t>
+          <w:b/>
+          <w:bCs/>
+          <w:lang w:val="en-US"/>
+        </w:rPr>
+        <w:t>:</w:t>
+      </w:r>
+      <w:r>
+        <w:rPr>
+          <w:lang w:val="en-US"/>
+        </w:rPr>
+        <w:t xml:space="preserve"> </w:t>
       </w:r>
       <w:r>
         <w:t>Linking is the process of preparing the loaded class so it can be used safely and correctly.</w:t>
@@ -580,6 +914,88 @@
         </w:rPr>
         <w:t xml:space="preserve"> </w:t>
       </w:r>
+    </w:p>
+    <w:p>
+      <w:pPr>
+        <w:ind w:left="360"/>
+      </w:pPr>
+      <w:r>
+        <w:rPr>
+          <w:b/>
+          <w:bCs/>
+        </w:rPr>
+        <w:t>Verification</w:t>
+      </w:r>
+      <w:r>
+        <w:t>:</w:t>
+      </w:r>
+      <w:r>
+        <w:t xml:space="preserve"> is the process of checking whether the loaded bytecode is structurally correct and safe to execute according to JVM specifications</w:t>
+      </w:r>
+      <w:r>
+        <w:t xml:space="preserve"> and it’s done by </w:t>
+      </w:r>
+      <w:r>
+        <w:t>bytecode</w:t>
+      </w:r>
+      <w:r>
+        <w:t xml:space="preserve"> verifier.</w:t>
+      </w:r>
+    </w:p>
+    <w:p>
+      <w:pPr>
+        <w:ind w:left="360"/>
+      </w:pPr>
+      <w:r>
+        <w:rPr>
+          <w:b/>
+          <w:bCs/>
+        </w:rPr>
+        <w:t>Preparation</w:t>
+      </w:r>
+      <w:r>
+        <w:t>:</w:t>
+      </w:r>
+      <w:r>
+        <w:t xml:space="preserve"> is the phase where memory is allocated for class-level static variables and they are assigned default values.</w:t>
+      </w:r>
+    </w:p>
+    <w:p>
+      <w:pPr>
+        <w:ind w:left="360"/>
+      </w:pPr>
+      <w:r>
+        <w:rPr>
+          <w:b/>
+          <w:bCs/>
+        </w:rPr>
+        <w:t>Resolution</w:t>
+      </w:r>
+      <w:r>
+        <w:t>:</w:t>
+      </w:r>
+      <w:r>
+        <w:t xml:space="preserve"> is the process of converting symbolic references in the class into direct memory references</w:t>
+      </w:r>
+      <w:r>
+        <w:t xml:space="preserve"> in the constants pool of the parent class</w:t>
+      </w:r>
+      <w:r>
+        <w:t>.</w:t>
+      </w:r>
+    </w:p>
+    <w:p>
+      <w:pPr>
+        <w:pStyle w:val="ListParagraph"/>
+      </w:pPr>
+    </w:p>
+    <w:p>
+      <w:pPr>
+        <w:pStyle w:val="ListParagraph"/>
+        <w:rPr>
+          <w:lang w:val="en-US"/>
+        </w:rPr>
+      </w:pPr>
     </w:p>
     <w:p>
       <w:pPr>
@@ -615,12 +1031,509 @@
       </w:r>
     </w:p>
     <w:p>
-      <w:r>
-        <w:rPr>
-          <w:b/>
-          <w:bCs/>
-        </w:rPr>
-        <w:t>Runtime Data Area</w:t>
+      <w:pPr>
+        <w:pStyle w:val="ListParagraph"/>
+        <w:rPr>
+          <w:lang w:val="en-US"/>
+        </w:rPr>
+      </w:pPr>
+    </w:p>
+    <w:p>
+      <w:pPr>
+        <w:pStyle w:val="ListParagraph"/>
+        <w:jc w:val="center"/>
+      </w:pPr>
+      <w:r>
+        <w:t>“</w:t>
+      </w:r>
+      <w:r>
+        <w:t xml:space="preserve">If compilation is fine but runtime class connection fails → </w:t>
+      </w:r>
+      <w:proofErr w:type="spellStart"/>
+      <w:r>
+        <w:t>LinkageError</w:t>
+      </w:r>
+      <w:proofErr w:type="spellEnd"/>
+      <w:r>
+        <w:t>”</w:t>
+      </w:r>
+    </w:p>
+    <w:p>
+      <w:pPr>
+        <w:pStyle w:val="ListParagraph"/>
+        <w:jc w:val="center"/>
+      </w:pPr>
+    </w:p>
+    <w:p>
+      <w:pPr>
+        <w:pStyle w:val="ListParagraph"/>
+        <w:ind w:left="426"/>
+        <w:rPr>
+          <w:b/>
+          <w:bCs/>
+          <w:u w:val="single"/>
+        </w:rPr>
+      </w:pPr>
+      <w:r>
+        <w:rPr>
+          <w:b/>
+          <w:bCs/>
+          <w:u w:val="single"/>
+        </w:rPr>
+        <w:t xml:space="preserve">Types of class loaders: </w:t>
+      </w:r>
+    </w:p>
+    <w:p>
+      <w:pPr>
+        <w:pStyle w:val="ListParagraph"/>
+        <w:numPr>
+          <w:ilvl w:val="0"/>
+          <w:numId w:val="3"/>
+        </w:numPr>
+      </w:pPr>
+      <w:r>
+        <w:rPr>
+          <w:b/>
+          <w:bCs/>
+        </w:rPr>
+        <w:t xml:space="preserve">Bootstrap class </w:t>
+      </w:r>
+      <w:r>
+        <w:rPr>
+          <w:b/>
+          <w:bCs/>
+        </w:rPr>
+        <w:t>loader</w:t>
+      </w:r>
+      <w:r>
+        <w:t xml:space="preserve">: </w:t>
+      </w:r>
+      <w:r>
+        <w:t>is the root class loader in JVM that loads core Java classes from the JDK internal runtime libraries.</w:t>
+      </w:r>
+    </w:p>
+    <w:p>
+      <w:pPr>
+        <w:spacing w:after="0" w:line="240" w:lineRule="auto"/>
+        <w:rPr>
+          <w:rFonts w:ascii="Times New Roman" w:eastAsia="Times New Roman" w:hAnsi="Times New Roman" w:cs="Times New Roman"/>
+          <w:kern w:val="0"/>
+          <w:sz w:val="24"/>
+          <w:szCs w:val="24"/>
+          <w:lang w:eastAsia="en-AE"/>
+          <w14:ligatures w14:val="none"/>
+        </w:rPr>
+      </w:pPr>
+      <w:r>
+        <w:rPr>
+          <w:rFonts w:ascii="Times New Roman" w:eastAsia="Times New Roman" w:hAnsi="Times New Roman" w:cs="Times New Roman"/>
+          <w:b/>
+          <w:bCs/>
+          <w:kern w:val="0"/>
+          <w:sz w:val="24"/>
+          <w:szCs w:val="24"/>
+          <w:lang w:eastAsia="en-AE"/>
+          <w14:ligatures w14:val="none"/>
+        </w:rPr>
+        <w:t xml:space="preserve">             </w:t>
+      </w:r>
+      <w:r>
+        <w:rPr>
+          <w:rFonts w:ascii="Times New Roman" w:eastAsia="Times New Roman" w:hAnsi="Times New Roman" w:cs="Times New Roman"/>
+          <w:b/>
+          <w:bCs/>
+          <w:kern w:val="0"/>
+          <w:sz w:val="24"/>
+          <w:szCs w:val="24"/>
+          <w:lang w:eastAsia="en-AE"/>
+          <w14:ligatures w14:val="none"/>
+        </w:rPr>
+        <w:t>Type:</w:t>
+      </w:r>
+      <w:r>
+        <w:rPr>
+          <w:rFonts w:ascii="Times New Roman" w:eastAsia="Times New Roman" w:hAnsi="Times New Roman" w:cs="Times New Roman"/>
+          <w:kern w:val="0"/>
+          <w:sz w:val="24"/>
+          <w:szCs w:val="24"/>
+          <w:lang w:eastAsia="en-AE"/>
+          <w14:ligatures w14:val="none"/>
+        </w:rPr>
+        <w:t xml:space="preserve"> Native class loader (part of JVM, written in native code) </w:t>
+      </w:r>
+    </w:p>
+    <w:p>
+      <w:pPr>
+        <w:spacing w:after="0" w:line="240" w:lineRule="auto"/>
+        <w:rPr>
+          <w:rFonts w:ascii="Times New Roman" w:eastAsia="Times New Roman" w:hAnsi="Times New Roman" w:cs="Times New Roman"/>
+          <w:kern w:val="0"/>
+          <w:sz w:val="24"/>
+          <w:szCs w:val="24"/>
+          <w:lang w:eastAsia="en-AE"/>
+          <w14:ligatures w14:val="none"/>
+        </w:rPr>
+      </w:pPr>
+      <w:r>
+        <w:rPr>
+          <w:rFonts w:ascii="Times New Roman" w:eastAsia="Times New Roman" w:hAnsi="Times New Roman" w:cs="Times New Roman"/>
+          <w:b/>
+          <w:bCs/>
+          <w:kern w:val="0"/>
+          <w:sz w:val="24"/>
+          <w:szCs w:val="24"/>
+          <w:lang w:eastAsia="en-AE"/>
+          <w14:ligatures w14:val="none"/>
+        </w:rPr>
+        <w:t xml:space="preserve">             </w:t>
+      </w:r>
+      <w:r>
+        <w:rPr>
+          <w:rFonts w:ascii="Times New Roman" w:eastAsia="Times New Roman" w:hAnsi="Times New Roman" w:cs="Times New Roman"/>
+          <w:b/>
+          <w:bCs/>
+          <w:kern w:val="0"/>
+          <w:sz w:val="24"/>
+          <w:szCs w:val="24"/>
+          <w:lang w:eastAsia="en-AE"/>
+          <w14:ligatures w14:val="none"/>
+        </w:rPr>
+        <w:t>Loads:</w:t>
+      </w:r>
+      <w:r>
+        <w:rPr>
+          <w:rFonts w:ascii="Times New Roman" w:eastAsia="Times New Roman" w:hAnsi="Times New Roman" w:cs="Times New Roman"/>
+          <w:kern w:val="0"/>
+          <w:sz w:val="24"/>
+          <w:szCs w:val="24"/>
+          <w:lang w:eastAsia="en-AE"/>
+          <w14:ligatures w14:val="none"/>
+        </w:rPr>
+        <w:t xml:space="preserve"> Core Java classes like </w:t>
+      </w:r>
+      <w:proofErr w:type="spellStart"/>
+      <w:r>
+        <w:rPr>
+          <w:rFonts w:ascii="Courier New" w:eastAsia="Times New Roman" w:hAnsi="Courier New" w:cs="Courier New"/>
+          <w:kern w:val="0"/>
+          <w:sz w:val="20"/>
+          <w:szCs w:val="20"/>
+          <w:lang w:eastAsia="en-AE"/>
+          <w14:ligatures w14:val="none"/>
+        </w:rPr>
+        <w:t>java.lang</w:t>
+      </w:r>
+      <w:proofErr w:type="spellEnd"/>
+      <w:r>
+        <w:rPr>
+          <w:rFonts w:ascii="Courier New" w:eastAsia="Times New Roman" w:hAnsi="Courier New" w:cs="Courier New"/>
+          <w:kern w:val="0"/>
+          <w:sz w:val="20"/>
+          <w:szCs w:val="20"/>
+          <w:lang w:eastAsia="en-AE"/>
+          <w14:ligatures w14:val="none"/>
+        </w:rPr>
+        <w:t>.*</w:t>
+      </w:r>
+      <w:r>
+        <w:rPr>
+          <w:rFonts w:ascii="Times New Roman" w:eastAsia="Times New Roman" w:hAnsi="Times New Roman" w:cs="Times New Roman"/>
+          <w:kern w:val="0"/>
+          <w:sz w:val="24"/>
+          <w:szCs w:val="24"/>
+          <w:lang w:eastAsia="en-AE"/>
+          <w14:ligatures w14:val="none"/>
+        </w:rPr>
+        <w:t xml:space="preserve">, </w:t>
+      </w:r>
+      <w:proofErr w:type="spellStart"/>
+      <w:r>
+        <w:rPr>
+          <w:rFonts w:ascii="Courier New" w:eastAsia="Times New Roman" w:hAnsi="Courier New" w:cs="Courier New"/>
+          <w:kern w:val="0"/>
+          <w:sz w:val="20"/>
+          <w:szCs w:val="20"/>
+          <w:lang w:eastAsia="en-AE"/>
+          <w14:ligatures w14:val="none"/>
+        </w:rPr>
+        <w:t>java.util</w:t>
+      </w:r>
+      <w:proofErr w:type="spellEnd"/>
+      <w:r>
+        <w:rPr>
+          <w:rFonts w:ascii="Courier New" w:eastAsia="Times New Roman" w:hAnsi="Courier New" w:cs="Courier New"/>
+          <w:kern w:val="0"/>
+          <w:sz w:val="20"/>
+          <w:szCs w:val="20"/>
+          <w:lang w:eastAsia="en-AE"/>
+          <w14:ligatures w14:val="none"/>
+        </w:rPr>
+        <w:t>.*</w:t>
+      </w:r>
+      <w:r>
+        <w:rPr>
+          <w:rFonts w:ascii="Times New Roman" w:eastAsia="Times New Roman" w:hAnsi="Times New Roman" w:cs="Times New Roman"/>
+          <w:kern w:val="0"/>
+          <w:sz w:val="24"/>
+          <w:szCs w:val="24"/>
+          <w:lang w:eastAsia="en-AE"/>
+          <w14:ligatures w14:val="none"/>
+        </w:rPr>
+        <w:t xml:space="preserve">, </w:t>
+      </w:r>
+      <w:proofErr w:type="gramStart"/>
+      <w:r>
+        <w:rPr>
+          <w:rFonts w:ascii="Courier New" w:eastAsia="Times New Roman" w:hAnsi="Courier New" w:cs="Courier New"/>
+          <w:kern w:val="0"/>
+          <w:sz w:val="20"/>
+          <w:szCs w:val="20"/>
+          <w:lang w:eastAsia="en-AE"/>
+          <w14:ligatures w14:val="none"/>
+        </w:rPr>
+        <w:t>java.io.*</w:t>
+      </w:r>
+      <w:proofErr w:type="gramEnd"/>
+      <w:r>
+        <w:rPr>
+          <w:rFonts w:ascii="Times New Roman" w:eastAsia="Times New Roman" w:hAnsi="Times New Roman" w:cs="Times New Roman"/>
+          <w:kern w:val="0"/>
+          <w:sz w:val="24"/>
+          <w:szCs w:val="24"/>
+          <w:lang w:eastAsia="en-AE"/>
+          <w14:ligatures w14:val="none"/>
+        </w:rPr>
+        <w:t xml:space="preserve"> </w:t>
+      </w:r>
+    </w:p>
+    <w:p>
+      <w:pPr>
+        <w:spacing w:after="0" w:line="240" w:lineRule="auto"/>
+        <w:rPr>
+          <w:rFonts w:ascii="Times New Roman" w:eastAsia="Times New Roman" w:hAnsi="Times New Roman" w:cs="Times New Roman"/>
+          <w:kern w:val="0"/>
+          <w:sz w:val="24"/>
+          <w:szCs w:val="24"/>
+          <w:lang w:eastAsia="en-AE"/>
+          <w14:ligatures w14:val="none"/>
+        </w:rPr>
+      </w:pPr>
+      <w:r>
+        <w:rPr>
+          <w:rFonts w:ascii="Times New Roman" w:eastAsia="Times New Roman" w:hAnsi="Times New Roman" w:cs="Times New Roman"/>
+          <w:b/>
+          <w:bCs/>
+          <w:kern w:val="0"/>
+          <w:sz w:val="24"/>
+          <w:szCs w:val="24"/>
+          <w:lang w:eastAsia="en-AE"/>
+          <w14:ligatures w14:val="none"/>
+        </w:rPr>
+        <w:t xml:space="preserve">             </w:t>
+      </w:r>
+      <w:r>
+        <w:rPr>
+          <w:rFonts w:ascii="Times New Roman" w:eastAsia="Times New Roman" w:hAnsi="Times New Roman" w:cs="Times New Roman"/>
+          <w:b/>
+          <w:bCs/>
+          <w:kern w:val="0"/>
+          <w:sz w:val="24"/>
+          <w:szCs w:val="24"/>
+          <w:lang w:eastAsia="en-AE"/>
+          <w14:ligatures w14:val="none"/>
+        </w:rPr>
+        <w:t>From where:</w:t>
+      </w:r>
+      <w:r>
+        <w:rPr>
+          <w:rFonts w:ascii="Times New Roman" w:eastAsia="Times New Roman" w:hAnsi="Times New Roman" w:cs="Times New Roman"/>
+          <w:kern w:val="0"/>
+          <w:sz w:val="24"/>
+          <w:szCs w:val="24"/>
+          <w:lang w:eastAsia="en-AE"/>
+          <w14:ligatures w14:val="none"/>
+        </w:rPr>
+        <w:t xml:space="preserve"> </w:t>
+      </w:r>
+      <w:r>
+        <w:rPr>
+          <w:rFonts w:ascii="Courier New" w:eastAsia="Times New Roman" w:hAnsi="Courier New" w:cs="Courier New"/>
+          <w:kern w:val="0"/>
+          <w:sz w:val="20"/>
+          <w:szCs w:val="20"/>
+          <w:lang w:eastAsia="en-AE"/>
+          <w14:ligatures w14:val="none"/>
+        </w:rPr>
+        <w:t>$JAVA_HOME/</w:t>
+      </w:r>
+      <w:proofErr w:type="spellStart"/>
+      <w:r>
+        <w:rPr>
+          <w:rFonts w:ascii="Courier New" w:eastAsia="Times New Roman" w:hAnsi="Courier New" w:cs="Courier New"/>
+          <w:kern w:val="0"/>
+          <w:sz w:val="20"/>
+          <w:szCs w:val="20"/>
+          <w:lang w:eastAsia="en-AE"/>
+          <w14:ligatures w14:val="none"/>
+        </w:rPr>
+        <w:t>jre</w:t>
+      </w:r>
+      <w:proofErr w:type="spellEnd"/>
+      <w:r>
+        <w:rPr>
+          <w:rFonts w:ascii="Courier New" w:eastAsia="Times New Roman" w:hAnsi="Courier New" w:cs="Courier New"/>
+          <w:kern w:val="0"/>
+          <w:sz w:val="20"/>
+          <w:szCs w:val="20"/>
+          <w:lang w:eastAsia="en-AE"/>
+          <w14:ligatures w14:val="none"/>
+        </w:rPr>
+        <w:t>/lib</w:t>
+      </w:r>
+      <w:r>
+        <w:rPr>
+          <w:rFonts w:ascii="Times New Roman" w:eastAsia="Times New Roman" w:hAnsi="Times New Roman" w:cs="Times New Roman"/>
+          <w:kern w:val="0"/>
+          <w:sz w:val="24"/>
+          <w:szCs w:val="24"/>
+          <w:lang w:eastAsia="en-AE"/>
+          <w14:ligatures w14:val="none"/>
+        </w:rPr>
+        <w:t xml:space="preserve"> (or </w:t>
+      </w:r>
+      <w:r>
+        <w:rPr>
+          <w:rFonts w:ascii="Courier New" w:eastAsia="Times New Roman" w:hAnsi="Courier New" w:cs="Courier New"/>
+          <w:kern w:val="0"/>
+          <w:sz w:val="20"/>
+          <w:szCs w:val="20"/>
+          <w:lang w:eastAsia="en-AE"/>
+          <w14:ligatures w14:val="none"/>
+        </w:rPr>
+        <w:t>modules</w:t>
+      </w:r>
+      <w:r>
+        <w:rPr>
+          <w:rFonts w:ascii="Times New Roman" w:eastAsia="Times New Roman" w:hAnsi="Times New Roman" w:cs="Times New Roman"/>
+          <w:kern w:val="0"/>
+          <w:sz w:val="24"/>
+          <w:szCs w:val="24"/>
+          <w:lang w:eastAsia="en-AE"/>
+          <w14:ligatures w14:val="none"/>
+        </w:rPr>
+        <w:t xml:space="preserve"> in modern Java) </w:t>
+      </w:r>
+    </w:p>
+    <w:p>
+      <w:pPr>
+        <w:pStyle w:val="ListParagraph"/>
+        <w:numPr>
+          <w:ilvl w:val="0"/>
+          <w:numId w:val="3"/>
+        </w:numPr>
+      </w:pPr>
+      <w:r>
+        <w:rPr>
+          <w:b/>
+          <w:bCs/>
+        </w:rPr>
+        <w:t>Extension class loader</w:t>
+      </w:r>
+      <w:r>
+        <w:rPr>
+          <w:b/>
+          <w:bCs/>
+        </w:rPr>
+        <w:t xml:space="preserve">: </w:t>
+      </w:r>
+      <w:r>
+        <w:t>loads classes that extend core Java functionality from the extension library directory.</w:t>
+      </w:r>
+    </w:p>
+    <w:p>
+      <w:pPr>
+        <w:pStyle w:val="ListParagraph"/>
+      </w:pPr>
+      <w:r>
+        <w:rPr>
+          <w:b/>
+          <w:bCs/>
+        </w:rPr>
+        <w:t>Type:</w:t>
+      </w:r>
+      <w:r>
+        <w:t xml:space="preserve"> Java-based class loader</w:t>
+      </w:r>
+    </w:p>
+    <w:p>
+      <w:pPr>
+        <w:pStyle w:val="ListParagraph"/>
+      </w:pPr>
+      <w:r>
+        <w:rPr>
+          <w:b/>
+          <w:bCs/>
+        </w:rPr>
+        <w:t>Loads:</w:t>
+      </w:r>
+      <w:r>
+        <w:t xml:space="preserve"> Extension classes (non-core Java libraries)</w:t>
+      </w:r>
+    </w:p>
+    <w:p>
+      <w:pPr>
+        <w:pStyle w:val="ListParagraph"/>
+      </w:pPr>
+      <w:r>
+        <w:rPr>
+          <w:b/>
+          <w:bCs/>
+        </w:rPr>
+        <w:t>From where:</w:t>
+      </w:r>
+      <w:r>
+        <w:t xml:space="preserve"> $JAVA_HOME/</w:t>
+      </w:r>
+      <w:proofErr w:type="spellStart"/>
+      <w:r>
+        <w:t>jre</w:t>
+      </w:r>
+      <w:proofErr w:type="spellEnd"/>
+      <w:r>
+        <w:t>/lib/</w:t>
+      </w:r>
+      <w:proofErr w:type="spellStart"/>
+      <w:r>
+        <w:t>ext</w:t>
+      </w:r>
+      <w:proofErr w:type="spellEnd"/>
+      <w:r>
+        <w:t xml:space="preserve"> (or platform modules in Java 9+)</w:t>
+      </w:r>
+    </w:p>
+    <w:p>
+      <w:pPr>
+        <w:pStyle w:val="ListParagraph"/>
+        <w:rPr>
+          <w:b/>
+          <w:bCs/>
+        </w:rPr>
+      </w:pPr>
+    </w:p>
+    <w:p>
+      <w:pPr>
+        <w:pStyle w:val="ListParagraph"/>
+        <w:numPr>
+          <w:ilvl w:val="0"/>
+          <w:numId w:val="3"/>
+        </w:numPr>
+      </w:pPr>
+      <w:r>
+        <w:rPr>
+          <w:b/>
+          <w:bCs/>
+        </w:rPr>
+        <w:t>Application class loader</w:t>
       </w:r>
       <w:r>
         <w:rPr>
@@ -633,6 +1546,102 @@
         <w:t xml:space="preserve"> </w:t>
       </w:r>
       <w:r>
+        <w:t xml:space="preserve">loads classes from the application </w:t>
+      </w:r>
+      <w:proofErr w:type="spellStart"/>
+      <w:r>
+        <w:t>classpath</w:t>
+      </w:r>
+      <w:proofErr w:type="spellEnd"/>
+      <w:r>
+        <w:t>, including user-defined classes.</w:t>
+      </w:r>
+      <w:r>
+        <w:t xml:space="preserve"> </w:t>
+      </w:r>
+    </w:p>
+    <w:p>
+      <w:pPr>
+        <w:pStyle w:val="ListParagraph"/>
+      </w:pPr>
+      <w:r>
+        <w:rPr>
+          <w:b/>
+          <w:bCs/>
+        </w:rPr>
+        <w:t>Type:</w:t>
+      </w:r>
+      <w:r>
+        <w:t xml:space="preserve"> Java-based class loader</w:t>
+      </w:r>
+    </w:p>
+    <w:p>
+      <w:pPr>
+        <w:pStyle w:val="ListParagraph"/>
+      </w:pPr>
+      <w:r>
+        <w:rPr>
+          <w:b/>
+          <w:bCs/>
+        </w:rPr>
+        <w:t>Loads:</w:t>
+      </w:r>
+      <w:r>
+        <w:t xml:space="preserve"> Application-specific classes written by the developer</w:t>
+      </w:r>
+    </w:p>
+    <w:p>
+      <w:pPr>
+        <w:pStyle w:val="ListParagraph"/>
+      </w:pPr>
+      <w:r>
+        <w:rPr>
+          <w:b/>
+          <w:bCs/>
+        </w:rPr>
+        <w:t>From where:</w:t>
+      </w:r>
+      <w:r>
+        <w:t xml:space="preserve"> </w:t>
+      </w:r>
+      <w:proofErr w:type="spellStart"/>
+      <w:r>
+        <w:t>Classpath</w:t>
+      </w:r>
+      <w:proofErr w:type="spellEnd"/>
+      <w:r>
+        <w:t xml:space="preserve"> (-</w:t>
+      </w:r>
+      <w:proofErr w:type="spellStart"/>
+      <w:r>
+        <w:t>classpath</w:t>
+      </w:r>
+      <w:proofErr w:type="spellEnd"/>
+      <w:r>
+        <w:t xml:space="preserve"> or CLASSPATH environment variable)</w:t>
+      </w:r>
+    </w:p>
+    <w:p>
+      <w:pPr>
+        <w:pStyle w:val="ListParagraph"/>
+        <w:jc w:val="center"/>
+        <w:rPr>
+          <w:lang w:val="en-US"/>
+        </w:rPr>
+      </w:pPr>
+    </w:p>
+    <w:p>
+      <w:r>
+        <w:rPr>
+          <w:b/>
+          <w:bCs/>
+        </w:rPr>
+        <w:t>Runtime Data Area:</w:t>
+      </w:r>
+      <w:r>
+        <w:t xml:space="preserve"> </w:t>
+      </w:r>
+      <w:r>
         <w:t>the memory area used by JVM during program execution</w:t>
       </w:r>
       <w:r>
@@ -648,14 +1657,7 @@
           <w:b/>
           <w:bCs/>
         </w:rPr>
-        <w:t>Execution Engine</w:t>
-      </w:r>
-      <w:r>
-        <w:rPr>
-          <w:b/>
-          <w:bCs/>
-        </w:rPr>
-        <w:t>:</w:t>
+        <w:t>Execution Engine:</w:t>
       </w:r>
       <w:r>
         <w:t xml:space="preserve"> </w:t>
@@ -676,8 +1678,30 @@
           <w:b/>
           <w:bCs/>
         </w:rPr>
+        <w:t>Native Method Interface (JNI)</w:t>
+      </w:r>
+      <w:r>
+        <w:rPr>
+          <w:b/>
+          <w:bCs/>
+        </w:rPr>
+        <w:t xml:space="preserve">: </w:t>
+      </w:r>
+      <w:r>
+        <w:t xml:space="preserve">is JVM component </w:t>
+      </w:r>
+      <w:r>
+        <w:t>that allows Java code to communicate with code written in other programming languages like C or C++.</w:t>
+      </w:r>
+    </w:p>
+    <w:p>
+      <w:r>
+        <w:rPr>
+          <w:b/>
+          <w:bCs/>
+        </w:rPr>
         <w:lastRenderedPageBreak/>
-        <w:t>Native Method Interface (JNI)</w:t>
+        <w:t>Native Method Library</w:t>
       </w:r>
       <w:r>
         <w:rPr>
@@ -687,36 +1711,6 @@
         <w:t xml:space="preserve">: </w:t>
       </w:r>
       <w:r>
-        <w:t xml:space="preserve">is JVM component </w:t>
-      </w:r>
-      <w:r>
-        <w:t xml:space="preserve">that </w:t>
-      </w:r>
-      <w:r>
-        <w:t>allows Java code to communicate with code written in other programming languages like C or C++.</w:t>
-      </w:r>
-    </w:p>
-    <w:p>
-      <w:pPr>
-        <w:rPr>
-          <w:lang w:val="en-US"/>
-        </w:rPr>
-      </w:pPr>
-      <w:r>
-        <w:rPr>
-          <w:b/>
-          <w:bCs/>
-        </w:rPr>
-        <w:t>Native Method Library</w:t>
-      </w:r>
-      <w:r>
-        <w:rPr>
-          <w:b/>
-          <w:bCs/>
-        </w:rPr>
-        <w:t xml:space="preserve">: </w:t>
-      </w:r>
-      <w:r>
         <w:t>a collection of pre-written code written in languages like C or C++, which Java can use through JNI</w:t>
       </w:r>
       <w:r>
@@ -725,6 +1719,13 @@
       <w:r>
         <w:t>.</w:t>
       </w:r>
+    </w:p>
+    <w:p>
+      <w:pPr>
+        <w:rPr>
+          <w:lang w:val="en-US"/>
+        </w:rPr>
+      </w:pPr>
     </w:p>
     <w:sectPr>
       <w:pgSz w:w="11906" w:h="16838"/>
@@ -736,9 +1737,172 @@
 </w:document>
 </file>
 
+<file path=word/endnotes.xml><?xml version="1.0" encoding="utf-8"?>
+<w:endnotes xmlns:wpc="http://schemas.microsoft.com/office/word/2010/wordprocessingCanvas" xmlns:cx="http://schemas.microsoft.com/office/drawing/2014/chartex" xmlns:cx1="http://schemas.microsoft.com/office/drawing/2015/9/8/chartex" xmlns:cx2="http://schemas.microsoft.com/office/drawing/2015/10/21/chartex" xmlns:cx3="http://schemas.microsoft.com/office/drawing/2016/5/9/chartex" xmlns:cx4="http://schemas.microsoft.com/office/drawing/2016/5/10/chartex" xmlns:cx5="http://schemas.microsoft.com/office/drawing/2016/5/11/chartex" xmlns:cx6="http://schemas.microsoft.com/office/drawing/2016/5/12/chartex" xmlns:cx7="http://schemas.microsoft.com/office/drawing/2016/5/13/chartex" xmlns:cx8="http://schemas.microsoft.com/office/drawing/2016/5/14/chartex" xmlns:mc="http://schemas.openxmlformats.org/markup-compatibility/2006" xmlns:aink="http://schemas.microsoft.com/office/drawing/2016/ink" xmlns:am3d="http://schemas.microsoft.com/office/drawing/2017/model3d" xmlns:o="urn:schemas-microsoft-com:office:office" xmlns:oel="http://schemas.microsoft.com/office/2019/extlst" xmlns:r="http://schemas.openxmlformats.org/officeDocument/2006/relationships" xmlns:m="http://schemas.openxmlformats.org/officeDocument/2006/math" xmlns:v="urn:schemas-microsoft-com:vml" xmlns:wp14="http://schemas.microsoft.com/office/word/2010/wordprocessingDrawing" xmlns:wp="http://schemas.openxmlformats.org/drawingml/2006/wordprocessingDrawing" xmlns:w10="urn:schemas-microsoft-com:office:word" xmlns:w="http://schemas.openxmlformats.org/wordprocessingml/2006/main" xmlns:w14="http://schemas.microsoft.com/office/word/2010/wordml" xmlns:w15="http://schemas.microsoft.com/office/word/2012/wordml" xmlns:w16cex="http://schemas.microsoft.com/office/word/2018/wordml/cex" xmlns:w16cid="http://schemas.microsoft.com/office/word/2016/wordml/cid" xmlns:w16="http://schemas.microsoft.com/office/word/2018/wordml" xmlns:w16du="http://schemas.microsoft.com/office/word/2023/wordml/word16du" xmlns:w16sdtdh="http://schemas.microsoft.com/office/word/2020/wordml/sdtdatahash" xmlns:w16sdtfl="http://schemas.microsoft.com/office/word/2024/wordml/sdtformatlock" xmlns:w16se="http://schemas.microsoft.com/office/word/2015/wordml/symex" xmlns:wpg="http://schemas.microsoft.com/office/word/2010/wordprocessingGroup" xmlns:wpi="http://schemas.microsoft.com/office/word/2010/wordprocessingInk" xmlns:wne="http://schemas.microsoft.com/office/word/2006/wordml" xmlns:wps="http://schemas.microsoft.com/office/word/2010/wordprocessingShape" mc:Ignorable="w14 w15 w16se w16cid w16 w16cex w16sdtdh w16sdtfl w16du wp14">
+  <w:endnote w:type="separator" w:id="-1">
+    <w:p>
+      <w:pPr>
+        <w:spacing w:after="0" w:line="240" w:lineRule="auto"/>
+      </w:pPr>
+      <w:r>
+        <w:separator/>
+      </w:r>
+    </w:p>
+  </w:endnote>
+  <w:endnote w:type="continuationSeparator" w:id="0">
+    <w:p>
+      <w:pPr>
+        <w:spacing w:after="0" w:line="240" w:lineRule="auto"/>
+      </w:pPr>
+      <w:r>
+        <w:continuationSeparator/>
+      </w:r>
+    </w:p>
+  </w:endnote>
+</w:endnotes>
+</file>
+
+<file path=word/footnotes.xml><?xml version="1.0" encoding="utf-8"?>
+<w:footnotes xmlns:wpc="http://schemas.microsoft.com/office/word/2010/wordprocessingCanvas" xmlns:cx="http://schemas.microsoft.com/office/drawing/2014/chartex" xmlns:cx1="http://schemas.microsoft.com/office/drawing/2015/9/8/chartex" xmlns:cx2="http://schemas.microsoft.com/office/drawing/2015/10/21/chartex" xmlns:cx3="http://schemas.microsoft.com/office/drawing/2016/5/9/chartex" xmlns:cx4="http://schemas.microsoft.com/office/drawing/2016/5/10/chartex" xmlns:cx5="http://schemas.microsoft.com/office/drawing/2016/5/11/chartex" xmlns:cx6="http://schemas.microsoft.com/office/drawing/2016/5/12/chartex" xmlns:cx7="http://schemas.microsoft.com/office/drawing/2016/5/13/chartex" xmlns:cx8="http://schemas.microsoft.com/office/drawing/2016/5/14/chartex" xmlns:mc="http://schemas.openxmlformats.org/markup-compatibility/2006" xmlns:aink="http://schemas.microsoft.com/office/drawing/2016/ink" xmlns:am3d="http://schemas.microsoft.com/office/drawing/2017/model3d" xmlns:o="urn:schemas-microsoft-com:office:office" xmlns:oel="http://schemas.microsoft.com/office/2019/extlst" xmlns:r="http://schemas.openxmlformats.org/officeDocument/2006/relationships" xmlns:m="http://schemas.openxmlformats.org/officeDocument/2006/math" xmlns:v="urn:schemas-microsoft-com:vml" xmlns:wp14="http://schemas.microsoft.com/office/word/2010/wordprocessingDrawing" xmlns:wp="http://schemas.openxmlformats.org/drawingml/2006/wordprocessingDrawing" xmlns:w10="urn:schemas-microsoft-com:office:word" xmlns:w="http://schemas.openxmlformats.org/wordprocessingml/2006/main" xmlns:w14="http://schemas.microsoft.com/office/word/2010/wordml" xmlns:w15="http://schemas.microsoft.com/office/word/2012/wordml" xmlns:w16cex="http://schemas.microsoft.com/office/word/2018/wordml/cex" xmlns:w16cid="http://schemas.microsoft.com/office/word/2016/wordml/cid" xmlns:w16="http://schemas.microsoft.com/office/word/2018/wordml" xmlns:w16du="http://schemas.microsoft.com/office/word/2023/wordml/word16du" xmlns:w16sdtdh="http://schemas.microsoft.com/office/word/2020/wordml/sdtdatahash" xmlns:w16sdtfl="http://schemas.microsoft.com/office/word/2024/wordml/sdtformatlock" xmlns:w16se="http://schemas.microsoft.com/office/word/2015/wordml/symex" xmlns:wpg="http://schemas.microsoft.com/office/word/2010/wordprocessingGroup" xmlns:wpi="http://schemas.microsoft.com/office/word/2010/wordprocessingInk" xmlns:wne="http://schemas.microsoft.com/office/word/2006/wordml" xmlns:wps="http://schemas.microsoft.com/office/word/2010/wordprocessingShape" mc:Ignorable="w14 w15 w16se w16cid w16 w16cex w16sdtdh w16sdtfl w16du wp14">
+  <w:footnote w:type="separator" w:id="-1">
+    <w:p>
+      <w:pPr>
+        <w:spacing w:after="0" w:line="240" w:lineRule="auto"/>
+      </w:pPr>
+      <w:r>
+        <w:separator/>
+      </w:r>
+    </w:p>
+  </w:footnote>
+  <w:footnote w:type="continuationSeparator" w:id="0">
+    <w:p>
+      <w:pPr>
+        <w:spacing w:after="0" w:line="240" w:lineRule="auto"/>
+      </w:pPr>
+      <w:r>
+        <w:continuationSeparator/>
+      </w:r>
+    </w:p>
+  </w:footnote>
+</w:footnotes>
+</file>
+
 <file path=word/numbering.xml><?xml version="1.0" encoding="utf-8"?>
 <w:numbering xmlns:wpc="http://schemas.microsoft.com/office/word/2010/wordprocessingCanvas" xmlns:cx="http://schemas.microsoft.com/office/drawing/2014/chartex" xmlns:cx1="http://schemas.microsoft.com/office/drawing/2015/9/8/chartex" xmlns:cx2="http://schemas.microsoft.com/office/drawing/2015/10/21/chartex" xmlns:cx3="http://schemas.microsoft.com/office/drawing/2016/5/9/chartex" xmlns:cx4="http://schemas.microsoft.com/office/drawing/2016/5/10/chartex" xmlns:cx5="http://schemas.microsoft.com/office/drawing/2016/5/11/chartex" xmlns:cx6="http://schemas.microsoft.com/office/drawing/2016/5/12/chartex" xmlns:cx7="http://schemas.microsoft.com/office/drawing/2016/5/13/chartex" xmlns:cx8="http://schemas.microsoft.com/office/drawing/2016/5/14/chartex" xmlns:mc="http://schemas.openxmlformats.org/markup-compatibility/2006" xmlns:aink="http://schemas.microsoft.com/office/drawing/2016/ink" xmlns:am3d="http://schemas.microsoft.com/office/drawing/2017/model3d" xmlns:o="urn:schemas-microsoft-com:office:office" xmlns:oel="http://schemas.microsoft.com/office/2019/extlst" xmlns:r="http://schemas.openxmlformats.org/officeDocument/2006/relationships" xmlns:m="http://schemas.openxmlformats.org/officeDocument/2006/math" xmlns:v="urn:schemas-microsoft-com:vml" xmlns:wp14="http://schemas.microsoft.com/office/word/2010/wordprocessingDrawing" xmlns:wp="http://schemas.openxmlformats.org/drawingml/2006/wordprocessingDrawing" xmlns:w10="urn:schemas-microsoft-com:office:word" xmlns:w="http://schemas.openxmlformats.org/wordprocessingml/2006/main" xmlns:w14="http://schemas.microsoft.com/office/word/2010/wordml" xmlns:w15="http://schemas.microsoft.com/office/word/2012/wordml" xmlns:w16cex="http://schemas.microsoft.com/office/word/2018/wordml/cex" xmlns:w16cid="http://schemas.microsoft.com/office/word/2016/wordml/cid" xmlns:w16="http://schemas.microsoft.com/office/word/2018/wordml" xmlns:w16du="http://schemas.microsoft.com/office/word/2023/wordml/word16du" xmlns:w16sdtdh="http://schemas.microsoft.com/office/word/2020/wordml/sdtdatahash" xmlns:w16sdtfl="http://schemas.microsoft.com/office/word/2024/wordml/sdtformatlock" xmlns:w16se="http://schemas.microsoft.com/office/word/2015/wordml/symex" xmlns:wpg="http://schemas.microsoft.com/office/word/2010/wordprocessingGroup" xmlns:wpi="http://schemas.microsoft.com/office/word/2010/wordprocessingInk" xmlns:wne="http://schemas.microsoft.com/office/word/2006/wordml" xmlns:wps="http://schemas.microsoft.com/office/word/2010/wordprocessingShape" mc:Ignorable="w14 w15 w16se w16cid w16 w16cex w16sdtdh w16sdtfl w16du wp14">
   <w:abstractNum w:abstractNumId="0" w15:restartNumberingAfterBreak="0">
+    <w:nsid w:val="14D0182F"/>
+    <w:multiLevelType w:val="hybridMultilevel"/>
+    <w:tmpl w:val="648E1D72"/>
+    <w:lvl w:ilvl="0" w:tplc="4C090001">
+      <w:start w:val="1"/>
+      <w:numFmt w:val="bullet"/>
+      <w:lvlText w:val=""/>
+      <w:lvlJc w:val="left"/>
+      <w:pPr>
+        <w:ind w:left="720" w:hanging="360"/>
+      </w:pPr>
+      <w:rPr>
+        <w:rFonts w:ascii="Symbol" w:hAnsi="Symbol" w:hint="default"/>
+      </w:rPr>
+    </w:lvl>
+    <w:lvl w:ilvl="1" w:tplc="4C090003" w:tentative="1">
+      <w:start w:val="1"/>
+      <w:numFmt w:val="bullet"/>
+      <w:lvlText w:val="o"/>
+      <w:lvlJc w:val="left"/>
+      <w:pPr>
+        <w:ind w:left="1440" w:hanging="360"/>
+      </w:pPr>
+      <w:rPr>
+        <w:rFonts w:ascii="Courier New" w:hAnsi="Courier New" w:cs="Courier New" w:hint="default"/>
+      </w:rPr>
+    </w:lvl>
+    <w:lvl w:ilvl="2" w:tplc="4C090005" w:tentative="1">
+      <w:start w:val="1"/>
+      <w:numFmt w:val="bullet"/>
+      <w:lvlText w:val=""/>
+      <w:lvlJc w:val="left"/>
+      <w:pPr>
+        <w:ind w:left="2160" w:hanging="360"/>
+      </w:pPr>
+      <w:rPr>
+        <w:rFonts w:ascii="Wingdings" w:hAnsi="Wingdings" w:hint="default"/>
+      </w:rPr>
+    </w:lvl>
+    <w:lvl w:ilvl="3" w:tplc="4C090001" w:tentative="1">
+      <w:start w:val="1"/>
+      <w:numFmt w:val="bullet"/>
+      <w:lvlText w:val=""/>
+      <w:lvlJc w:val="left"/>
+      <w:pPr>
+        <w:ind w:left="2880" w:hanging="360"/>
+      </w:pPr>
+      <w:rPr>
+        <w:rFonts w:ascii="Symbol" w:hAnsi="Symbol" w:hint="default"/>
+      </w:rPr>
+    </w:lvl>
+    <w:lvl w:ilvl="4" w:tplc="4C090003" w:tentative="1">
+      <w:start w:val="1"/>
+      <w:numFmt w:val="bullet"/>
+      <w:lvlText w:val="o"/>
+      <w:lvlJc w:val="left"/>
+      <w:pPr>
+        <w:ind w:left="3600" w:hanging="360"/>
+      </w:pPr>
+      <w:rPr>
+        <w:rFonts w:ascii="Courier New" w:hAnsi="Courier New" w:cs="Courier New" w:hint="default"/>
+      </w:rPr>
+    </w:lvl>
+    <w:lvl w:ilvl="5" w:tplc="4C090005" w:tentative="1">
+      <w:start w:val="1"/>
+      <w:numFmt w:val="bullet"/>
+      <w:lvlText w:val=""/>
+      <w:lvlJc w:val="left"/>
+      <w:pPr>
+        <w:ind w:left="4320" w:hanging="360"/>
+      </w:pPr>
+      <w:rPr>
+        <w:rFonts w:ascii="Wingdings" w:hAnsi="Wingdings" w:hint="default"/>
+      </w:rPr>
+    </w:lvl>
+    <w:lvl w:ilvl="6" w:tplc="4C090001" w:tentative="1">
+      <w:start w:val="1"/>
+      <w:numFmt w:val="bullet"/>
+      <w:lvlText w:val=""/>
+      <w:lvlJc w:val="left"/>
+      <w:pPr>
+        <w:ind w:left="5040" w:hanging="360"/>
+      </w:pPr>
+      <w:rPr>
+        <w:rFonts w:ascii="Symbol" w:hAnsi="Symbol" w:hint="default"/>
+      </w:rPr>
+    </w:lvl>
+    <w:lvl w:ilvl="7" w:tplc="4C090003" w:tentative="1">
+      <w:start w:val="1"/>
+      <w:numFmt w:val="bullet"/>
+      <w:lvlText w:val="o"/>
+      <w:lvlJc w:val="left"/>
+      <w:pPr>
+        <w:ind w:left="5760" w:hanging="360"/>
+      </w:pPr>
+      <w:rPr>
+        <w:rFonts w:ascii="Courier New" w:hAnsi="Courier New" w:cs="Courier New" w:hint="default"/>
+      </w:rPr>
+    </w:lvl>
+    <w:lvl w:ilvl="8" w:tplc="4C090005" w:tentative="1">
+      <w:start w:val="1"/>
+      <w:numFmt w:val="bullet"/>
+      <w:lvlText w:val=""/>
+      <w:lvlJc w:val="left"/>
+      <w:pPr>
+        <w:ind w:left="6480" w:hanging="360"/>
+      </w:pPr>
+      <w:rPr>
+        <w:rFonts w:ascii="Wingdings" w:hAnsi="Wingdings" w:hint="default"/>
+      </w:rPr>
+    </w:lvl>
+  </w:abstractNum>
+  <w:abstractNum w:abstractNumId="1" w15:restartNumberingAfterBreak="0">
     <w:nsid w:val="230A73D6"/>
     <w:multiLevelType w:val="hybridMultilevel"/>
     <w:tmpl w:val="B20ABC0A"/>
@@ -827,7 +1991,7 @@
       </w:pPr>
     </w:lvl>
   </w:abstractNum>
-  <w:abstractNum w:abstractNumId="1" w15:restartNumberingAfterBreak="0">
+  <w:abstractNum w:abstractNumId="2" w15:restartNumberingAfterBreak="0">
     <w:nsid w:val="4E71180A"/>
     <w:multiLevelType w:val="hybridMultilevel"/>
     <w:tmpl w:val="9DB477EA"/>
@@ -917,9 +2081,12 @@
     </w:lvl>
   </w:abstractNum>
   <w:num w:numId="1" w16cid:durableId="1995210616">
+    <w:abstractNumId w:val="2"/>
+  </w:num>
+  <w:num w:numId="2" w16cid:durableId="1510365078">
     <w:abstractNumId w:val="1"/>
   </w:num>
-  <w:num w:numId="2" w16cid:durableId="1510365078">
+  <w:num w:numId="3" w16cid:durableId="1455252089">
     <w:abstractNumId w:val="0"/>
   </w:num>
 </w:numbering>
@@ -1841,6 +3008,74 @@
       <w:spacing w:val="5"/>
     </w:rPr>
   </w:style>
+  <w:style w:type="paragraph" w:styleId="Header">
+    <w:name w:val="header"/>
+    <w:basedOn w:val="Normal"/>
+    <w:link w:val="HeaderChar"/>
+    <w:uiPriority w:val="99"/>
+    <w:unhideWhenUsed/>
+    <w:rsid w:val="00EA1C0F"/>
+    <w:pPr>
+      <w:tabs>
+        <w:tab w:val="center" w:pos="4513"/>
+        <w:tab w:val="right" w:pos="9026"/>
+      </w:tabs>
+      <w:spacing w:after="0" w:line="240" w:lineRule="auto"/>
+    </w:pPr>
+  </w:style>
+  <w:style w:type="character" w:customStyle="1" w:styleId="HeaderChar">
+    <w:name w:val="Header Char"/>
+    <w:basedOn w:val="DefaultParagraphFont"/>
+    <w:link w:val="Header"/>
+    <w:uiPriority w:val="99"/>
+    <w:rsid w:val="00EA1C0F"/>
+  </w:style>
+  <w:style w:type="paragraph" w:styleId="Footer">
+    <w:name w:val="footer"/>
+    <w:basedOn w:val="Normal"/>
+    <w:link w:val="FooterChar"/>
+    <w:uiPriority w:val="99"/>
+    <w:unhideWhenUsed/>
+    <w:rsid w:val="00EA1C0F"/>
+    <w:pPr>
+      <w:tabs>
+        <w:tab w:val="center" w:pos="4513"/>
+        <w:tab w:val="right" w:pos="9026"/>
+      </w:tabs>
+      <w:spacing w:after="0" w:line="240" w:lineRule="auto"/>
+    </w:pPr>
+  </w:style>
+  <w:style w:type="character" w:customStyle="1" w:styleId="FooterChar">
+    <w:name w:val="Footer Char"/>
+    <w:basedOn w:val="DefaultParagraphFont"/>
+    <w:link w:val="Footer"/>
+    <w:uiPriority w:val="99"/>
+    <w:rsid w:val="00EA1C0F"/>
+  </w:style>
+  <w:style w:type="character" w:styleId="Strong">
+    <w:name w:val="Strong"/>
+    <w:basedOn w:val="DefaultParagraphFont"/>
+    <w:uiPriority w:val="22"/>
+    <w:qFormat/>
+    <w:rsid w:val="00483872"/>
+    <w:rPr>
+      <w:b/>
+      <w:bCs/>
+    </w:rPr>
+  </w:style>
+  <w:style w:type="character" w:styleId="HTMLCode">
+    <w:name w:val="HTML Code"/>
+    <w:basedOn w:val="DefaultParagraphFont"/>
+    <w:uiPriority w:val="99"/>
+    <w:semiHidden/>
+    <w:unhideWhenUsed/>
+    <w:rsid w:val="00483872"/>
+    <w:rPr>
+      <w:rFonts w:ascii="Courier New" w:eastAsia="Times New Roman" w:hAnsi="Courier New" w:cs="Courier New"/>
+      <w:sz w:val="20"/>
+      <w:szCs w:val="20"/>
+    </w:rPr>
+  </w:style>
 </w:styles>
 </file>
 

</xml_diff>

<commit_message>
Basic Implementation of Custom Class Loader in Java Using ClassLoader Extension  #5
</commit_message>
<xml_diff>
--- a/Java Virtual Machine.docx
+++ b/Java Virtual Machine.docx
@@ -6,11 +6,19 @@
       <w:pPr>
         <w:jc w:val="center"/>
         <w:rPr>
-          <w:lang w:val="en-US"/>
-        </w:rPr>
-      </w:pPr>
-      <w:r>
-        <w:rPr>
+          <w:b/>
+          <w:bCs/>
+          <w:sz w:val="28"/>
+          <w:szCs w:val="28"/>
+          <w:lang w:val="en-US"/>
+        </w:rPr>
+      </w:pPr>
+      <w:r>
+        <w:rPr>
+          <w:b/>
+          <w:bCs/>
+          <w:sz w:val="28"/>
+          <w:szCs w:val="28"/>
           <w:lang w:val="en-US"/>
         </w:rPr>
         <w:t>Java Virtual Machine</w:t>
@@ -22,13 +30,17 @@
         <w:rPr>
           <w:b/>
           <w:bCs/>
-          <w:lang w:val="en-US"/>
-        </w:rPr>
-      </w:pPr>
-      <w:r>
-        <w:rPr>
-          <w:b/>
-          <w:bCs/>
+          <w:sz w:val="28"/>
+          <w:szCs w:val="28"/>
+          <w:lang w:val="en-US"/>
+        </w:rPr>
+      </w:pPr>
+      <w:r>
+        <w:rPr>
+          <w:b/>
+          <w:bCs/>
+          <w:sz w:val="28"/>
+          <w:szCs w:val="28"/>
           <w:lang w:val="en-US"/>
         </w:rPr>
         <w:t>JVM</w:t>
@@ -39,13 +51,17 @@
         <w:rPr>
           <w:b/>
           <w:bCs/>
-          <w:lang w:val="en-US"/>
-        </w:rPr>
-      </w:pPr>
-      <w:r>
-        <w:rPr>
-          <w:b/>
-          <w:bCs/>
+          <w:sz w:val="24"/>
+          <w:szCs w:val="24"/>
+          <w:lang w:val="en-US"/>
+        </w:rPr>
+      </w:pPr>
+      <w:r>
+        <w:rPr>
+          <w:b/>
+          <w:bCs/>
+          <w:sz w:val="24"/>
+          <w:szCs w:val="24"/>
           <w:lang w:val="en-US"/>
         </w:rPr>
         <w:t xml:space="preserve">Virtual machine: </w:t>
@@ -54,17 +70,23 @@
     <w:p>
       <w:pPr>
         <w:rPr>
-          <w:lang w:val="en-US"/>
-        </w:rPr>
-      </w:pPr>
-      <w:r>
-        <w:rPr>
+          <w:sz w:val="24"/>
+          <w:szCs w:val="24"/>
+          <w:lang w:val="en-US"/>
+        </w:rPr>
+      </w:pPr>
+      <w:r>
+        <w:rPr>
+          <w:sz w:val="24"/>
+          <w:szCs w:val="24"/>
           <w:lang w:val="en-US"/>
         </w:rPr>
         <w:t>It’s</w:t>
       </w:r>
       <w:r>
         <w:rPr>
+          <w:sz w:val="24"/>
+          <w:szCs w:val="24"/>
           <w:lang w:val="en-US"/>
         </w:rPr>
         <w:t xml:space="preserve"> a software simulation that does not have physical exitance and can perform operations like physical machine. </w:t>
@@ -75,13 +97,17 @@
         <w:rPr>
           <w:b/>
           <w:bCs/>
-          <w:lang w:val="en-US"/>
-        </w:rPr>
-      </w:pPr>
-      <w:r>
-        <w:rPr>
-          <w:b/>
-          <w:bCs/>
+          <w:sz w:val="24"/>
+          <w:szCs w:val="24"/>
+          <w:lang w:val="en-US"/>
+        </w:rPr>
+      </w:pPr>
+      <w:r>
+        <w:rPr>
+          <w:b/>
+          <w:bCs/>
+          <w:sz w:val="24"/>
+          <w:szCs w:val="24"/>
           <w:lang w:val="en-US"/>
         </w:rPr>
         <w:t xml:space="preserve">Type of virtual machines: </w:t>
@@ -95,11 +121,15 @@
           <w:numId w:val="1"/>
         </w:numPr>
         <w:rPr>
-          <w:lang w:val="en-US"/>
-        </w:rPr>
-      </w:pPr>
-      <w:r>
-        <w:rPr>
+          <w:sz w:val="24"/>
+          <w:szCs w:val="24"/>
+          <w:lang w:val="en-US"/>
+        </w:rPr>
+      </w:pPr>
+      <w:r>
+        <w:rPr>
+          <w:sz w:val="24"/>
+          <w:szCs w:val="24"/>
           <w:lang w:val="en-US"/>
         </w:rPr>
         <w:t>Hardware/System base.</w:t>
@@ -112,60 +142,106 @@
         <w:rPr>
           <w:b/>
           <w:bCs/>
-        </w:rPr>
-      </w:pPr>
-      <w:r>
+          <w:sz w:val="24"/>
+          <w:szCs w:val="24"/>
+        </w:rPr>
+      </w:pPr>
+      <w:r>
+        <w:rPr>
+          <w:sz w:val="24"/>
+          <w:szCs w:val="24"/>
+        </w:rPr>
         <w:t>R</w:t>
       </w:r>
       <w:r>
+        <w:rPr>
+          <w:sz w:val="24"/>
+          <w:szCs w:val="24"/>
+        </w:rPr>
         <w:t xml:space="preserve">efers to systems that depend on the </w:t>
       </w:r>
       <w:r>
         <w:rPr>
           <w:b/>
           <w:bCs/>
+          <w:sz w:val="24"/>
+          <w:szCs w:val="24"/>
         </w:rPr>
         <w:t>physical components of a computer</w:t>
       </w:r>
       <w:r>
+        <w:rPr>
+          <w:sz w:val="24"/>
+          <w:szCs w:val="24"/>
+        </w:rPr>
         <w:t xml:space="preserve"> (CPU, memory, storage, devices) and the </w:t>
       </w:r>
       <w:r>
         <w:rPr>
           <w:b/>
           <w:bCs/>
+          <w:sz w:val="24"/>
+          <w:szCs w:val="24"/>
         </w:rPr>
         <w:t>operating system</w:t>
       </w:r>
       <w:r>
+        <w:rPr>
+          <w:sz w:val="24"/>
+          <w:szCs w:val="24"/>
+        </w:rPr>
         <w:t xml:space="preserve"> to </w:t>
       </w:r>
       <w:r>
+        <w:rPr>
+          <w:sz w:val="24"/>
+          <w:szCs w:val="24"/>
+        </w:rPr>
         <w:t>effectively utilize</w:t>
       </w:r>
       <w:r>
+        <w:rPr>
+          <w:sz w:val="24"/>
+          <w:szCs w:val="24"/>
+        </w:rPr>
         <w:t xml:space="preserve"> </w:t>
       </w:r>
       <w:r>
         <w:rPr>
           <w:b/>
           <w:bCs/>
+          <w:sz w:val="24"/>
+          <w:szCs w:val="24"/>
         </w:rPr>
         <w:t>Hardware</w:t>
       </w:r>
       <w:r>
+        <w:rPr>
+          <w:sz w:val="24"/>
+          <w:szCs w:val="24"/>
+        </w:rPr>
         <w:t xml:space="preserve"> </w:t>
       </w:r>
       <w:r>
+        <w:rPr>
+          <w:sz w:val="24"/>
+          <w:szCs w:val="24"/>
+        </w:rPr>
         <w:t>resources.</w:t>
       </w:r>
       <w:r>
+        <w:rPr>
+          <w:sz w:val="24"/>
+          <w:szCs w:val="24"/>
+        </w:rPr>
         <w:t xml:space="preserve"> </w:t>
       </w:r>
       <w:r>
         <w:rPr>
           <w:b/>
           <w:bCs/>
+          <w:sz w:val="24"/>
+          <w:szCs w:val="24"/>
         </w:rPr>
         <w:t>(Not for programmers)</w:t>
       </w:r>
@@ -175,6 +251,8 @@
         <w:pStyle w:val="ListParagraph"/>
         <w:ind w:left="405"/>
         <w:rPr>
+          <w:sz w:val="24"/>
+          <w:szCs w:val="24"/>
           <w:lang w:val="en-US"/>
         </w:rPr>
       </w:pPr>
@@ -187,11 +265,15 @@
           <w:numId w:val="1"/>
         </w:numPr>
         <w:rPr>
-          <w:lang w:val="en-US"/>
-        </w:rPr>
-      </w:pPr>
-      <w:r>
-        <w:rPr>
+          <w:sz w:val="24"/>
+          <w:szCs w:val="24"/>
+          <w:lang w:val="en-US"/>
+        </w:rPr>
+      </w:pPr>
+      <w:r>
+        <w:rPr>
+          <w:sz w:val="24"/>
+          <w:szCs w:val="24"/>
           <w:lang w:val="en-US"/>
         </w:rPr>
         <w:t>Application/Process base.</w:t>
@@ -204,40 +286,67 @@
         <w:rPr>
           <w:b/>
           <w:bCs/>
-        </w:rPr>
-      </w:pPr>
-      <w:r>
-        <w:t>R</w:t>
-      </w:r>
-      <w:r>
-        <w:t xml:space="preserve">efers to systems that run as </w:t>
-      </w:r>
-      <w:r>
-        <w:rPr>
-          <w:b/>
-          <w:bCs/>
+          <w:sz w:val="24"/>
+          <w:szCs w:val="24"/>
+        </w:rPr>
+      </w:pPr>
+      <w:r>
+        <w:rPr>
+          <w:sz w:val="24"/>
+          <w:szCs w:val="24"/>
+        </w:rPr>
+        <w:t xml:space="preserve">Refers to systems that run as </w:t>
+      </w:r>
+      <w:r>
+        <w:rPr>
+          <w:b/>
+          <w:bCs/>
+          <w:sz w:val="24"/>
+          <w:szCs w:val="24"/>
         </w:rPr>
         <w:t>programs or tasks on top of the operating system</w:t>
       </w:r>
       <w:r>
+        <w:rPr>
+          <w:sz w:val="24"/>
+          <w:szCs w:val="24"/>
+        </w:rPr>
         <w:t>, performing specific user functions</w:t>
       </w:r>
       <w:r>
+        <w:rPr>
+          <w:sz w:val="24"/>
+          <w:szCs w:val="24"/>
+        </w:rPr>
         <w:t xml:space="preserve"> or as run time engine for programming language</w:t>
       </w:r>
       <w:r>
+        <w:rPr>
+          <w:sz w:val="24"/>
+          <w:szCs w:val="24"/>
+        </w:rPr>
         <w:t xml:space="preserve"> Application</w:t>
       </w:r>
       <w:r>
+        <w:rPr>
+          <w:sz w:val="24"/>
+          <w:szCs w:val="24"/>
+        </w:rPr>
         <w:t>.</w:t>
       </w:r>
       <w:r>
+        <w:rPr>
+          <w:sz w:val="24"/>
+          <w:szCs w:val="24"/>
+        </w:rPr>
         <w:t xml:space="preserve"> </w:t>
       </w:r>
       <w:r>
         <w:rPr>
           <w:b/>
           <w:bCs/>
+          <w:sz w:val="24"/>
+          <w:szCs w:val="24"/>
         </w:rPr>
         <w:t>(where programmers involve)</w:t>
       </w:r>
@@ -245,15 +354,25 @@
         <w:rPr>
           <w:b/>
           <w:bCs/>
+          <w:sz w:val="24"/>
+          <w:szCs w:val="24"/>
         </w:rPr>
         <w:t>.</w:t>
       </w:r>
     </w:p>
     <w:p>
-      <w:r>
-        <w:rPr>
-          <w:b/>
-          <w:bCs/>
+      <w:pPr>
+        <w:rPr>
+          <w:sz w:val="24"/>
+          <w:szCs w:val="24"/>
+        </w:rPr>
+      </w:pPr>
+      <w:r>
+        <w:rPr>
+          <w:b/>
+          <w:bCs/>
+          <w:sz w:val="24"/>
+          <w:szCs w:val="24"/>
           <w:lang w:val="en-US"/>
         </w:rPr>
         <w:t>JAVA Development Tool Kit (JDK):</w:t>
@@ -262,24 +381,41 @@
         <w:rPr>
           <w:b/>
           <w:bCs/>
+          <w:sz w:val="24"/>
+          <w:szCs w:val="24"/>
         </w:rPr>
         <w:t xml:space="preserve"> </w:t>
       </w:r>
       <w:r>
+        <w:rPr>
+          <w:sz w:val="24"/>
+          <w:szCs w:val="24"/>
+        </w:rPr>
         <w:t>is a software development environment that provides tools, libraries, and runtime components required to develop, compile, debug, and run Java applications.</w:t>
       </w:r>
     </w:p>
-    <w:p/>
+    <w:p>
+      <w:pPr>
+        <w:rPr>
+          <w:sz w:val="24"/>
+          <w:szCs w:val="24"/>
+        </w:rPr>
+      </w:pPr>
+    </w:p>
     <w:p>
       <w:pPr>
         <w:jc w:val="center"/>
         <w:rPr>
+          <w:sz w:val="24"/>
+          <w:szCs w:val="24"/>
           <w:lang w:val="en-US"/>
         </w:rPr>
       </w:pPr>
       <w:r>
         <w:rPr>
           <w:noProof/>
+          <w:sz w:val="24"/>
+          <w:szCs w:val="24"/>
           <w:lang w:val="en-US"/>
         </w:rPr>
         <w:drawing>
@@ -330,74 +466,85 @@
         <w:rPr>
           <w:b/>
           <w:bCs/>
-          <w:lang w:val="en-US"/>
-        </w:rPr>
-      </w:pPr>
-    </w:p>
-    <w:p>
-      <w:pPr>
-        <w:rPr>
-          <w:b/>
-          <w:bCs/>
-          <w:lang w:val="en-US"/>
-        </w:rPr>
-      </w:pPr>
-    </w:p>
-    <w:p>
-      <w:pPr>
-        <w:rPr>
-          <w:b/>
-          <w:bCs/>
-          <w:lang w:val="en-US"/>
-        </w:rPr>
-      </w:pPr>
-    </w:p>
-    <w:p>
-      <w:pPr>
-        <w:rPr>
-          <w:lang w:val="en-US"/>
-        </w:rPr>
-      </w:pPr>
-      <w:r>
-        <w:rPr>
-          <w:b/>
-          <w:bCs/>
+          <w:sz w:val="24"/>
+          <w:szCs w:val="24"/>
+          <w:lang w:val="en-US"/>
+        </w:rPr>
+      </w:pPr>
+    </w:p>
+    <w:p>
+      <w:pPr>
+        <w:rPr>
+          <w:b/>
+          <w:bCs/>
+          <w:sz w:val="24"/>
+          <w:szCs w:val="24"/>
+          <w:lang w:val="en-US"/>
+        </w:rPr>
+      </w:pPr>
+    </w:p>
+    <w:p>
+      <w:pPr>
+        <w:rPr>
+          <w:sz w:val="24"/>
+          <w:szCs w:val="24"/>
+          <w:lang w:val="en-US"/>
+        </w:rPr>
+      </w:pPr>
+      <w:r>
+        <w:rPr>
+          <w:b/>
+          <w:bCs/>
+          <w:sz w:val="24"/>
+          <w:szCs w:val="24"/>
           <w:lang w:val="en-US"/>
         </w:rPr>
         <w:t>JVM</w:t>
       </w:r>
       <w:r>
         <w:rPr>
+          <w:sz w:val="24"/>
+          <w:szCs w:val="24"/>
           <w:lang w:val="en-US"/>
         </w:rPr>
         <w:t xml:space="preserve">: </w:t>
       </w:r>
       <w:r>
         <w:rPr>
+          <w:sz w:val="24"/>
+          <w:szCs w:val="24"/>
           <w:lang w:val="en-US"/>
         </w:rPr>
         <w:t>A</w:t>
       </w:r>
       <w:r>
         <w:rPr>
+          <w:sz w:val="24"/>
+          <w:szCs w:val="24"/>
           <w:lang w:val="en-US"/>
         </w:rPr>
         <w:t xml:space="preserve"> process based virtual machine which acts as run-time engine to</w:t>
       </w:r>
       <w:r>
         <w:rPr>
+          <w:sz w:val="24"/>
+          <w:szCs w:val="24"/>
           <w:lang w:val="en-US"/>
         </w:rPr>
         <w:t xml:space="preserve"> load &amp;</w:t>
       </w:r>
       <w:r>
         <w:rPr>
+          <w:sz w:val="24"/>
+          <w:szCs w:val="24"/>
           <w:lang w:val="en-US"/>
         </w:rPr>
         <w:t xml:space="preserve"> run java </w:t>
       </w:r>
       <w:r>
         <w:rPr>
+          <w:sz w:val="24"/>
+          <w:szCs w:val="24"/>
           <w:lang w:val="en-US"/>
         </w:rPr>
         <w:t xml:space="preserve">program line-by-line &amp; functions as part of </w:t>
@@ -406,111 +553,263 @@
         <w:rPr>
           <w:b/>
           <w:bCs/>
-          <w:lang w:val="en-US"/>
-        </w:rPr>
-        <w:t>JRE</w:t>
-      </w:r>
-      <w:r>
-        <w:rPr>
-          <w:b/>
-          <w:bCs/>
+          <w:sz w:val="24"/>
+          <w:szCs w:val="24"/>
+          <w:lang w:val="en-US"/>
+        </w:rPr>
+        <w:t xml:space="preserve">JRE </w:t>
+      </w:r>
+      <w:r>
+        <w:rPr>
+          <w:sz w:val="24"/>
+          <w:szCs w:val="24"/>
+          <w:lang w:val="en-US"/>
+        </w:rPr>
+        <w:t>which</w:t>
+      </w:r>
+      <w:r>
+        <w:rPr>
+          <w:sz w:val="24"/>
+          <w:szCs w:val="24"/>
+          <w:lang w:val="en-US"/>
+        </w:rPr>
+        <w:t xml:space="preserve"> is part of </w:t>
+      </w:r>
+      <w:r>
+        <w:rPr>
+          <w:b/>
+          <w:bCs/>
+          <w:sz w:val="24"/>
+          <w:szCs w:val="24"/>
+          <w:lang w:val="en-US"/>
+        </w:rPr>
+        <w:t>JDK</w:t>
+      </w:r>
+      <w:r>
+        <w:rPr>
+          <w:sz w:val="24"/>
+          <w:szCs w:val="24"/>
+          <w:lang w:val="en-US"/>
+        </w:rPr>
+        <w:t>.</w:t>
+      </w:r>
+    </w:p>
+    <w:p>
+      <w:pPr>
+        <w:rPr>
+          <w:sz w:val="24"/>
+          <w:szCs w:val="24"/>
+          <w:lang w:val="en-US"/>
+        </w:rPr>
+      </w:pPr>
+    </w:p>
+    <w:p>
+      <w:pPr>
+        <w:rPr>
+          <w:sz w:val="24"/>
+          <w:szCs w:val="24"/>
+          <w:lang w:val="en-US"/>
+        </w:rPr>
+      </w:pPr>
+    </w:p>
+    <w:p>
+      <w:pPr>
+        <w:jc w:val="center"/>
+        <w:rPr>
+          <w:sz w:val="24"/>
+          <w:szCs w:val="24"/>
+          <w:lang w:val="en-US"/>
+        </w:rPr>
+      </w:pPr>
+      <w:r>
+        <w:rPr>
+          <w:noProof/>
+          <w:sz w:val="24"/>
+          <w:szCs w:val="24"/>
+          <w:lang w:val="en-US"/>
+        </w:rPr>
+        <w:drawing>
+          <wp:inline distT="0" distB="0" distL="0" distR="0" wp14:anchorId="65F42986" wp14:editId="325C182D">
+            <wp:extent cx="6372225" cy="5600700"/>
+            <wp:effectExtent l="0" t="0" r="9525" b="0"/>
+            <wp:docPr id="1822071336" name="Picture 2"/>
+            <wp:cNvGraphicFramePr>
+              <a:graphicFrameLocks xmlns:a="http://schemas.openxmlformats.org/drawingml/2006/main" noChangeAspect="1"/>
+            </wp:cNvGraphicFramePr>
+            <a:graphic xmlns:a="http://schemas.openxmlformats.org/drawingml/2006/main">
+              <a:graphicData uri="http://schemas.openxmlformats.org/drawingml/2006/picture">
+                <pic:pic xmlns:pic="http://schemas.openxmlformats.org/drawingml/2006/picture">
+                  <pic:nvPicPr>
+                    <pic:cNvPr id="1822071336" name="Picture 1822071336"/>
+                    <pic:cNvPicPr/>
+                  </pic:nvPicPr>
+                  <pic:blipFill>
+                    <a:blip r:embed="rId8">
+                      <a:extLst>
+                        <a:ext uri="{28A0092B-C50C-407E-A947-70E740481C1C}">
+                          <a14:useLocalDpi xmlns:a14="http://schemas.microsoft.com/office/drawing/2010/main" val="0"/>
+                        </a:ext>
+                      </a:extLst>
+                    </a:blip>
+                    <a:stretch>
+                      <a:fillRect/>
+                    </a:stretch>
+                  </pic:blipFill>
+                  <pic:spPr>
+                    <a:xfrm>
+                      <a:off x="0" y="0"/>
+                      <a:ext cx="6372225" cy="5600700"/>
+                    </a:xfrm>
+                    <a:prstGeom prst="rect">
+                      <a:avLst/>
+                    </a:prstGeom>
+                  </pic:spPr>
+                </pic:pic>
+              </a:graphicData>
+            </a:graphic>
+          </wp:inline>
+        </w:drawing>
+      </w:r>
+    </w:p>
+    <w:p>
+      <w:pPr>
+        <w:rPr>
+          <w:sz w:val="24"/>
+          <w:szCs w:val="24"/>
+          <w:lang w:val="en-US"/>
+        </w:rPr>
+      </w:pPr>
+    </w:p>
+    <w:p>
+      <w:pPr>
+        <w:rPr>
+          <w:sz w:val="24"/>
+          <w:szCs w:val="24"/>
+          <w:lang w:val="en-US"/>
+        </w:rPr>
+      </w:pPr>
+    </w:p>
+    <w:p>
+      <w:pPr>
+        <w:rPr>
+          <w:sz w:val="24"/>
+          <w:szCs w:val="24"/>
+          <w:lang w:val="en-US"/>
+        </w:rPr>
+      </w:pPr>
+    </w:p>
+    <w:p>
+      <w:pPr>
+        <w:rPr>
+          <w:sz w:val="24"/>
+          <w:szCs w:val="24"/>
+          <w:lang w:val="en-US"/>
+        </w:rPr>
+      </w:pPr>
+    </w:p>
+    <w:p>
+      <w:pPr>
+        <w:rPr>
+          <w:sz w:val="24"/>
+          <w:szCs w:val="24"/>
+          <w:lang w:val="en-US"/>
+        </w:rPr>
+      </w:pPr>
+    </w:p>
+    <w:p>
+      <w:pPr>
+        <w:rPr>
+          <w:sz w:val="24"/>
+          <w:szCs w:val="24"/>
+          <w:lang w:val="en-US"/>
+        </w:rPr>
+      </w:pPr>
+    </w:p>
+    <w:p>
+      <w:pPr>
+        <w:rPr>
+          <w:sz w:val="24"/>
+          <w:szCs w:val="24"/>
+          <w:lang w:val="en-US"/>
+        </w:rPr>
+      </w:pPr>
+    </w:p>
+    <w:p>
+      <w:pPr>
+        <w:rPr>
+          <w:sz w:val="24"/>
+          <w:szCs w:val="24"/>
+          <w:lang w:val="en-US"/>
+        </w:rPr>
+      </w:pPr>
+      <w:r>
+        <w:rPr>
+          <w:b/>
+          <w:bCs/>
+          <w:sz w:val="24"/>
+          <w:szCs w:val="24"/>
+          <w:lang w:val="en-US"/>
+        </w:rPr>
+        <w:lastRenderedPageBreak/>
+        <w:t>Class loader sub-system:</w:t>
+      </w:r>
+      <w:r>
+        <w:rPr>
+          <w:sz w:val="24"/>
+          <w:szCs w:val="24"/>
           <w:lang w:val="en-US"/>
         </w:rPr>
         <w:t xml:space="preserve"> </w:t>
       </w:r>
       <w:r>
         <w:rPr>
-          <w:lang w:val="en-US"/>
-        </w:rPr>
-        <w:t>which</w:t>
-      </w:r>
-      <w:r>
-        <w:rPr>
-          <w:lang w:val="en-US"/>
-        </w:rPr>
-        <w:t xml:space="preserve"> is part of </w:t>
-      </w:r>
-      <w:r>
-        <w:rPr>
-          <w:b/>
-          <w:bCs/>
-          <w:lang w:val="en-US"/>
-        </w:rPr>
-        <w:t>JDK</w:t>
-      </w:r>
-      <w:r>
-        <w:rPr>
-          <w:lang w:val="en-US"/>
-        </w:rPr>
-        <w:t>.</w:t>
-      </w:r>
-    </w:p>
-    <w:p>
-      <w:pPr>
-        <w:rPr>
-          <w:lang w:val="en-US"/>
-        </w:rPr>
-      </w:pPr>
-    </w:p>
-    <w:p>
-      <w:pPr>
-        <w:rPr>
-          <w:lang w:val="en-US"/>
-        </w:rPr>
-      </w:pPr>
-      <w:r>
-        <w:rPr>
-          <w:b/>
-          <w:bCs/>
-          <w:lang w:val="en-US"/>
-        </w:rPr>
-        <w:t>Class loader sub-system:</w:t>
-      </w:r>
-      <w:r>
-        <w:rPr>
+          <w:sz w:val="24"/>
+          <w:szCs w:val="24"/>
+        </w:rPr>
+        <w:t>responsible for loading Java class files (.class) into memory</w:t>
+      </w:r>
+      <w:r>
+        <w:rPr>
+          <w:sz w:val="24"/>
+          <w:szCs w:val="24"/>
+        </w:rPr>
+        <w:t xml:space="preserve"> (Runtime Data Area)</w:t>
+      </w:r>
+      <w:r>
+        <w:rPr>
+          <w:sz w:val="24"/>
+          <w:szCs w:val="24"/>
+        </w:rPr>
+        <w:t xml:space="preserve"> when a program runs.</w:t>
+      </w:r>
+      <w:r>
+        <w:rPr>
+          <w:sz w:val="24"/>
+          <w:szCs w:val="24"/>
           <w:lang w:val="en-US"/>
         </w:rPr>
         <w:t xml:space="preserve"> </w:t>
       </w:r>
-      <w:r>
-        <w:t>responsible for loading Java class files (.class) into memory</w:t>
-      </w:r>
-      <w:r>
-        <w:t xml:space="preserve"> (Runtime Data Area)</w:t>
-      </w:r>
-      <w:r>
-        <w:t xml:space="preserve"> when a program runs.</w:t>
-      </w:r>
-      <w:r>
-        <w:rPr>
-          <w:lang w:val="en-US"/>
-        </w:rPr>
-        <w:t xml:space="preserve"> </w:t>
-      </w:r>
-    </w:p>
-    <w:p>
-      <w:pPr>
-        <w:rPr>
-          <w:b/>
-          <w:bCs/>
-          <w:lang w:val="en-US"/>
-        </w:rPr>
-      </w:pPr>
-      <w:r>
-        <w:rPr>
-          <w:b/>
-          <w:bCs/>
-          <w:lang w:val="en-US"/>
-        </w:rPr>
-        <w:t>It’s responsible of 3 main tasks</w:t>
-      </w:r>
-      <w:r>
-        <w:rPr>
-          <w:b/>
-          <w:bCs/>
-          <w:lang w:val="en-US"/>
-        </w:rPr>
-        <w:t>:</w:t>
+    </w:p>
+    <w:p>
+      <w:pPr>
+        <w:rPr>
+          <w:b/>
+          <w:bCs/>
+          <w:sz w:val="24"/>
+          <w:szCs w:val="24"/>
+          <w:lang w:val="en-US"/>
+        </w:rPr>
+      </w:pPr>
+      <w:r>
+        <w:rPr>
+          <w:b/>
+          <w:bCs/>
+          <w:sz w:val="24"/>
+          <w:szCs w:val="24"/>
+          <w:lang w:val="en-US"/>
+        </w:rPr>
+        <w:t>It’s responsible of 3 main tasks:</w:t>
       </w:r>
     </w:p>
     <w:p>
@@ -521,46 +820,45 @@
           <w:numId w:val="2"/>
         </w:numPr>
         <w:rPr>
-          <w:lang w:val="en-US"/>
-        </w:rPr>
-      </w:pPr>
-      <w:r>
-        <w:rPr>
-          <w:lang w:val="en-US"/>
-        </w:rPr>
-        <w:t>Loading:</w:t>
-      </w:r>
-      <w:r>
-        <w:rPr>
-          <w:lang w:val="en-US"/>
-        </w:rPr>
-        <w:t xml:space="preserve"> </w:t>
-      </w:r>
-      <w:r>
-        <w:t>Loading is the process of reading .class files (bytecode)</w:t>
-      </w:r>
-      <w:r>
-        <w:t xml:space="preserve"> form hard desk</w:t>
-      </w:r>
-      <w:r>
-        <w:t xml:space="preserve"> and </w:t>
-      </w:r>
-      <w:r>
-        <w:t xml:space="preserve">store corresponding binary </w:t>
-      </w:r>
-      <w:r>
-        <w:t xml:space="preserve">information (related class name, immediate parent, type: class, interface or Enum, constructers info, modifiers info, methods info, constant info &amp; variables info) </w:t>
-      </w:r>
-      <w:r>
-        <w:t>in</w:t>
-      </w:r>
-      <w:r>
-        <w:t xml:space="preserve"> the</w:t>
-      </w:r>
-      <w:r>
-        <w:t xml:space="preserve"> Method area</w:t>
-      </w:r>
-      <w:r>
+          <w:sz w:val="24"/>
+          <w:szCs w:val="24"/>
+          <w:lang w:val="en-US"/>
+        </w:rPr>
+      </w:pPr>
+      <w:r>
+        <w:rPr>
+          <w:sz w:val="24"/>
+          <w:szCs w:val="24"/>
+          <w:lang w:val="en-US"/>
+        </w:rPr>
+        <w:t xml:space="preserve">Loading: </w:t>
+      </w:r>
+      <w:r>
+        <w:rPr>
+          <w:sz w:val="24"/>
+          <w:szCs w:val="24"/>
+        </w:rPr>
+        <w:t xml:space="preserve">Loading is the process of reading .class files (bytecode) form hard desk and store corresponding binary </w:t>
+      </w:r>
+      <w:r>
+        <w:rPr>
+          <w:sz w:val="24"/>
+          <w:szCs w:val="24"/>
+        </w:rPr>
+        <w:t>information (related class name, immediate parent, type: class, interface or Enum, constructers info, modifiers info, methods info, constant info &amp; variables info) in</w:t>
+      </w:r>
+      <w:r>
+        <w:rPr>
+          <w:sz w:val="24"/>
+          <w:szCs w:val="24"/>
+        </w:rPr>
+        <w:t xml:space="preserve"> the Method area</w:t>
+      </w:r>
+      <w:r>
+        <w:rPr>
+          <w:sz w:val="24"/>
+          <w:szCs w:val="24"/>
+        </w:rPr>
         <w:t>.</w:t>
       </w:r>
     </w:p>
@@ -568,88 +866,178 @@
       <w:pPr>
         <w:pStyle w:val="ListParagraph"/>
         <w:rPr>
-          <w:lang w:val="en-US"/>
-        </w:rPr>
-      </w:pPr>
-    </w:p>
-    <w:p>
-      <w:pPr>
-        <w:pStyle w:val="ListParagraph"/>
-      </w:pPr>
-      <w:r>
+          <w:sz w:val="24"/>
+          <w:szCs w:val="24"/>
+          <w:lang w:val="en-US"/>
+        </w:rPr>
+      </w:pPr>
+    </w:p>
+    <w:p>
+      <w:pPr>
+        <w:pStyle w:val="ListParagraph"/>
+        <w:rPr>
+          <w:sz w:val="24"/>
+          <w:szCs w:val="24"/>
+        </w:rPr>
+      </w:pPr>
+      <w:r>
+        <w:rPr>
+          <w:sz w:val="24"/>
+          <w:szCs w:val="24"/>
+        </w:rPr>
         <w:t>After loading every .class file JVM will create an object of type class to represent the total .class file binary information to be accessed by the programmer for access</w:t>
       </w:r>
       <w:r>
+        <w:rPr>
+          <w:sz w:val="24"/>
+          <w:szCs w:val="24"/>
+        </w:rPr>
         <w:t>ing</w:t>
       </w:r>
       <w:r>
+        <w:rPr>
+          <w:sz w:val="24"/>
+          <w:szCs w:val="24"/>
+        </w:rPr>
         <w:t xml:space="preserve"> class level </w:t>
       </w:r>
       <w:r>
+        <w:rPr>
+          <w:sz w:val="24"/>
+          <w:szCs w:val="24"/>
+        </w:rPr>
         <w:t>object binary</w:t>
       </w:r>
       <w:r>
+        <w:rPr>
+          <w:sz w:val="24"/>
+          <w:szCs w:val="24"/>
+        </w:rPr>
         <w:t xml:space="preserve"> information</w:t>
       </w:r>
       <w:r>
+        <w:rPr>
+          <w:sz w:val="24"/>
+          <w:szCs w:val="24"/>
+        </w:rPr>
         <w:t xml:space="preserve"> &amp; the created object will be stored in Heap Area</w:t>
       </w:r>
       <w:r>
+        <w:rPr>
+          <w:sz w:val="24"/>
+          <w:szCs w:val="24"/>
+        </w:rPr>
         <w:t>.</w:t>
       </w:r>
     </w:p>
     <w:p>
       <w:pPr>
         <w:pStyle w:val="ListParagraph"/>
-      </w:pPr>
-    </w:p>
-    <w:p>
-      <w:pPr>
-        <w:pStyle w:val="ListParagraph"/>
-      </w:pPr>
-      <w:r>
+        <w:rPr>
+          <w:sz w:val="24"/>
+          <w:szCs w:val="24"/>
+        </w:rPr>
+      </w:pPr>
+    </w:p>
+    <w:p>
+      <w:pPr>
+        <w:pStyle w:val="ListParagraph"/>
+        <w:rPr>
+          <w:sz w:val="24"/>
+          <w:szCs w:val="24"/>
+        </w:rPr>
+      </w:pPr>
+      <w:r>
+        <w:rPr>
+          <w:sz w:val="24"/>
+          <w:szCs w:val="24"/>
+        </w:rPr>
         <w:t xml:space="preserve">The created object it is not an </w:t>
       </w:r>
       <w:r>
+        <w:rPr>
+          <w:sz w:val="24"/>
+          <w:szCs w:val="24"/>
+        </w:rPr>
         <w:t>object of the red class;</w:t>
       </w:r>
       <w:r>
+        <w:rPr>
+          <w:sz w:val="24"/>
+          <w:szCs w:val="24"/>
+        </w:rPr>
         <w:t xml:space="preserve"> it’s an object of type class</w:t>
       </w:r>
       <w:r>
+        <w:rPr>
+          <w:sz w:val="24"/>
+          <w:szCs w:val="24"/>
+        </w:rPr>
         <w:t xml:space="preserve"> (class-class-object)</w:t>
       </w:r>
       <w:r>
+        <w:rPr>
+          <w:sz w:val="24"/>
+          <w:szCs w:val="24"/>
+        </w:rPr>
         <w:t>.</w:t>
       </w:r>
     </w:p>
     <w:p>
       <w:pPr>
         <w:pStyle w:val="ListParagraph"/>
-      </w:pPr>
-    </w:p>
-    <w:p>
-      <w:pPr>
-        <w:pStyle w:val="ListParagraph"/>
-      </w:pPr>
-      <w:r>
+        <w:rPr>
+          <w:sz w:val="24"/>
+          <w:szCs w:val="24"/>
+        </w:rPr>
+      </w:pPr>
+    </w:p>
+    <w:p>
+      <w:pPr>
+        <w:pStyle w:val="ListParagraph"/>
+        <w:rPr>
+          <w:sz w:val="24"/>
+          <w:szCs w:val="24"/>
+        </w:rPr>
+      </w:pPr>
+      <w:r>
+        <w:rPr>
+          <w:sz w:val="24"/>
+          <w:szCs w:val="24"/>
+        </w:rPr>
         <w:t>For every load/red .class file JVM will only on class</w:t>
       </w:r>
       <w:r>
+        <w:rPr>
+          <w:sz w:val="24"/>
+          <w:szCs w:val="24"/>
+        </w:rPr>
         <w:t>-class</w:t>
       </w:r>
       <w:r>
+        <w:rPr>
+          <w:sz w:val="24"/>
+          <w:szCs w:val="24"/>
+        </w:rPr>
         <w:t xml:space="preserve"> object even if it’s used many times across the program.</w:t>
       </w:r>
     </w:p>
     <w:p>
       <w:pPr>
         <w:pStyle w:val="ListParagraph"/>
-      </w:pPr>
-    </w:p>
-    <w:p>
-      <w:pPr>
-        <w:pStyle w:val="ListParagraph"/>
+        <w:rPr>
+          <w:sz w:val="24"/>
+          <w:szCs w:val="24"/>
+        </w:rPr>
+      </w:pPr>
+    </w:p>
+    <w:p>
+      <w:pPr>
+        <w:pStyle w:val="ListParagraph"/>
+        <w:rPr>
+          <w:sz w:val="24"/>
+          <w:szCs w:val="24"/>
+        </w:rPr>
       </w:pPr>
     </w:p>
     <w:p>
@@ -657,10 +1045,16 @@
         <w:pStyle w:val="ListParagraph"/>
         <w:ind w:left="0"/>
         <w:jc w:val="center"/>
+        <w:rPr>
+          <w:sz w:val="24"/>
+          <w:szCs w:val="24"/>
+        </w:rPr>
       </w:pPr>
       <w:r>
         <w:rPr>
           <w:noProof/>
+          <w:sz w:val="24"/>
+          <w:szCs w:val="24"/>
         </w:rPr>
         <w:drawing>
           <wp:inline distT="0" distB="0" distL="0" distR="0" wp14:anchorId="5C44160F" wp14:editId="6CD25F63">
@@ -678,7 +1072,7 @@
                     <pic:cNvPicPr/>
                   </pic:nvPicPr>
                   <pic:blipFill>
-                    <a:blip r:embed="rId8"/>
+                    <a:blip r:embed="rId9"/>
                     <a:stretch>
                       <a:fillRect/>
                     </a:stretch>
@@ -704,6 +1098,10 @@
         <w:pStyle w:val="ListParagraph"/>
         <w:ind w:left="0"/>
         <w:jc w:val="center"/>
+        <w:rPr>
+          <w:sz w:val="24"/>
+          <w:szCs w:val="24"/>
+        </w:rPr>
       </w:pPr>
     </w:p>
     <w:p>
@@ -711,6 +1109,10 @@
         <w:pStyle w:val="ListParagraph"/>
         <w:ind w:left="0"/>
         <w:jc w:val="center"/>
+        <w:rPr>
+          <w:sz w:val="24"/>
+          <w:szCs w:val="24"/>
+        </w:rPr>
       </w:pPr>
     </w:p>
     <w:p>
@@ -718,6 +1120,10 @@
         <w:pStyle w:val="ListParagraph"/>
         <w:ind w:left="0"/>
         <w:jc w:val="center"/>
+        <w:rPr>
+          <w:sz w:val="24"/>
+          <w:szCs w:val="24"/>
+        </w:rPr>
       </w:pPr>
     </w:p>
     <w:p>
@@ -725,10 +1131,16 @@
         <w:pStyle w:val="ListParagraph"/>
         <w:ind w:left="0"/>
         <w:jc w:val="center"/>
+        <w:rPr>
+          <w:sz w:val="24"/>
+          <w:szCs w:val="24"/>
+        </w:rPr>
       </w:pPr>
       <w:r>
         <w:rPr>
           <w:noProof/>
+          <w:sz w:val="24"/>
+          <w:szCs w:val="24"/>
         </w:rPr>
         <w:lastRenderedPageBreak/>
         <w:drawing>
@@ -747,7 +1159,7 @@
                     <pic:cNvPicPr/>
                   </pic:nvPicPr>
                   <pic:blipFill>
-                    <a:blip r:embed="rId9"/>
+                    <a:blip r:embed="rId10"/>
                     <a:stretch>
                       <a:fillRect/>
                     </a:stretch>
@@ -771,6 +1183,10 @@
     <w:p>
       <w:pPr>
         <w:pStyle w:val="ListParagraph"/>
+        <w:rPr>
+          <w:sz w:val="24"/>
+          <w:szCs w:val="24"/>
+        </w:rPr>
       </w:pPr>
     </w:p>
     <w:p>
@@ -781,11 +1197,15 @@
         <w:rPr>
           <w:b/>
           <w:bCs/>
+          <w:sz w:val="24"/>
+          <w:szCs w:val="24"/>
         </w:rPr>
       </w:pPr>
       <w:r>
         <w:rPr>
           <w:noProof/>
+          <w:sz w:val="24"/>
+          <w:szCs w:val="24"/>
         </w:rPr>
         <w:drawing>
           <wp:inline distT="0" distB="0" distL="0" distR="0" wp14:anchorId="4757E856" wp14:editId="6EE9CE10">
@@ -803,7 +1223,7 @@
                     <pic:cNvPicPr/>
                   </pic:nvPicPr>
                   <pic:blipFill>
-                    <a:blip r:embed="rId10"/>
+                    <a:blip r:embed="rId11"/>
                     <a:stretch>
                       <a:fillRect/>
                     </a:stretch>
@@ -830,45 +1250,69 @@
         <w:rPr>
           <w:b/>
           <w:bCs/>
-        </w:rPr>
-      </w:pPr>
-    </w:p>
-    <w:p>
-      <w:pPr>
-        <w:pStyle w:val="ListParagraph"/>
-      </w:pPr>
-    </w:p>
-    <w:p>
-      <w:pPr>
-        <w:pStyle w:val="ListParagraph"/>
-      </w:pPr>
-      <w:r>
-        <w:rPr>
-          <w:b/>
-          <w:bCs/>
-        </w:rPr>
+          <w:sz w:val="24"/>
+          <w:szCs w:val="24"/>
+        </w:rPr>
+      </w:pPr>
+    </w:p>
+    <w:p>
+      <w:pPr>
+        <w:pStyle w:val="ListParagraph"/>
+        <w:rPr>
+          <w:sz w:val="24"/>
+          <w:szCs w:val="24"/>
+        </w:rPr>
+      </w:pPr>
+    </w:p>
+    <w:p>
+      <w:pPr>
+        <w:pStyle w:val="ListParagraph"/>
+        <w:rPr>
+          <w:sz w:val="24"/>
+          <w:szCs w:val="24"/>
+        </w:rPr>
+      </w:pPr>
+      <w:r>
+        <w:rPr>
+          <w:b/>
+          <w:bCs/>
+          <w:sz w:val="24"/>
+          <w:szCs w:val="24"/>
+        </w:rPr>
+        <w:lastRenderedPageBreak/>
         <w:t>Initialization</w:t>
       </w:r>
       <w:r>
-        <w:t>:</w:t>
-      </w:r>
-      <w:r>
-        <w:t xml:space="preserve"> is the final phase of the class loading process in which the JVM assigns actual values to static variables and executes static blocks of a class.</w:t>
-      </w:r>
-    </w:p>
-    <w:p>
-      <w:pPr>
-        <w:pStyle w:val="ListParagraph"/>
-      </w:pPr>
-    </w:p>
-    <w:p>
-      <w:pPr>
-        <w:pStyle w:val="ListParagraph"/>
-        <w:rPr>
-          <w:lang w:val="en-US"/>
-        </w:rPr>
-      </w:pPr>
-      <w:r>
+        <w:rPr>
+          <w:sz w:val="24"/>
+          <w:szCs w:val="24"/>
+        </w:rPr>
+        <w:t>: is the final phase of the class loading process in which the JVM assigns actual values to static variables and executes static blocks of a class.</w:t>
+      </w:r>
+    </w:p>
+    <w:p>
+      <w:pPr>
+        <w:pStyle w:val="ListParagraph"/>
+        <w:rPr>
+          <w:sz w:val="24"/>
+          <w:szCs w:val="24"/>
+        </w:rPr>
+      </w:pPr>
+    </w:p>
+    <w:p>
+      <w:pPr>
+        <w:pStyle w:val="ListParagraph"/>
+        <w:rPr>
+          <w:sz w:val="24"/>
+          <w:szCs w:val="24"/>
+          <w:lang w:val="en-US"/>
+        </w:rPr>
+      </w:pPr>
+      <w:r>
+        <w:rPr>
+          <w:sz w:val="24"/>
+          <w:szCs w:val="24"/>
+        </w:rPr>
         <w:t xml:space="preserve"> </w:t>
       </w:r>
     </w:p>
@@ -880,13 +1324,17 @@
           <w:numId w:val="2"/>
         </w:numPr>
         <w:rPr>
-          <w:lang w:val="en-US"/>
-        </w:rPr>
-      </w:pPr>
-      <w:r>
-        <w:rPr>
-          <w:b/>
-          <w:bCs/>
+          <w:sz w:val="24"/>
+          <w:szCs w:val="24"/>
+          <w:lang w:val="en-US"/>
+        </w:rPr>
+      </w:pPr>
+      <w:r>
+        <w:rPr>
+          <w:b/>
+          <w:bCs/>
+          <w:sz w:val="24"/>
+          <w:szCs w:val="24"/>
           <w:lang w:val="en-US"/>
         </w:rPr>
         <w:t>Linking</w:t>
@@ -895,21 +1343,31 @@
         <w:rPr>
           <w:b/>
           <w:bCs/>
+          <w:sz w:val="24"/>
+          <w:szCs w:val="24"/>
           <w:lang w:val="en-US"/>
         </w:rPr>
         <w:t>:</w:t>
       </w:r>
       <w:r>
         <w:rPr>
+          <w:sz w:val="24"/>
+          <w:szCs w:val="24"/>
           <w:lang w:val="en-US"/>
         </w:rPr>
         <w:t xml:space="preserve"> </w:t>
       </w:r>
       <w:r>
+        <w:rPr>
+          <w:sz w:val="24"/>
+          <w:szCs w:val="24"/>
+        </w:rPr>
         <w:t>Linking is the process of preparing the loaded class so it can be used safely and correctly.</w:t>
       </w:r>
       <w:r>
         <w:rPr>
+          <w:sz w:val="24"/>
+          <w:szCs w:val="24"/>
           <w:lang w:val="en-US"/>
         </w:rPr>
         <w:t xml:space="preserve"> </w:t>
@@ -918,81 +1376,93 @@
     <w:p>
       <w:pPr>
         <w:ind w:left="360"/>
-      </w:pPr>
-      <w:r>
-        <w:rPr>
-          <w:b/>
-          <w:bCs/>
+        <w:rPr>
+          <w:sz w:val="24"/>
+          <w:szCs w:val="24"/>
+        </w:rPr>
+      </w:pPr>
+      <w:r>
+        <w:rPr>
+          <w:b/>
+          <w:bCs/>
+          <w:sz w:val="24"/>
+          <w:szCs w:val="24"/>
         </w:rPr>
         <w:t>Verification</w:t>
       </w:r>
       <w:r>
-        <w:t>:</w:t>
-      </w:r>
-      <w:r>
-        <w:t xml:space="preserve"> is the process of checking whether the loaded bytecode is structurally correct and safe to execute according to JVM specifications</w:t>
-      </w:r>
-      <w:r>
-        <w:t xml:space="preserve"> and it’s done by </w:t>
-      </w:r>
-      <w:r>
-        <w:t>bytecode</w:t>
-      </w:r>
-      <w:r>
-        <w:t xml:space="preserve"> verifier.</w:t>
+        <w:rPr>
+          <w:sz w:val="24"/>
+          <w:szCs w:val="24"/>
+        </w:rPr>
+        <w:t>: is the process of checking whether the loaded bytecode is structurally correct and safe to execute according to JVM specifications and it’s done by bytecode verifier.</w:t>
       </w:r>
     </w:p>
     <w:p>
       <w:pPr>
         <w:ind w:left="360"/>
-      </w:pPr>
-      <w:r>
-        <w:rPr>
-          <w:b/>
-          <w:bCs/>
+        <w:rPr>
+          <w:sz w:val="24"/>
+          <w:szCs w:val="24"/>
+        </w:rPr>
+      </w:pPr>
+      <w:r>
+        <w:rPr>
+          <w:b/>
+          <w:bCs/>
+          <w:sz w:val="24"/>
+          <w:szCs w:val="24"/>
         </w:rPr>
         <w:t>Preparation</w:t>
       </w:r>
       <w:r>
-        <w:t>:</w:t>
-      </w:r>
-      <w:r>
-        <w:t xml:space="preserve"> is the phase where memory is allocated for class-level static variables and they are assigned default values.</w:t>
+        <w:rPr>
+          <w:sz w:val="24"/>
+          <w:szCs w:val="24"/>
+        </w:rPr>
+        <w:t>: is the phase where memory is allocated for class-level static variables and they are assigned default values.</w:t>
       </w:r>
     </w:p>
     <w:p>
       <w:pPr>
         <w:ind w:left="360"/>
-      </w:pPr>
-      <w:r>
-        <w:rPr>
-          <w:b/>
-          <w:bCs/>
+        <w:rPr>
+          <w:sz w:val="24"/>
+          <w:szCs w:val="24"/>
+        </w:rPr>
+      </w:pPr>
+      <w:r>
+        <w:rPr>
+          <w:b/>
+          <w:bCs/>
+          <w:sz w:val="24"/>
+          <w:szCs w:val="24"/>
         </w:rPr>
         <w:t>Resolution</w:t>
       </w:r>
       <w:r>
-        <w:t>:</w:t>
-      </w:r>
-      <w:r>
-        <w:t xml:space="preserve"> is the process of converting symbolic references in the class into direct memory references</w:t>
-      </w:r>
-      <w:r>
-        <w:t xml:space="preserve"> in the constants pool of the parent class</w:t>
-      </w:r>
-      <w:r>
-        <w:t>.</w:t>
-      </w:r>
-    </w:p>
-    <w:p>
-      <w:pPr>
-        <w:pStyle w:val="ListParagraph"/>
-      </w:pPr>
-    </w:p>
-    <w:p>
-      <w:pPr>
-        <w:pStyle w:val="ListParagraph"/>
-        <w:rPr>
+        <w:rPr>
+          <w:sz w:val="24"/>
+          <w:szCs w:val="24"/>
+        </w:rPr>
+        <w:t>: is the process of converting symbolic references in the class into direct memory references in the constants pool of the parent class.</w:t>
+      </w:r>
+    </w:p>
+    <w:p>
+      <w:pPr>
+        <w:pStyle w:val="ListParagraph"/>
+        <w:rPr>
+          <w:sz w:val="24"/>
+          <w:szCs w:val="24"/>
+        </w:rPr>
+      </w:pPr>
+    </w:p>
+    <w:p>
+      <w:pPr>
+        <w:pStyle w:val="ListParagraph"/>
+        <w:rPr>
+          <w:sz w:val="24"/>
+          <w:szCs w:val="24"/>
           <w:lang w:val="en-US"/>
         </w:rPr>
       </w:pPr>
@@ -1005,26 +1475,38 @@
           <w:numId w:val="2"/>
         </w:numPr>
         <w:rPr>
-          <w:lang w:val="en-US"/>
-        </w:rPr>
-      </w:pPr>
-      <w:r>
-        <w:rPr>
+          <w:sz w:val="24"/>
+          <w:szCs w:val="24"/>
+          <w:lang w:val="en-US"/>
+        </w:rPr>
+      </w:pPr>
+      <w:r>
+        <w:rPr>
+          <w:sz w:val="24"/>
+          <w:szCs w:val="24"/>
           <w:lang w:val="en-US"/>
         </w:rPr>
         <w:t>Initializing</w:t>
       </w:r>
       <w:r>
         <w:rPr>
+          <w:sz w:val="24"/>
+          <w:szCs w:val="24"/>
           <w:lang w:val="en-US"/>
         </w:rPr>
         <w:t xml:space="preserve">: </w:t>
       </w:r>
       <w:r>
+        <w:rPr>
+          <w:sz w:val="24"/>
+          <w:szCs w:val="24"/>
+        </w:rPr>
         <w:t>the process where actual values are assigned to static variables and static blocks are executed.</w:t>
       </w:r>
       <w:r>
         <w:rPr>
+          <w:sz w:val="24"/>
+          <w:szCs w:val="24"/>
           <w:lang w:val="en-US"/>
         </w:rPr>
         <w:t xml:space="preserve"> </w:t>
@@ -1034,6 +1516,8 @@
       <w:pPr>
         <w:pStyle w:val="ListParagraph"/>
         <w:rPr>
+          <w:sz w:val="24"/>
+          <w:szCs w:val="24"/>
           <w:lang w:val="en-US"/>
         </w:rPr>
       </w:pPr>
@@ -1042,19 +1526,39 @@
       <w:pPr>
         <w:pStyle w:val="ListParagraph"/>
         <w:jc w:val="center"/>
-      </w:pPr>
-      <w:r>
+        <w:rPr>
+          <w:sz w:val="24"/>
+          <w:szCs w:val="24"/>
+        </w:rPr>
+      </w:pPr>
+      <w:r>
+        <w:rPr>
+          <w:sz w:val="24"/>
+          <w:szCs w:val="24"/>
+        </w:rPr>
         <w:t>“</w:t>
       </w:r>
       <w:r>
+        <w:rPr>
+          <w:sz w:val="24"/>
+          <w:szCs w:val="24"/>
+        </w:rPr>
         <w:t xml:space="preserve">If compilation is fine but runtime class connection fails → </w:t>
       </w:r>
       <w:proofErr w:type="spellStart"/>
       <w:r>
+        <w:rPr>
+          <w:sz w:val="24"/>
+          <w:szCs w:val="24"/>
+        </w:rPr>
         <w:t>LinkageError</w:t>
       </w:r>
       <w:proofErr w:type="spellEnd"/>
       <w:r>
+        <w:rPr>
+          <w:sz w:val="24"/>
+          <w:szCs w:val="24"/>
+        </w:rPr>
         <w:t>”</w:t>
       </w:r>
     </w:p>
@@ -1062,6 +1566,10 @@
       <w:pPr>
         <w:pStyle w:val="ListParagraph"/>
         <w:jc w:val="center"/>
+        <w:rPr>
+          <w:sz w:val="24"/>
+          <w:szCs w:val="24"/>
+        </w:rPr>
       </w:pPr>
     </w:p>
     <w:p>
@@ -1071,6 +1579,8 @@
         <w:rPr>
           <w:b/>
           <w:bCs/>
+          <w:sz w:val="24"/>
+          <w:szCs w:val="24"/>
           <w:u w:val="single"/>
         </w:rPr>
       </w:pPr>
@@ -1078,6 +1588,8 @@
         <w:rPr>
           <w:b/>
           <w:bCs/>
+          <w:sz w:val="24"/>
+          <w:szCs w:val="24"/>
           <w:u w:val="single"/>
         </w:rPr>
         <w:t xml:space="preserve">Types of class loaders: </w:t>
@@ -1090,11 +1602,17 @@
           <w:ilvl w:val="0"/>
           <w:numId w:val="3"/>
         </w:numPr>
-      </w:pPr>
-      <w:r>
-        <w:rPr>
-          <w:b/>
-          <w:bCs/>
+        <w:rPr>
+          <w:sz w:val="24"/>
+          <w:szCs w:val="24"/>
+        </w:rPr>
+      </w:pPr>
+      <w:r>
+        <w:rPr>
+          <w:b/>
+          <w:bCs/>
+          <w:sz w:val="24"/>
+          <w:szCs w:val="24"/>
         </w:rPr>
         <w:t xml:space="preserve">Bootstrap class </w:t>
       </w:r>
@@ -1102,14 +1620,17 @@
         <w:rPr>
           <w:b/>
           <w:bCs/>
+          <w:sz w:val="24"/>
+          <w:szCs w:val="24"/>
         </w:rPr>
         <w:t>loader</w:t>
       </w:r>
       <w:r>
-        <w:t xml:space="preserve">: </w:t>
-      </w:r>
-      <w:r>
-        <w:t>is the root class loader in JVM that loads core Java classes from the JDK internal runtime libraries.</w:t>
+        <w:rPr>
+          <w:sz w:val="24"/>
+          <w:szCs w:val="24"/>
+        </w:rPr>
+        <w:t>: is the root class loader in JVM that loads core Java classes from the JDK internal runtime libraries.</w:t>
       </w:r>
     </w:p>
     <w:p>
@@ -1135,22 +1656,23 @@
           <w:lang w:eastAsia="en-AE"/>
           <w14:ligatures w14:val="none"/>
         </w:rPr>
-        <w:t xml:space="preserve">             </w:t>
+        <w:t xml:space="preserve">             Type:</w:t>
       </w:r>
       <w:r>
         <w:rPr>
           <w:rFonts w:ascii="Times New Roman" w:eastAsia="Times New Roman" w:hAnsi="Times New Roman" w:cs="Times New Roman"/>
-          <w:b/>
-          <w:bCs/>
           <w:kern w:val="0"/>
           <w:sz w:val="24"/>
           <w:szCs w:val="24"/>
           <w:lang w:eastAsia="en-AE"/>
           <w14:ligatures w14:val="none"/>
         </w:rPr>
-        <w:t>Type:</w:t>
-      </w:r>
-      <w:r>
+        <w:t xml:space="preserve"> Native class loader (part of JVM, written in native code) </w:t>
+      </w:r>
+    </w:p>
+    <w:p>
+      <w:pPr>
+        <w:spacing w:after="0" w:line="240" w:lineRule="auto"/>
         <w:rPr>
           <w:rFonts w:ascii="Times New Roman" w:eastAsia="Times New Roman" w:hAnsi="Times New Roman" w:cs="Times New Roman"/>
           <w:kern w:val="0"/>
@@ -1159,12 +1681,21 @@
           <w:lang w:eastAsia="en-AE"/>
           <w14:ligatures w14:val="none"/>
         </w:rPr>
-        <w:t xml:space="preserve"> Native class loader (part of JVM, written in native code) </w:t>
-      </w:r>
-    </w:p>
-    <w:p>
-      <w:pPr>
-        <w:spacing w:after="0" w:line="240" w:lineRule="auto"/>
+      </w:pPr>
+      <w:r>
+        <w:rPr>
+          <w:rFonts w:ascii="Times New Roman" w:eastAsia="Times New Roman" w:hAnsi="Times New Roman" w:cs="Times New Roman"/>
+          <w:b/>
+          <w:bCs/>
+          <w:kern w:val="0"/>
+          <w:sz w:val="24"/>
+          <w:szCs w:val="24"/>
+          <w:lang w:eastAsia="en-AE"/>
+          <w14:ligatures w14:val="none"/>
+        </w:rPr>
+        <w:t xml:space="preserve">             Loads:</w:t>
+      </w:r>
+      <w:r>
         <w:rPr>
           <w:rFonts w:ascii="Times New Roman" w:eastAsia="Times New Roman" w:hAnsi="Times New Roman" w:cs="Times New Roman"/>
           <w:kern w:val="0"/>
@@ -1173,32 +1704,31 @@
           <w:lang w:eastAsia="en-AE"/>
           <w14:ligatures w14:val="none"/>
         </w:rPr>
-      </w:pPr>
-      <w:r>
-        <w:rPr>
-          <w:rFonts w:ascii="Times New Roman" w:eastAsia="Times New Roman" w:hAnsi="Times New Roman" w:cs="Times New Roman"/>
-          <w:b/>
-          <w:bCs/>
+        <w:t xml:space="preserve"> Core Java classes like </w:t>
+      </w:r>
+      <w:proofErr w:type="spellStart"/>
+      <w:r>
+        <w:rPr>
+          <w:rFonts w:ascii="Courier New" w:eastAsia="Times New Roman" w:hAnsi="Courier New" w:cs="Courier New"/>
           <w:kern w:val="0"/>
           <w:sz w:val="24"/>
           <w:szCs w:val="24"/>
           <w:lang w:eastAsia="en-AE"/>
           <w14:ligatures w14:val="none"/>
         </w:rPr>
-        <w:t xml:space="preserve">             </w:t>
-      </w:r>
-      <w:r>
-        <w:rPr>
-          <w:rFonts w:ascii="Times New Roman" w:eastAsia="Times New Roman" w:hAnsi="Times New Roman" w:cs="Times New Roman"/>
-          <w:b/>
-          <w:bCs/>
+        <w:t>java.lang</w:t>
+      </w:r>
+      <w:proofErr w:type="spellEnd"/>
+      <w:r>
+        <w:rPr>
+          <w:rFonts w:ascii="Courier New" w:eastAsia="Times New Roman" w:hAnsi="Courier New" w:cs="Courier New"/>
           <w:kern w:val="0"/>
           <w:sz w:val="24"/>
           <w:szCs w:val="24"/>
           <w:lang w:eastAsia="en-AE"/>
           <w14:ligatures w14:val="none"/>
         </w:rPr>
-        <w:t>Loads:</w:t>
+        <w:t>.*</w:t>
       </w:r>
       <w:r>
         <w:rPr>
@@ -1209,27 +1739,27 @@
           <w:lang w:eastAsia="en-AE"/>
           <w14:ligatures w14:val="none"/>
         </w:rPr>
-        <w:t xml:space="preserve"> Core Java classes like </w:t>
+        <w:t xml:space="preserve">, </w:t>
       </w:r>
       <w:proofErr w:type="spellStart"/>
       <w:r>
         <w:rPr>
           <w:rFonts w:ascii="Courier New" w:eastAsia="Times New Roman" w:hAnsi="Courier New" w:cs="Courier New"/>
           <w:kern w:val="0"/>
-          <w:sz w:val="20"/>
-          <w:szCs w:val="20"/>
+          <w:sz w:val="24"/>
+          <w:szCs w:val="24"/>
           <w:lang w:eastAsia="en-AE"/>
           <w14:ligatures w14:val="none"/>
         </w:rPr>
-        <w:t>java.lang</w:t>
+        <w:t>java.util</w:t>
       </w:r>
       <w:proofErr w:type="spellEnd"/>
       <w:r>
         <w:rPr>
           <w:rFonts w:ascii="Courier New" w:eastAsia="Times New Roman" w:hAnsi="Courier New" w:cs="Courier New"/>
           <w:kern w:val="0"/>
-          <w:sz w:val="20"/>
-          <w:szCs w:val="20"/>
+          <w:sz w:val="24"/>
+          <w:szCs w:val="24"/>
           <w:lang w:eastAsia="en-AE"/>
           <w14:ligatures w14:val="none"/>
         </w:rPr>
@@ -1246,29 +1776,101 @@
         </w:rPr>
         <w:t xml:space="preserve">, </w:t>
       </w:r>
-      <w:proofErr w:type="spellStart"/>
+      <w:proofErr w:type="gramStart"/>
       <w:r>
         <w:rPr>
           <w:rFonts w:ascii="Courier New" w:eastAsia="Times New Roman" w:hAnsi="Courier New" w:cs="Courier New"/>
           <w:kern w:val="0"/>
-          <w:sz w:val="20"/>
-          <w:szCs w:val="20"/>
+          <w:sz w:val="24"/>
+          <w:szCs w:val="24"/>
           <w:lang w:eastAsia="en-AE"/>
           <w14:ligatures w14:val="none"/>
         </w:rPr>
-        <w:t>java.util</w:t>
-      </w:r>
-      <w:proofErr w:type="spellEnd"/>
+        <w:t>java.io.*</w:t>
+      </w:r>
+      <w:proofErr w:type="gramEnd"/>
+      <w:r>
+        <w:rPr>
+          <w:rFonts w:ascii="Times New Roman" w:eastAsia="Times New Roman" w:hAnsi="Times New Roman" w:cs="Times New Roman"/>
+          <w:kern w:val="0"/>
+          <w:sz w:val="24"/>
+          <w:szCs w:val="24"/>
+          <w:lang w:eastAsia="en-AE"/>
+          <w14:ligatures w14:val="none"/>
+        </w:rPr>
+        <w:t xml:space="preserve"> </w:t>
+      </w:r>
+    </w:p>
+    <w:p>
+      <w:pPr>
+        <w:spacing w:after="0" w:line="240" w:lineRule="auto"/>
+        <w:rPr>
+          <w:rFonts w:ascii="Times New Roman" w:eastAsia="Times New Roman" w:hAnsi="Times New Roman" w:cs="Times New Roman"/>
+          <w:kern w:val="0"/>
+          <w:sz w:val="24"/>
+          <w:szCs w:val="24"/>
+          <w:lang w:eastAsia="en-AE"/>
+          <w14:ligatures w14:val="none"/>
+        </w:rPr>
+      </w:pPr>
+      <w:r>
+        <w:rPr>
+          <w:rFonts w:ascii="Times New Roman" w:eastAsia="Times New Roman" w:hAnsi="Times New Roman" w:cs="Times New Roman"/>
+          <w:b/>
+          <w:bCs/>
+          <w:kern w:val="0"/>
+          <w:sz w:val="24"/>
+          <w:szCs w:val="24"/>
+          <w:lang w:eastAsia="en-AE"/>
+          <w14:ligatures w14:val="none"/>
+        </w:rPr>
+        <w:t xml:space="preserve">             From where:</w:t>
+      </w:r>
+      <w:r>
+        <w:rPr>
+          <w:rFonts w:ascii="Times New Roman" w:eastAsia="Times New Roman" w:hAnsi="Times New Roman" w:cs="Times New Roman"/>
+          <w:kern w:val="0"/>
+          <w:sz w:val="24"/>
+          <w:szCs w:val="24"/>
+          <w:lang w:eastAsia="en-AE"/>
+          <w14:ligatures w14:val="none"/>
+        </w:rPr>
+        <w:t xml:space="preserve"> </w:t>
+      </w:r>
       <w:r>
         <w:rPr>
           <w:rFonts w:ascii="Courier New" w:eastAsia="Times New Roman" w:hAnsi="Courier New" w:cs="Courier New"/>
           <w:kern w:val="0"/>
-          <w:sz w:val="20"/>
-          <w:szCs w:val="20"/>
+          <w:sz w:val="24"/>
+          <w:szCs w:val="24"/>
           <w:lang w:eastAsia="en-AE"/>
           <w14:ligatures w14:val="none"/>
         </w:rPr>
-        <w:t>.*</w:t>
+        <w:t>$JAVA_HOME/</w:t>
+      </w:r>
+      <w:proofErr w:type="spellStart"/>
+      <w:r>
+        <w:rPr>
+          <w:rFonts w:ascii="Courier New" w:eastAsia="Times New Roman" w:hAnsi="Courier New" w:cs="Courier New"/>
+          <w:kern w:val="0"/>
+          <w:sz w:val="24"/>
+          <w:szCs w:val="24"/>
+          <w:lang w:eastAsia="en-AE"/>
+          <w14:ligatures w14:val="none"/>
+        </w:rPr>
+        <w:t>jre</w:t>
+      </w:r>
+      <w:proofErr w:type="spellEnd"/>
+      <w:r>
+        <w:rPr>
+          <w:rFonts w:ascii="Courier New" w:eastAsia="Times New Roman" w:hAnsi="Courier New" w:cs="Courier New"/>
+          <w:kern w:val="0"/>
+          <w:sz w:val="24"/>
+          <w:szCs w:val="24"/>
+          <w:lang w:eastAsia="en-AE"/>
+          <w14:ligatures w14:val="none"/>
+        </w:rPr>
+        <w:t>/lib</w:t>
       </w:r>
       <w:r>
         <w:rPr>
@@ -1279,134 +1881,14 @@
           <w:lang w:eastAsia="en-AE"/>
           <w14:ligatures w14:val="none"/>
         </w:rPr>
-        <w:t xml:space="preserve">, </w:t>
-      </w:r>
-      <w:proofErr w:type="gramStart"/>
+        <w:t xml:space="preserve"> (or </w:t>
+      </w:r>
       <w:r>
         <w:rPr>
           <w:rFonts w:ascii="Courier New" w:eastAsia="Times New Roman" w:hAnsi="Courier New" w:cs="Courier New"/>
           <w:kern w:val="0"/>
-          <w:sz w:val="20"/>
-          <w:szCs w:val="20"/>
-          <w:lang w:eastAsia="en-AE"/>
-          <w14:ligatures w14:val="none"/>
-        </w:rPr>
-        <w:t>java.io.*</w:t>
-      </w:r>
-      <w:proofErr w:type="gramEnd"/>
-      <w:r>
-        <w:rPr>
-          <w:rFonts w:ascii="Times New Roman" w:eastAsia="Times New Roman" w:hAnsi="Times New Roman" w:cs="Times New Roman"/>
-          <w:kern w:val="0"/>
-          <w:sz w:val="24"/>
-          <w:szCs w:val="24"/>
-          <w:lang w:eastAsia="en-AE"/>
-          <w14:ligatures w14:val="none"/>
-        </w:rPr>
-        <w:t xml:space="preserve"> </w:t>
-      </w:r>
-    </w:p>
-    <w:p>
-      <w:pPr>
-        <w:spacing w:after="0" w:line="240" w:lineRule="auto"/>
-        <w:rPr>
-          <w:rFonts w:ascii="Times New Roman" w:eastAsia="Times New Roman" w:hAnsi="Times New Roman" w:cs="Times New Roman"/>
-          <w:kern w:val="0"/>
-          <w:sz w:val="24"/>
-          <w:szCs w:val="24"/>
-          <w:lang w:eastAsia="en-AE"/>
-          <w14:ligatures w14:val="none"/>
-        </w:rPr>
-      </w:pPr>
-      <w:r>
-        <w:rPr>
-          <w:rFonts w:ascii="Times New Roman" w:eastAsia="Times New Roman" w:hAnsi="Times New Roman" w:cs="Times New Roman"/>
-          <w:b/>
-          <w:bCs/>
-          <w:kern w:val="0"/>
-          <w:sz w:val="24"/>
-          <w:szCs w:val="24"/>
-          <w:lang w:eastAsia="en-AE"/>
-          <w14:ligatures w14:val="none"/>
-        </w:rPr>
-        <w:t xml:space="preserve">             </w:t>
-      </w:r>
-      <w:r>
-        <w:rPr>
-          <w:rFonts w:ascii="Times New Roman" w:eastAsia="Times New Roman" w:hAnsi="Times New Roman" w:cs="Times New Roman"/>
-          <w:b/>
-          <w:bCs/>
-          <w:kern w:val="0"/>
-          <w:sz w:val="24"/>
-          <w:szCs w:val="24"/>
-          <w:lang w:eastAsia="en-AE"/>
-          <w14:ligatures w14:val="none"/>
-        </w:rPr>
-        <w:t>From where:</w:t>
-      </w:r>
-      <w:r>
-        <w:rPr>
-          <w:rFonts w:ascii="Times New Roman" w:eastAsia="Times New Roman" w:hAnsi="Times New Roman" w:cs="Times New Roman"/>
-          <w:kern w:val="0"/>
-          <w:sz w:val="24"/>
-          <w:szCs w:val="24"/>
-          <w:lang w:eastAsia="en-AE"/>
-          <w14:ligatures w14:val="none"/>
-        </w:rPr>
-        <w:t xml:space="preserve"> </w:t>
-      </w:r>
-      <w:r>
-        <w:rPr>
-          <w:rFonts w:ascii="Courier New" w:eastAsia="Times New Roman" w:hAnsi="Courier New" w:cs="Courier New"/>
-          <w:kern w:val="0"/>
-          <w:sz w:val="20"/>
-          <w:szCs w:val="20"/>
-          <w:lang w:eastAsia="en-AE"/>
-          <w14:ligatures w14:val="none"/>
-        </w:rPr>
-        <w:t>$JAVA_HOME/</w:t>
-      </w:r>
-      <w:proofErr w:type="spellStart"/>
-      <w:r>
-        <w:rPr>
-          <w:rFonts w:ascii="Courier New" w:eastAsia="Times New Roman" w:hAnsi="Courier New" w:cs="Courier New"/>
-          <w:kern w:val="0"/>
-          <w:sz w:val="20"/>
-          <w:szCs w:val="20"/>
-          <w:lang w:eastAsia="en-AE"/>
-          <w14:ligatures w14:val="none"/>
-        </w:rPr>
-        <w:t>jre</w:t>
-      </w:r>
-      <w:proofErr w:type="spellEnd"/>
-      <w:r>
-        <w:rPr>
-          <w:rFonts w:ascii="Courier New" w:eastAsia="Times New Roman" w:hAnsi="Courier New" w:cs="Courier New"/>
-          <w:kern w:val="0"/>
-          <w:sz w:val="20"/>
-          <w:szCs w:val="20"/>
-          <w:lang w:eastAsia="en-AE"/>
-          <w14:ligatures w14:val="none"/>
-        </w:rPr>
-        <w:t>/lib</w:t>
-      </w:r>
-      <w:r>
-        <w:rPr>
-          <w:rFonts w:ascii="Times New Roman" w:eastAsia="Times New Roman" w:hAnsi="Times New Roman" w:cs="Times New Roman"/>
-          <w:kern w:val="0"/>
-          <w:sz w:val="24"/>
-          <w:szCs w:val="24"/>
-          <w:lang w:eastAsia="en-AE"/>
-          <w14:ligatures w14:val="none"/>
-        </w:rPr>
-        <w:t xml:space="preserve"> (or </w:t>
-      </w:r>
-      <w:r>
-        <w:rPr>
-          <w:rFonts w:ascii="Courier New" w:eastAsia="Times New Roman" w:hAnsi="Courier New" w:cs="Courier New"/>
-          <w:kern w:val="0"/>
-          <w:sz w:val="20"/>
-          <w:szCs w:val="20"/>
+          <w:sz w:val="24"/>
+          <w:szCs w:val="24"/>
           <w:lang w:eastAsia="en-AE"/>
           <w14:ligatures w14:val="none"/>
         </w:rPr>
@@ -1431,11 +1913,17 @@
           <w:ilvl w:val="0"/>
           <w:numId w:val="3"/>
         </w:numPr>
-      </w:pPr>
-      <w:r>
-        <w:rPr>
-          <w:b/>
-          <w:bCs/>
+        <w:rPr>
+          <w:sz w:val="24"/>
+          <w:szCs w:val="24"/>
+        </w:rPr>
+      </w:pPr>
+      <w:r>
+        <w:rPr>
+          <w:b/>
+          <w:bCs/>
+          <w:sz w:val="24"/>
+          <w:szCs w:val="24"/>
         </w:rPr>
         <w:t>Extension class loader</w:t>
       </w:r>
@@ -1443,71 +1931,123 @@
         <w:rPr>
           <w:b/>
           <w:bCs/>
+          <w:sz w:val="24"/>
+          <w:szCs w:val="24"/>
         </w:rPr>
         <w:t xml:space="preserve">: </w:t>
       </w:r>
       <w:r>
+        <w:rPr>
+          <w:sz w:val="24"/>
+          <w:szCs w:val="24"/>
+        </w:rPr>
         <w:t>loads classes that extend core Java functionality from the extension library directory.</w:t>
       </w:r>
     </w:p>
     <w:p>
       <w:pPr>
         <w:pStyle w:val="ListParagraph"/>
-      </w:pPr>
-      <w:r>
-        <w:rPr>
-          <w:b/>
-          <w:bCs/>
+        <w:rPr>
+          <w:sz w:val="24"/>
+          <w:szCs w:val="24"/>
+        </w:rPr>
+      </w:pPr>
+      <w:r>
+        <w:rPr>
+          <w:b/>
+          <w:bCs/>
+          <w:sz w:val="24"/>
+          <w:szCs w:val="24"/>
         </w:rPr>
         <w:t>Type:</w:t>
       </w:r>
       <w:r>
+        <w:rPr>
+          <w:sz w:val="24"/>
+          <w:szCs w:val="24"/>
+        </w:rPr>
         <w:t xml:space="preserve"> Java-based class loader</w:t>
       </w:r>
     </w:p>
     <w:p>
       <w:pPr>
         <w:pStyle w:val="ListParagraph"/>
-      </w:pPr>
-      <w:r>
-        <w:rPr>
-          <w:b/>
-          <w:bCs/>
+        <w:rPr>
+          <w:sz w:val="24"/>
+          <w:szCs w:val="24"/>
+        </w:rPr>
+      </w:pPr>
+      <w:r>
+        <w:rPr>
+          <w:b/>
+          <w:bCs/>
+          <w:sz w:val="24"/>
+          <w:szCs w:val="24"/>
         </w:rPr>
         <w:t>Loads:</w:t>
       </w:r>
       <w:r>
+        <w:rPr>
+          <w:sz w:val="24"/>
+          <w:szCs w:val="24"/>
+        </w:rPr>
         <w:t xml:space="preserve"> Extension classes (non-core Java libraries)</w:t>
       </w:r>
     </w:p>
     <w:p>
       <w:pPr>
         <w:pStyle w:val="ListParagraph"/>
-      </w:pPr>
-      <w:r>
-        <w:rPr>
-          <w:b/>
-          <w:bCs/>
+        <w:rPr>
+          <w:sz w:val="24"/>
+          <w:szCs w:val="24"/>
+        </w:rPr>
+      </w:pPr>
+      <w:r>
+        <w:rPr>
+          <w:b/>
+          <w:bCs/>
+          <w:sz w:val="24"/>
+          <w:szCs w:val="24"/>
         </w:rPr>
         <w:t>From where:</w:t>
       </w:r>
       <w:r>
+        <w:rPr>
+          <w:sz w:val="24"/>
+          <w:szCs w:val="24"/>
+        </w:rPr>
         <w:t xml:space="preserve"> $JAVA_HOME/</w:t>
       </w:r>
       <w:proofErr w:type="spellStart"/>
       <w:r>
+        <w:rPr>
+          <w:sz w:val="24"/>
+          <w:szCs w:val="24"/>
+        </w:rPr>
         <w:t>jre</w:t>
       </w:r>
       <w:proofErr w:type="spellEnd"/>
       <w:r>
+        <w:rPr>
+          <w:sz w:val="24"/>
+          <w:szCs w:val="24"/>
+        </w:rPr>
         <w:t>/lib/</w:t>
       </w:r>
       <w:proofErr w:type="spellStart"/>
       <w:r>
+        <w:rPr>
+          <w:sz w:val="24"/>
+          <w:szCs w:val="24"/>
+        </w:rPr>
         <w:t>ext</w:t>
       </w:r>
       <w:proofErr w:type="spellEnd"/>
       <w:r>
+        <w:rPr>
+          <w:sz w:val="24"/>
+          <w:szCs w:val="24"/>
+        </w:rPr>
         <w:t xml:space="preserve"> (or platform modules in Java 9+)</w:t>
       </w:r>
     </w:p>
@@ -1517,6 +2057,8 @@
         <w:rPr>
           <w:b/>
           <w:bCs/>
+          <w:sz w:val="24"/>
+          <w:szCs w:val="24"/>
         </w:rPr>
       </w:pPr>
     </w:p>
@@ -1527,11 +2069,17 @@
           <w:ilvl w:val="0"/>
           <w:numId w:val="3"/>
         </w:numPr>
-      </w:pPr>
-      <w:r>
-        <w:rPr>
-          <w:b/>
-          <w:bCs/>
+        <w:rPr>
+          <w:sz w:val="24"/>
+          <w:szCs w:val="24"/>
+        </w:rPr>
+      </w:pPr>
+      <w:r>
+        <w:rPr>
+          <w:b/>
+          <w:bCs/>
+          <w:sz w:val="24"/>
+          <w:szCs w:val="24"/>
         </w:rPr>
         <w:t>Application class loader</w:t>
       </w:r>
@@ -1539,197 +2087,1715 @@
         <w:rPr>
           <w:b/>
           <w:bCs/>
+          <w:sz w:val="24"/>
+          <w:szCs w:val="24"/>
         </w:rPr>
         <w:t>:</w:t>
       </w:r>
       <w:r>
+        <w:rPr>
+          <w:sz w:val="24"/>
+          <w:szCs w:val="24"/>
+        </w:rPr>
+        <w:t xml:space="preserve"> loads classes from the application </w:t>
+      </w:r>
+      <w:proofErr w:type="spellStart"/>
+      <w:r>
+        <w:rPr>
+          <w:sz w:val="24"/>
+          <w:szCs w:val="24"/>
+        </w:rPr>
+        <w:t>classpath</w:t>
+      </w:r>
+      <w:proofErr w:type="spellEnd"/>
+      <w:r>
+        <w:rPr>
+          <w:sz w:val="24"/>
+          <w:szCs w:val="24"/>
+        </w:rPr>
+        <w:t>, including user-defined classes.</w:t>
+      </w:r>
+      <w:r>
+        <w:rPr>
+          <w:sz w:val="24"/>
+          <w:szCs w:val="24"/>
+        </w:rPr>
         <w:t xml:space="preserve"> </w:t>
       </w:r>
-      <w:r>
-        <w:t xml:space="preserve">loads classes from the application </w:t>
+    </w:p>
+    <w:p>
+      <w:pPr>
+        <w:pStyle w:val="ListParagraph"/>
+        <w:rPr>
+          <w:sz w:val="24"/>
+          <w:szCs w:val="24"/>
+        </w:rPr>
+      </w:pPr>
+      <w:r>
+        <w:rPr>
+          <w:b/>
+          <w:bCs/>
+          <w:sz w:val="24"/>
+          <w:szCs w:val="24"/>
+        </w:rPr>
+        <w:t>Type:</w:t>
+      </w:r>
+      <w:r>
+        <w:rPr>
+          <w:sz w:val="24"/>
+          <w:szCs w:val="24"/>
+        </w:rPr>
+        <w:t xml:space="preserve"> Java-based class loader</w:t>
+      </w:r>
+    </w:p>
+    <w:p>
+      <w:pPr>
+        <w:pStyle w:val="ListParagraph"/>
+        <w:rPr>
+          <w:sz w:val="24"/>
+          <w:szCs w:val="24"/>
+        </w:rPr>
+      </w:pPr>
+      <w:r>
+        <w:rPr>
+          <w:b/>
+          <w:bCs/>
+          <w:sz w:val="24"/>
+          <w:szCs w:val="24"/>
+        </w:rPr>
+        <w:t>Loads:</w:t>
+      </w:r>
+      <w:r>
+        <w:rPr>
+          <w:sz w:val="24"/>
+          <w:szCs w:val="24"/>
+        </w:rPr>
+        <w:t xml:space="preserve"> Application-specific classes written by the developer</w:t>
+      </w:r>
+    </w:p>
+    <w:p>
+      <w:pPr>
+        <w:pStyle w:val="ListParagraph"/>
+        <w:rPr>
+          <w:sz w:val="24"/>
+          <w:szCs w:val="24"/>
+        </w:rPr>
+      </w:pPr>
+      <w:r>
+        <w:rPr>
+          <w:b/>
+          <w:bCs/>
+          <w:sz w:val="24"/>
+          <w:szCs w:val="24"/>
+        </w:rPr>
+        <w:t>From where:</w:t>
+      </w:r>
+      <w:r>
+        <w:rPr>
+          <w:sz w:val="24"/>
+          <w:szCs w:val="24"/>
+        </w:rPr>
+        <w:t xml:space="preserve"> </w:t>
       </w:r>
       <w:proofErr w:type="spellStart"/>
       <w:r>
+        <w:rPr>
+          <w:sz w:val="24"/>
+          <w:szCs w:val="24"/>
+        </w:rPr>
+        <w:t>Classpath</w:t>
+      </w:r>
+      <w:proofErr w:type="spellEnd"/>
+      <w:r>
+        <w:rPr>
+          <w:sz w:val="24"/>
+          <w:szCs w:val="24"/>
+        </w:rPr>
+        <w:t xml:space="preserve"> (-</w:t>
+      </w:r>
+      <w:proofErr w:type="spellStart"/>
+      <w:r>
+        <w:rPr>
+          <w:sz w:val="24"/>
+          <w:szCs w:val="24"/>
+        </w:rPr>
         <w:t>classpath</w:t>
       </w:r>
       <w:proofErr w:type="spellEnd"/>
       <w:r>
-        <w:t>, including user-defined classes.</w:t>
-      </w:r>
-      <w:r>
+        <w:rPr>
+          <w:sz w:val="24"/>
+          <w:szCs w:val="24"/>
+        </w:rPr>
+        <w:t xml:space="preserve"> or CLASSPATH environment variable)</w:t>
+      </w:r>
+    </w:p>
+    <w:p>
+      <w:pPr>
+        <w:pStyle w:val="ListParagraph"/>
+        <w:rPr>
+          <w:sz w:val="24"/>
+          <w:szCs w:val="24"/>
+        </w:rPr>
+      </w:pPr>
+    </w:p>
+    <w:p>
+      <w:pPr>
+        <w:pStyle w:val="ListParagraph"/>
+        <w:rPr>
+          <w:sz w:val="24"/>
+          <w:szCs w:val="24"/>
+        </w:rPr>
+      </w:pPr>
+    </w:p>
+    <w:p>
+      <w:pPr>
+        <w:pStyle w:val="ListParagraph"/>
+        <w:rPr>
+          <w:sz w:val="24"/>
+          <w:szCs w:val="24"/>
+        </w:rPr>
+      </w:pPr>
+    </w:p>
+    <w:p>
+      <w:pPr>
+        <w:pStyle w:val="ListParagraph"/>
+        <w:rPr>
+          <w:sz w:val="24"/>
+          <w:szCs w:val="24"/>
+        </w:rPr>
+      </w:pPr>
+    </w:p>
+    <w:p>
+      <w:pPr>
+        <w:pStyle w:val="ListParagraph"/>
+        <w:rPr>
+          <w:sz w:val="24"/>
+          <w:szCs w:val="24"/>
+        </w:rPr>
+      </w:pPr>
+    </w:p>
+    <w:p>
+      <w:pPr>
+        <w:pStyle w:val="ListParagraph"/>
+        <w:rPr>
+          <w:sz w:val="24"/>
+          <w:szCs w:val="24"/>
+        </w:rPr>
+      </w:pPr>
+    </w:p>
+    <w:p>
+      <w:pPr>
+        <w:pStyle w:val="ListParagraph"/>
+        <w:rPr>
+          <w:sz w:val="24"/>
+          <w:szCs w:val="24"/>
+        </w:rPr>
+      </w:pPr>
+    </w:p>
+    <w:p>
+      <w:pPr>
+        <w:pStyle w:val="ListParagraph"/>
+        <w:rPr>
+          <w:sz w:val="24"/>
+          <w:szCs w:val="24"/>
+        </w:rPr>
+      </w:pPr>
+    </w:p>
+    <w:p>
+      <w:pPr>
+        <w:pStyle w:val="ListParagraph"/>
+        <w:rPr>
+          <w:sz w:val="24"/>
+          <w:szCs w:val="24"/>
+        </w:rPr>
+      </w:pPr>
+    </w:p>
+    <w:p>
+      <w:pPr>
+        <w:pStyle w:val="ListParagraph"/>
+        <w:rPr>
+          <w:sz w:val="24"/>
+          <w:szCs w:val="24"/>
+        </w:rPr>
+      </w:pPr>
+    </w:p>
+    <w:p>
+      <w:pPr>
+        <w:pStyle w:val="ListParagraph"/>
+        <w:rPr>
+          <w:b/>
+          <w:bCs/>
+          <w:sz w:val="24"/>
+          <w:szCs w:val="24"/>
+          <w:u w:val="single"/>
+        </w:rPr>
+      </w:pPr>
+      <w:r>
+        <w:rPr>
+          <w:b/>
+          <w:bCs/>
+          <w:sz w:val="24"/>
+          <w:szCs w:val="24"/>
+          <w:u w:val="single"/>
+        </w:rPr>
+        <w:t>How java class loaders work?</w:t>
+      </w:r>
+    </w:p>
+    <w:p>
+      <w:pPr>
+        <w:pStyle w:val="ListParagraph"/>
+        <w:rPr>
+          <w:sz w:val="24"/>
+          <w:szCs w:val="24"/>
+        </w:rPr>
+      </w:pPr>
+      <w:r>
+        <w:rPr>
+          <w:sz w:val="24"/>
+          <w:szCs w:val="24"/>
+        </w:rPr>
+        <w:t xml:space="preserve">Java class loaders use the </w:t>
+      </w:r>
+      <w:r>
+        <w:rPr>
+          <w:b/>
+          <w:bCs/>
+          <w:sz w:val="24"/>
+          <w:szCs w:val="24"/>
+        </w:rPr>
+        <w:t>Parent Delegation Hierarchy Algorithm</w:t>
+      </w:r>
+      <w:r>
+        <w:rPr>
+          <w:sz w:val="24"/>
+          <w:szCs w:val="24"/>
+        </w:rPr>
+        <w:t xml:space="preserve"> to load classes efficiently and securely. When a class is requested, the </w:t>
+      </w:r>
+      <w:r>
+        <w:rPr>
+          <w:b/>
+          <w:bCs/>
+          <w:sz w:val="24"/>
+          <w:szCs w:val="24"/>
+        </w:rPr>
+        <w:t>Application Class Loader</w:t>
+      </w:r>
+      <w:r>
+        <w:rPr>
+          <w:sz w:val="24"/>
+          <w:szCs w:val="24"/>
+        </w:rPr>
+        <w:t xml:space="preserve"> first delegates the request to the </w:t>
+      </w:r>
+      <w:r>
+        <w:rPr>
+          <w:b/>
+          <w:bCs/>
+          <w:sz w:val="24"/>
+          <w:szCs w:val="24"/>
+        </w:rPr>
+        <w:t>Platform Class Loader</w:t>
+      </w:r>
+      <w:r>
+        <w:rPr>
+          <w:b/>
+          <w:bCs/>
+          <w:sz w:val="24"/>
+          <w:szCs w:val="24"/>
+        </w:rPr>
         <w:t xml:space="preserve"> </w:t>
       </w:r>
-    </w:p>
-    <w:p>
-      <w:pPr>
-        <w:pStyle w:val="ListParagraph"/>
-      </w:pPr>
-      <w:r>
-        <w:rPr>
-          <w:b/>
-          <w:bCs/>
-        </w:rPr>
-        <w:t>Type:</w:t>
-      </w:r>
-      <w:r>
-        <w:t xml:space="preserve"> Java-based class loader</w:t>
-      </w:r>
-    </w:p>
-    <w:p>
-      <w:pPr>
-        <w:pStyle w:val="ListParagraph"/>
-      </w:pPr>
-      <w:r>
-        <w:rPr>
-          <w:b/>
-          <w:bCs/>
-        </w:rPr>
-        <w:t>Loads:</w:t>
-      </w:r>
-      <w:r>
-        <w:t xml:space="preserve"> Application-specific classes written by the developer</w:t>
-      </w:r>
-    </w:p>
-    <w:p>
-      <w:pPr>
-        <w:pStyle w:val="ListParagraph"/>
-      </w:pPr>
-      <w:r>
-        <w:rPr>
-          <w:b/>
-          <w:bCs/>
-        </w:rPr>
-        <w:t>From where:</w:t>
-      </w:r>
-      <w:r>
+      <w:r>
+        <w:rPr>
+          <w:b/>
+          <w:bCs/>
+          <w:sz w:val="24"/>
+          <w:szCs w:val="24"/>
+        </w:rPr>
+        <w:t>(Extension)</w:t>
+      </w:r>
+      <w:r>
+        <w:rPr>
+          <w:sz w:val="24"/>
+          <w:szCs w:val="24"/>
+        </w:rPr>
+        <w:t xml:space="preserve">, which then delegates it to the </w:t>
+      </w:r>
+      <w:r>
+        <w:rPr>
+          <w:b/>
+          <w:bCs/>
+          <w:sz w:val="24"/>
+          <w:szCs w:val="24"/>
+        </w:rPr>
+        <w:t>Bootstrap Class Loader</w:t>
+      </w:r>
+      <w:r>
+        <w:rPr>
+          <w:sz w:val="24"/>
+          <w:szCs w:val="24"/>
+        </w:rPr>
+        <w:t xml:space="preserve">. The Bootstrap Class Loader attempts to load the class first. If it cannot find the class, the request is passed back to the Platform Class Loader, and finally to the Application Class Loader. If none of the class loaders can locate the class, the JVM throws a </w:t>
+      </w:r>
+      <w:proofErr w:type="spellStart"/>
+      <w:r>
+        <w:rPr>
+          <w:b/>
+          <w:bCs/>
+          <w:sz w:val="24"/>
+          <w:szCs w:val="24"/>
+        </w:rPr>
+        <w:t>ClassNotFoundException</w:t>
+      </w:r>
+      <w:proofErr w:type="spellEnd"/>
+      <w:r>
+        <w:rPr>
+          <w:sz w:val="24"/>
+          <w:szCs w:val="24"/>
+        </w:rPr>
+        <w:t>. This delegation model prevents duplicate class loading, ensures that core Java classes are loaded by the trusted Bootstrap Class Loader, and improves the security and consistency of the JVM.</w:t>
+      </w:r>
+    </w:p>
+    <w:p>
+      <w:pPr>
+        <w:pStyle w:val="ListParagraph"/>
+        <w:rPr>
+          <w:b/>
+          <w:bCs/>
+          <w:sz w:val="24"/>
+          <w:szCs w:val="24"/>
+          <w:u w:val="single"/>
+        </w:rPr>
+      </w:pPr>
+    </w:p>
+    <w:p>
+      <w:pPr>
+        <w:pStyle w:val="ListParagraph"/>
+        <w:ind w:left="0"/>
+        <w:jc w:val="center"/>
+        <w:rPr>
+          <w:sz w:val="24"/>
+          <w:szCs w:val="24"/>
+        </w:rPr>
+      </w:pPr>
+      <w:r>
+        <w:rPr>
+          <w:noProof/>
+          <w:sz w:val="24"/>
+          <w:szCs w:val="24"/>
+        </w:rPr>
+        <w:drawing>
+          <wp:inline distT="0" distB="0" distL="0" distR="0" wp14:anchorId="4BFF38F6" wp14:editId="188EEB2B">
+            <wp:extent cx="6390640" cy="2343150"/>
+            <wp:effectExtent l="0" t="0" r="0" b="0"/>
+            <wp:docPr id="914654247" name="Picture 1"/>
+            <wp:cNvGraphicFramePr>
+              <a:graphicFrameLocks xmlns:a="http://schemas.openxmlformats.org/drawingml/2006/main" noChangeAspect="1"/>
+            </wp:cNvGraphicFramePr>
+            <a:graphic xmlns:a="http://schemas.openxmlformats.org/drawingml/2006/main">
+              <a:graphicData uri="http://schemas.openxmlformats.org/drawingml/2006/picture">
+                <pic:pic xmlns:pic="http://schemas.openxmlformats.org/drawingml/2006/picture">
+                  <pic:nvPicPr>
+                    <pic:cNvPr id="914654247" name=""/>
+                    <pic:cNvPicPr/>
+                  </pic:nvPicPr>
+                  <pic:blipFill>
+                    <a:blip r:embed="rId12"/>
+                    <a:stretch>
+                      <a:fillRect/>
+                    </a:stretch>
+                  </pic:blipFill>
+                  <pic:spPr>
+                    <a:xfrm>
+                      <a:off x="0" y="0"/>
+                      <a:ext cx="6390640" cy="2343150"/>
+                    </a:xfrm>
+                    <a:prstGeom prst="rect">
+                      <a:avLst/>
+                    </a:prstGeom>
+                  </pic:spPr>
+                </pic:pic>
+              </a:graphicData>
+            </a:graphic>
+          </wp:inline>
+        </w:drawing>
+      </w:r>
+    </w:p>
+    <w:p>
+      <w:pPr>
+        <w:pStyle w:val="ListParagraph"/>
+        <w:jc w:val="center"/>
+        <w:rPr>
+          <w:sz w:val="24"/>
+          <w:szCs w:val="24"/>
+          <w:lang w:val="en-US"/>
+        </w:rPr>
+      </w:pPr>
+    </w:p>
+    <w:p>
+      <w:pPr>
+        <w:rPr>
+          <w:sz w:val="24"/>
+          <w:szCs w:val="24"/>
+        </w:rPr>
+      </w:pPr>
+      <w:r>
+        <w:rPr>
+          <w:b/>
+          <w:bCs/>
+          <w:sz w:val="24"/>
+          <w:szCs w:val="24"/>
+        </w:rPr>
+        <w:t>Runtime Data Area:</w:t>
+      </w:r>
+      <w:r>
+        <w:rPr>
+          <w:sz w:val="24"/>
+          <w:szCs w:val="24"/>
+        </w:rPr>
+        <w:t xml:space="preserve"> the memory area used by JVM during program execution</w:t>
+      </w:r>
+      <w:r>
+        <w:rPr>
+          <w:sz w:val="24"/>
+          <w:szCs w:val="24"/>
+        </w:rPr>
+        <w:t xml:space="preserve"> &amp; represent the storage for class file to be executed</w:t>
+      </w:r>
+      <w:r>
+        <w:rPr>
+          <w:sz w:val="24"/>
+          <w:szCs w:val="24"/>
+        </w:rPr>
+        <w:t>.</w:t>
+      </w:r>
+    </w:p>
+    <w:p>
+      <w:pPr>
+        <w:rPr>
+          <w:b/>
+          <w:bCs/>
+          <w:sz w:val="24"/>
+          <w:szCs w:val="24"/>
+        </w:rPr>
+      </w:pPr>
+      <w:r>
+        <w:rPr>
+          <w:b/>
+          <w:bCs/>
+          <w:sz w:val="24"/>
+          <w:szCs w:val="24"/>
+        </w:rPr>
+        <w:t>Method Area</w:t>
+      </w:r>
+    </w:p>
+    <w:p>
+      <w:pPr>
+        <w:rPr>
+          <w:sz w:val="24"/>
+          <w:szCs w:val="24"/>
+        </w:rPr>
+      </w:pPr>
+      <w:r>
+        <w:rPr>
+          <w:sz w:val="24"/>
+          <w:szCs w:val="24"/>
+        </w:rPr>
+        <w:t xml:space="preserve">The </w:t>
+      </w:r>
+      <w:r>
+        <w:rPr>
+          <w:b/>
+          <w:bCs/>
+          <w:sz w:val="24"/>
+          <w:szCs w:val="24"/>
+        </w:rPr>
+        <w:t>Method Area</w:t>
+      </w:r>
+      <w:r>
+        <w:rPr>
+          <w:sz w:val="24"/>
+          <w:szCs w:val="24"/>
+        </w:rPr>
+        <w:t xml:space="preserve"> is a shared memory area of the JVM that stores </w:t>
+      </w:r>
+      <w:r>
+        <w:rPr>
+          <w:b/>
+          <w:bCs/>
+          <w:sz w:val="24"/>
+          <w:szCs w:val="24"/>
+        </w:rPr>
+        <w:t>class-level information</w:t>
+      </w:r>
+      <w:r>
+        <w:rPr>
+          <w:sz w:val="24"/>
+          <w:szCs w:val="24"/>
+        </w:rPr>
+        <w:t>, such as class metadata, method bytecode, static variables, and the runtime constant pool. It is shared among all threads.</w:t>
+      </w:r>
+    </w:p>
+    <w:p>
+      <w:pPr>
+        <w:rPr>
+          <w:sz w:val="24"/>
+          <w:szCs w:val="24"/>
+        </w:rPr>
+      </w:pPr>
+    </w:p>
+    <w:p>
+      <w:pPr>
+        <w:rPr>
+          <w:b/>
+          <w:bCs/>
+          <w:sz w:val="24"/>
+          <w:szCs w:val="24"/>
+        </w:rPr>
+      </w:pPr>
+      <w:r>
+        <w:rPr>
+          <w:b/>
+          <w:bCs/>
+          <w:sz w:val="24"/>
+          <w:szCs w:val="24"/>
+        </w:rPr>
+        <w:t>Heap Area</w:t>
+      </w:r>
+    </w:p>
+    <w:p>
+      <w:pPr>
+        <w:rPr>
+          <w:sz w:val="24"/>
+          <w:szCs w:val="24"/>
+        </w:rPr>
+      </w:pPr>
+      <w:r>
+        <w:rPr>
+          <w:sz w:val="24"/>
+          <w:szCs w:val="24"/>
+        </w:rPr>
+        <w:t xml:space="preserve">The </w:t>
+      </w:r>
+      <w:r>
+        <w:rPr>
+          <w:b/>
+          <w:bCs/>
+          <w:sz w:val="24"/>
+          <w:szCs w:val="24"/>
+        </w:rPr>
+        <w:t>Heap Area</w:t>
+      </w:r>
+      <w:r>
+        <w:rPr>
+          <w:sz w:val="24"/>
+          <w:szCs w:val="24"/>
+        </w:rPr>
+        <w:t xml:space="preserve"> is the runtime memory where </w:t>
+      </w:r>
+      <w:r>
+        <w:rPr>
+          <w:b/>
+          <w:bCs/>
+          <w:sz w:val="24"/>
+          <w:szCs w:val="24"/>
+        </w:rPr>
+        <w:t>objects and instance variables</w:t>
+      </w:r>
+      <w:r>
+        <w:rPr>
+          <w:sz w:val="24"/>
+          <w:szCs w:val="24"/>
+        </w:rPr>
+        <w:t xml:space="preserve"> are allocated. It is shared by all threads and is managed by the JVM's </w:t>
+      </w:r>
+      <w:r>
+        <w:rPr>
+          <w:b/>
+          <w:bCs/>
+          <w:sz w:val="24"/>
+          <w:szCs w:val="24"/>
+        </w:rPr>
+        <w:t>Garbage Collector</w:t>
+      </w:r>
+      <w:r>
+        <w:rPr>
+          <w:sz w:val="24"/>
+          <w:szCs w:val="24"/>
+        </w:rPr>
+        <w:t>, which automatically frees unused objects.</w:t>
+      </w:r>
+    </w:p>
+    <w:p>
+      <w:pPr>
+        <w:rPr>
+          <w:sz w:val="24"/>
+          <w:szCs w:val="24"/>
+        </w:rPr>
+      </w:pPr>
+    </w:p>
+    <w:p>
+      <w:pPr>
+        <w:rPr>
+          <w:b/>
+          <w:bCs/>
+          <w:sz w:val="24"/>
+          <w:szCs w:val="24"/>
+        </w:rPr>
+      </w:pPr>
+      <w:r>
+        <w:rPr>
+          <w:b/>
+          <w:bCs/>
+          <w:sz w:val="24"/>
+          <w:szCs w:val="24"/>
+        </w:rPr>
+        <w:t>Stack Area</w:t>
+      </w:r>
+    </w:p>
+    <w:p>
+      <w:pPr>
+        <w:rPr>
+          <w:sz w:val="24"/>
+          <w:szCs w:val="24"/>
+        </w:rPr>
+      </w:pPr>
+      <w:r>
+        <w:rPr>
+          <w:sz w:val="24"/>
+          <w:szCs w:val="24"/>
+        </w:rPr>
+        <w:t xml:space="preserve">The </w:t>
+      </w:r>
+      <w:r>
+        <w:rPr>
+          <w:b/>
+          <w:bCs/>
+          <w:sz w:val="24"/>
+          <w:szCs w:val="24"/>
+        </w:rPr>
+        <w:t>Stack Area</w:t>
+      </w:r>
+      <w:r>
+        <w:rPr>
+          <w:sz w:val="24"/>
+          <w:szCs w:val="24"/>
+        </w:rPr>
+        <w:t xml:space="preserve"> is a memory area where each thread has its own stack to store </w:t>
+      </w:r>
+      <w:r>
+        <w:rPr>
+          <w:b/>
+          <w:bCs/>
+          <w:sz w:val="24"/>
+          <w:szCs w:val="24"/>
+        </w:rPr>
+        <w:t>method call information</w:t>
+      </w:r>
+      <w:r>
+        <w:rPr>
+          <w:sz w:val="24"/>
+          <w:szCs w:val="24"/>
+        </w:rPr>
+        <w:t>, including local variables, method parameters, return addresses, and intermediate results. Each method call creates a new stack frame, which is removed when the method finishes execution.</w:t>
+      </w:r>
+    </w:p>
+    <w:p>
+      <w:pPr>
+        <w:rPr>
+          <w:sz w:val="24"/>
+          <w:szCs w:val="24"/>
+        </w:rPr>
+      </w:pPr>
+    </w:p>
+    <w:p>
+      <w:pPr>
+        <w:rPr>
+          <w:b/>
+          <w:bCs/>
+          <w:sz w:val="24"/>
+          <w:szCs w:val="24"/>
+        </w:rPr>
+      </w:pPr>
+      <w:r>
+        <w:rPr>
+          <w:b/>
+          <w:bCs/>
+          <w:sz w:val="24"/>
+          <w:szCs w:val="24"/>
+        </w:rPr>
+        <w:lastRenderedPageBreak/>
+        <w:t>Program Counter (PC) Register</w:t>
+      </w:r>
+    </w:p>
+    <w:p>
+      <w:pPr>
+        <w:rPr>
+          <w:sz w:val="24"/>
+          <w:szCs w:val="24"/>
+        </w:rPr>
+      </w:pPr>
+      <w:r>
+        <w:rPr>
+          <w:sz w:val="24"/>
+          <w:szCs w:val="24"/>
+        </w:rPr>
+        <w:t xml:space="preserve">The </w:t>
+      </w:r>
+      <w:r>
+        <w:rPr>
+          <w:b/>
+          <w:bCs/>
+          <w:sz w:val="24"/>
+          <w:szCs w:val="24"/>
+        </w:rPr>
+        <w:t>Program Counter (PC) Register</w:t>
+      </w:r>
+      <w:r>
+        <w:rPr>
+          <w:sz w:val="24"/>
+          <w:szCs w:val="24"/>
+        </w:rPr>
+        <w:t xml:space="preserve"> is a small memory area that stores the </w:t>
+      </w:r>
+      <w:r>
+        <w:rPr>
+          <w:b/>
+          <w:bCs/>
+          <w:sz w:val="24"/>
+          <w:szCs w:val="24"/>
+        </w:rPr>
+        <w:t>address of the current JVM instruction</w:t>
+      </w:r>
+      <w:r>
+        <w:rPr>
+          <w:sz w:val="24"/>
+          <w:szCs w:val="24"/>
+        </w:rPr>
+        <w:t xml:space="preserve"> being executed by a thread. Each thread has its own PC register, allowing multiple threads to execute independently.</w:t>
+      </w:r>
+    </w:p>
+    <w:p>
+      <w:pPr>
+        <w:rPr>
+          <w:sz w:val="24"/>
+          <w:szCs w:val="24"/>
+        </w:rPr>
+      </w:pPr>
+    </w:p>
+    <w:p>
+      <w:pPr>
+        <w:rPr>
+          <w:b/>
+          <w:bCs/>
+          <w:sz w:val="24"/>
+          <w:szCs w:val="24"/>
+        </w:rPr>
+      </w:pPr>
+      <w:r>
+        <w:rPr>
+          <w:b/>
+          <w:bCs/>
+          <w:sz w:val="24"/>
+          <w:szCs w:val="24"/>
+        </w:rPr>
+        <w:t>Native Method Stack (Native Method Area)</w:t>
+      </w:r>
+    </w:p>
+    <w:p>
+      <w:pPr>
+        <w:rPr>
+          <w:sz w:val="24"/>
+          <w:szCs w:val="24"/>
+        </w:rPr>
+      </w:pPr>
+      <w:r>
+        <w:rPr>
+          <w:sz w:val="24"/>
+          <w:szCs w:val="24"/>
+        </w:rPr>
+        <w:t xml:space="preserve">The </w:t>
+      </w:r>
+      <w:r>
+        <w:rPr>
+          <w:b/>
+          <w:bCs/>
+          <w:sz w:val="24"/>
+          <w:szCs w:val="24"/>
+        </w:rPr>
+        <w:t>Native Method Stack</w:t>
+      </w:r>
+      <w:r>
+        <w:rPr>
+          <w:sz w:val="24"/>
+          <w:szCs w:val="24"/>
+        </w:rPr>
+        <w:t xml:space="preserve"> is a memory area used to support the execution of </w:t>
+      </w:r>
+      <w:r>
+        <w:rPr>
+          <w:b/>
+          <w:bCs/>
+          <w:sz w:val="24"/>
+          <w:szCs w:val="24"/>
+        </w:rPr>
+        <w:t>native methods</w:t>
+      </w:r>
+      <w:r>
+        <w:rPr>
+          <w:sz w:val="24"/>
+          <w:szCs w:val="24"/>
+        </w:rPr>
+        <w:t xml:space="preserve">, which are methods written in languages such as C or C++. It stores information related to native method calls and works together with the </w:t>
+      </w:r>
+      <w:r>
+        <w:rPr>
+          <w:b/>
+          <w:bCs/>
+          <w:sz w:val="24"/>
+          <w:szCs w:val="24"/>
+        </w:rPr>
+        <w:t>Native Method Interface (JNI)</w:t>
+      </w:r>
+      <w:r>
+        <w:rPr>
+          <w:sz w:val="24"/>
+          <w:szCs w:val="24"/>
+        </w:rPr>
+        <w:t xml:space="preserve"> to enable interaction between Java code and native libraries.</w:t>
+      </w:r>
+    </w:p>
+    <w:p>
+      <w:pPr>
+        <w:rPr>
+          <w:sz w:val="24"/>
+          <w:szCs w:val="24"/>
+        </w:rPr>
+      </w:pPr>
+      <w:r>
+        <w:rPr>
+          <w:b/>
+          <w:bCs/>
+          <w:sz w:val="24"/>
+          <w:szCs w:val="24"/>
+        </w:rPr>
+        <w:t>Execution Engine:</w:t>
+      </w:r>
+      <w:r>
+        <w:rPr>
+          <w:sz w:val="24"/>
+          <w:szCs w:val="24"/>
+        </w:rPr>
+        <w:t xml:space="preserve"> the part of JVM that executes</w:t>
+      </w:r>
+      <w:r>
+        <w:rPr>
+          <w:sz w:val="24"/>
+          <w:szCs w:val="24"/>
+        </w:rPr>
+        <w:t xml:space="preserve"> line-by-line</w:t>
+      </w:r>
+      <w:r>
+        <w:rPr>
+          <w:sz w:val="24"/>
+          <w:szCs w:val="24"/>
+        </w:rPr>
+        <w:t xml:space="preserve"> the bytecode after it is loaded.</w:t>
+      </w:r>
+    </w:p>
+    <w:p>
+      <w:pPr>
+        <w:rPr>
+          <w:b/>
+          <w:bCs/>
+          <w:sz w:val="24"/>
+          <w:szCs w:val="24"/>
+        </w:rPr>
+      </w:pPr>
+      <w:r>
+        <w:rPr>
+          <w:b/>
+          <w:bCs/>
+          <w:sz w:val="24"/>
+          <w:szCs w:val="24"/>
+        </w:rPr>
+        <w:t>Interpreter</w:t>
+      </w:r>
+    </w:p>
+    <w:p>
+      <w:pPr>
+        <w:rPr>
+          <w:sz w:val="24"/>
+          <w:szCs w:val="24"/>
+        </w:rPr>
+      </w:pPr>
+      <w:r>
+        <w:rPr>
+          <w:sz w:val="24"/>
+          <w:szCs w:val="24"/>
+        </w:rPr>
+        <w:t xml:space="preserve">The </w:t>
+      </w:r>
+      <w:r>
+        <w:rPr>
+          <w:b/>
+          <w:bCs/>
+          <w:sz w:val="24"/>
+          <w:szCs w:val="24"/>
+        </w:rPr>
+        <w:t>Interpreter</w:t>
+      </w:r>
+      <w:r>
+        <w:rPr>
+          <w:sz w:val="24"/>
+          <w:szCs w:val="24"/>
+        </w:rPr>
+        <w:t xml:space="preserve"> is a JVM component that executes Java bytecode </w:t>
+      </w:r>
+      <w:r>
+        <w:rPr>
+          <w:b/>
+          <w:bCs/>
+          <w:sz w:val="24"/>
+          <w:szCs w:val="24"/>
+        </w:rPr>
+        <w:t>line by line</w:t>
+      </w:r>
+      <w:r>
+        <w:rPr>
+          <w:sz w:val="24"/>
+          <w:szCs w:val="24"/>
+        </w:rPr>
+        <w:t>, converting each instruction into machine code during runtime. It provides quick startup but slower execution for repeated code.</w:t>
+      </w:r>
+    </w:p>
+    <w:p>
+      <w:pPr>
+        <w:rPr>
+          <w:sz w:val="24"/>
+          <w:szCs w:val="24"/>
+        </w:rPr>
+      </w:pPr>
+    </w:p>
+    <w:p>
+      <w:pPr>
+        <w:rPr>
+          <w:b/>
+          <w:bCs/>
+          <w:sz w:val="24"/>
+          <w:szCs w:val="24"/>
+        </w:rPr>
+      </w:pPr>
+      <w:r>
+        <w:rPr>
+          <w:b/>
+          <w:bCs/>
+          <w:sz w:val="24"/>
+          <w:szCs w:val="24"/>
+        </w:rPr>
+        <w:t>JIT (Just-In-Time) Compiler</w:t>
+      </w:r>
+    </w:p>
+    <w:p>
+      <w:pPr>
+        <w:rPr>
+          <w:sz w:val="24"/>
+          <w:szCs w:val="24"/>
+        </w:rPr>
+      </w:pPr>
+      <w:r>
+        <w:rPr>
+          <w:sz w:val="24"/>
+          <w:szCs w:val="24"/>
+        </w:rPr>
+        <w:t xml:space="preserve">The </w:t>
+      </w:r>
+      <w:r>
+        <w:rPr>
+          <w:b/>
+          <w:bCs/>
+          <w:sz w:val="24"/>
+          <w:szCs w:val="24"/>
+        </w:rPr>
+        <w:t>JIT Compiler</w:t>
+      </w:r>
+      <w:r>
+        <w:rPr>
+          <w:sz w:val="24"/>
+          <w:szCs w:val="24"/>
+        </w:rPr>
+        <w:t xml:space="preserve"> improves performance by converting </w:t>
+      </w:r>
+      <w:r>
+        <w:rPr>
+          <w:b/>
+          <w:bCs/>
+          <w:sz w:val="24"/>
+          <w:szCs w:val="24"/>
+        </w:rPr>
+        <w:t>frequently executed bytecode (hot spots)</w:t>
+      </w:r>
+      <w:r>
+        <w:rPr>
+          <w:sz w:val="24"/>
+          <w:szCs w:val="24"/>
+        </w:rPr>
+        <w:t xml:space="preserve"> into </w:t>
+      </w:r>
+      <w:r>
+        <w:rPr>
+          <w:b/>
+          <w:bCs/>
+          <w:sz w:val="24"/>
+          <w:szCs w:val="24"/>
+        </w:rPr>
+        <w:t>native machine code</w:t>
+      </w:r>
+      <w:r>
+        <w:rPr>
+          <w:sz w:val="24"/>
+          <w:szCs w:val="24"/>
+        </w:rPr>
+        <w:t>, so it can run faster without repeated interpretation.</w:t>
+      </w:r>
+    </w:p>
+    <w:p>
+      <w:pPr>
+        <w:rPr>
+          <w:sz w:val="24"/>
+          <w:szCs w:val="24"/>
+        </w:rPr>
+      </w:pPr>
+    </w:p>
+    <w:p>
+      <w:pPr>
+        <w:rPr>
+          <w:b/>
+          <w:bCs/>
+          <w:sz w:val="24"/>
+          <w:szCs w:val="24"/>
+        </w:rPr>
+      </w:pPr>
+      <w:r>
+        <w:rPr>
+          <w:b/>
+          <w:bCs/>
+          <w:sz w:val="24"/>
+          <w:szCs w:val="24"/>
+        </w:rPr>
+        <w:t>Intermediate Code Generator</w:t>
+      </w:r>
+    </w:p>
+    <w:p>
+      <w:pPr>
+        <w:rPr>
+          <w:sz w:val="24"/>
+          <w:szCs w:val="24"/>
+        </w:rPr>
+      </w:pPr>
+      <w:r>
+        <w:rPr>
+          <w:sz w:val="24"/>
+          <w:szCs w:val="24"/>
+        </w:rPr>
+        <w:t xml:space="preserve">The </w:t>
+      </w:r>
+      <w:r>
+        <w:rPr>
+          <w:b/>
+          <w:bCs/>
+          <w:sz w:val="24"/>
+          <w:szCs w:val="24"/>
+        </w:rPr>
+        <w:t>Intermediate Code Generator</w:t>
+      </w:r>
+      <w:r>
+        <w:rPr>
+          <w:sz w:val="24"/>
+          <w:szCs w:val="24"/>
+        </w:rPr>
+        <w:t xml:space="preserve"> converts source code into </w:t>
+      </w:r>
+      <w:r>
+        <w:rPr>
+          <w:b/>
+          <w:bCs/>
+          <w:sz w:val="24"/>
+          <w:szCs w:val="24"/>
+        </w:rPr>
+        <w:t>platform-independent intermediate code (bytecode or IR)</w:t>
+      </w:r>
+      <w:r>
+        <w:rPr>
+          <w:sz w:val="24"/>
+          <w:szCs w:val="24"/>
+        </w:rPr>
+        <w:t>, which acts as a bridge between source code and machine code.</w:t>
+      </w:r>
+    </w:p>
+    <w:p>
+      <w:pPr>
+        <w:rPr>
+          <w:sz w:val="24"/>
+          <w:szCs w:val="24"/>
+        </w:rPr>
+      </w:pPr>
+    </w:p>
+    <w:p>
+      <w:pPr>
+        <w:rPr>
+          <w:b/>
+          <w:bCs/>
+          <w:sz w:val="24"/>
+          <w:szCs w:val="24"/>
+        </w:rPr>
+      </w:pPr>
+      <w:r>
+        <w:rPr>
+          <w:b/>
+          <w:bCs/>
+          <w:sz w:val="24"/>
+          <w:szCs w:val="24"/>
+        </w:rPr>
+        <w:t>Code Optimizer</w:t>
+      </w:r>
+    </w:p>
+    <w:p>
+      <w:pPr>
+        <w:rPr>
+          <w:sz w:val="24"/>
+          <w:szCs w:val="24"/>
+        </w:rPr>
+      </w:pPr>
+      <w:r>
+        <w:rPr>
+          <w:sz w:val="24"/>
+          <w:szCs w:val="24"/>
+        </w:rPr>
+        <w:t xml:space="preserve">The </w:t>
+      </w:r>
+      <w:r>
+        <w:rPr>
+          <w:b/>
+          <w:bCs/>
+          <w:sz w:val="24"/>
+          <w:szCs w:val="24"/>
+        </w:rPr>
+        <w:t>Code Optimizer</w:t>
+      </w:r>
+      <w:r>
+        <w:rPr>
+          <w:sz w:val="24"/>
+          <w:szCs w:val="24"/>
+        </w:rPr>
+        <w:t xml:space="preserve"> improves intermediate code by </w:t>
+      </w:r>
+      <w:r>
+        <w:rPr>
+          <w:b/>
+          <w:bCs/>
+          <w:sz w:val="24"/>
+          <w:szCs w:val="24"/>
+        </w:rPr>
+        <w:t>removing redundant instructions and improving efficiency</w:t>
+      </w:r>
+      <w:r>
+        <w:rPr>
+          <w:sz w:val="24"/>
+          <w:szCs w:val="24"/>
+        </w:rPr>
+        <w:t>, making the program faster and more memory-efficient.</w:t>
+      </w:r>
+    </w:p>
+    <w:p>
+      <w:pPr>
+        <w:rPr>
+          <w:sz w:val="24"/>
+          <w:szCs w:val="24"/>
+        </w:rPr>
+      </w:pPr>
+    </w:p>
+    <w:p>
+      <w:pPr>
+        <w:rPr>
+          <w:b/>
+          <w:bCs/>
+          <w:sz w:val="24"/>
+          <w:szCs w:val="24"/>
+        </w:rPr>
+      </w:pPr>
+      <w:r>
+        <w:rPr>
+          <w:b/>
+          <w:bCs/>
+          <w:sz w:val="24"/>
+          <w:szCs w:val="24"/>
+        </w:rPr>
+        <w:t>Target Code Generator</w:t>
+      </w:r>
+    </w:p>
+    <w:p>
+      <w:pPr>
+        <w:rPr>
+          <w:sz w:val="24"/>
+          <w:szCs w:val="24"/>
+        </w:rPr>
+      </w:pPr>
+      <w:r>
+        <w:rPr>
+          <w:sz w:val="24"/>
+          <w:szCs w:val="24"/>
+        </w:rPr>
+        <w:t xml:space="preserve">The </w:t>
+      </w:r>
+      <w:r>
+        <w:rPr>
+          <w:b/>
+          <w:bCs/>
+          <w:sz w:val="24"/>
+          <w:szCs w:val="24"/>
+        </w:rPr>
+        <w:t>Target Code Generator</w:t>
+      </w:r>
+      <w:r>
+        <w:rPr>
+          <w:sz w:val="24"/>
+          <w:szCs w:val="24"/>
+        </w:rPr>
+        <w:t xml:space="preserve"> converts optimized intermediate code into </w:t>
+      </w:r>
+      <w:r>
+        <w:rPr>
+          <w:b/>
+          <w:bCs/>
+          <w:sz w:val="24"/>
+          <w:szCs w:val="24"/>
+        </w:rPr>
+        <w:t>final native machine code</w:t>
+      </w:r>
+      <w:r>
+        <w:rPr>
+          <w:sz w:val="24"/>
+          <w:szCs w:val="24"/>
+        </w:rPr>
+        <w:t xml:space="preserve"> that the CPU can execute directly.</w:t>
+      </w:r>
+    </w:p>
+    <w:p>
+      <w:pPr>
+        <w:rPr>
+          <w:sz w:val="24"/>
+          <w:szCs w:val="24"/>
+        </w:rPr>
+      </w:pPr>
+    </w:p>
+    <w:p>
+      <w:pPr>
+        <w:rPr>
+          <w:b/>
+          <w:bCs/>
+          <w:sz w:val="24"/>
+          <w:szCs w:val="24"/>
+        </w:rPr>
+      </w:pPr>
+      <w:r>
+        <w:rPr>
+          <w:b/>
+          <w:bCs/>
+          <w:sz w:val="24"/>
+          <w:szCs w:val="24"/>
+        </w:rPr>
+        <w:t>Profiler</w:t>
+      </w:r>
+    </w:p>
+    <w:p>
+      <w:pPr>
+        <w:rPr>
+          <w:sz w:val="24"/>
+          <w:szCs w:val="24"/>
+        </w:rPr>
+      </w:pPr>
+      <w:r>
+        <w:rPr>
+          <w:sz w:val="24"/>
+          <w:szCs w:val="24"/>
+        </w:rPr>
+        <w:t xml:space="preserve">The </w:t>
+      </w:r>
+      <w:r>
+        <w:rPr>
+          <w:b/>
+          <w:bCs/>
+          <w:sz w:val="24"/>
+          <w:szCs w:val="24"/>
+        </w:rPr>
+        <w:t>Profiler</w:t>
+      </w:r>
+      <w:r>
+        <w:rPr>
+          <w:sz w:val="24"/>
+          <w:szCs w:val="24"/>
+        </w:rPr>
+        <w:t xml:space="preserve"> is a JVM tool that monitors program execution to </w:t>
+      </w:r>
+      <w:proofErr w:type="spellStart"/>
+      <w:r>
+        <w:rPr>
+          <w:sz w:val="24"/>
+          <w:szCs w:val="24"/>
+        </w:rPr>
+        <w:t>analyze</w:t>
+      </w:r>
+      <w:proofErr w:type="spellEnd"/>
+      <w:r>
+        <w:rPr>
+          <w:sz w:val="24"/>
+          <w:szCs w:val="24"/>
+        </w:rPr>
         <w:t xml:space="preserve"> </w:t>
       </w:r>
+      <w:r>
+        <w:rPr>
+          <w:b/>
+          <w:bCs/>
+          <w:sz w:val="24"/>
+          <w:szCs w:val="24"/>
+        </w:rPr>
+        <w:t>performance, memory usage, CPU usage, and method execution patterns</w:t>
+      </w:r>
+    </w:p>
+    <w:p>
+      <w:pPr>
+        <w:rPr>
+          <w:sz w:val="24"/>
+          <w:szCs w:val="24"/>
+        </w:rPr>
+      </w:pPr>
+    </w:p>
+    <w:p>
+      <w:pPr>
+        <w:rPr>
+          <w:sz w:val="24"/>
+          <w:szCs w:val="24"/>
+        </w:rPr>
+      </w:pPr>
+    </w:p>
+    <w:p>
+      <w:pPr>
+        <w:rPr>
+          <w:sz w:val="24"/>
+          <w:szCs w:val="24"/>
+        </w:rPr>
+      </w:pPr>
+      <w:r>
+        <w:rPr>
+          <w:b/>
+          <w:bCs/>
+          <w:sz w:val="24"/>
+          <w:szCs w:val="24"/>
+        </w:rPr>
+        <w:t xml:space="preserve">Native Method Interface (JNI): </w:t>
+      </w:r>
+      <w:r>
+        <w:rPr>
+          <w:sz w:val="24"/>
+          <w:szCs w:val="24"/>
+        </w:rPr>
+        <w:t>is JVM component that allows Java code to communicate with code written in other programming languages like C or C++.</w:t>
+      </w:r>
+    </w:p>
+    <w:p>
+      <w:pPr>
+        <w:rPr>
+          <w:sz w:val="24"/>
+          <w:szCs w:val="24"/>
+        </w:rPr>
+      </w:pPr>
+    </w:p>
+    <w:p>
+      <w:pPr>
+        <w:rPr>
+          <w:sz w:val="24"/>
+          <w:szCs w:val="24"/>
+        </w:rPr>
+      </w:pPr>
+      <w:r>
+        <w:rPr>
+          <w:b/>
+          <w:bCs/>
+          <w:sz w:val="24"/>
+          <w:szCs w:val="24"/>
+        </w:rPr>
+        <w:t xml:space="preserve">Native Method Library: </w:t>
+      </w:r>
+      <w:r>
+        <w:rPr>
+          <w:sz w:val="24"/>
+          <w:szCs w:val="24"/>
+        </w:rPr>
+        <w:t>a collection of pre-written code written in languages like C or C++, which Java can use through JNI</w:t>
+      </w:r>
+      <w:r>
+        <w:rPr>
+          <w:sz w:val="24"/>
+          <w:szCs w:val="24"/>
+        </w:rPr>
+        <w:t xml:space="preserve"> (Java Native Interface)</w:t>
+      </w:r>
+      <w:r>
+        <w:rPr>
+          <w:sz w:val="24"/>
+          <w:szCs w:val="24"/>
+        </w:rPr>
+        <w:t>.</w:t>
+      </w:r>
+    </w:p>
+    <w:p>
+      <w:pPr>
+        <w:rPr>
+          <w:sz w:val="24"/>
+          <w:szCs w:val="24"/>
+        </w:rPr>
+      </w:pPr>
+      <w:r>
+        <w:rPr>
+          <w:sz w:val="24"/>
+          <w:szCs w:val="24"/>
+        </w:rPr>
+        <w:t xml:space="preserve">A </w:t>
+      </w:r>
+      <w:r>
+        <w:rPr>
+          <w:b/>
+          <w:bCs/>
+          <w:sz w:val="24"/>
+          <w:szCs w:val="24"/>
+        </w:rPr>
+        <w:t>Custom Class Loader</w:t>
+      </w:r>
+      <w:r>
+        <w:rPr>
+          <w:b/>
+          <w:bCs/>
+          <w:sz w:val="24"/>
+          <w:szCs w:val="24"/>
+        </w:rPr>
+        <w:t>:</w:t>
+      </w:r>
+      <w:r>
+        <w:rPr>
+          <w:sz w:val="24"/>
+          <w:szCs w:val="24"/>
+        </w:rPr>
+        <w:t xml:space="preserve"> is a user-defined class loader in Java that is created by extending the </w:t>
+      </w:r>
       <w:proofErr w:type="spellStart"/>
       <w:r>
-        <w:t>Classpath</w:t>
+        <w:rPr>
+          <w:sz w:val="24"/>
+          <w:szCs w:val="24"/>
+        </w:rPr>
+        <w:t>ClassLoader</w:t>
       </w:r>
       <w:proofErr w:type="spellEnd"/>
       <w:r>
-        <w:t xml:space="preserve"> (-</w:t>
-      </w:r>
-      <w:proofErr w:type="spellStart"/>
-      <w:r>
-        <w:t>classpath</w:t>
-      </w:r>
-      <w:proofErr w:type="spellEnd"/>
-      <w:r>
-        <w:t xml:space="preserve"> or CLASSPATH environment variable)</w:t>
-      </w:r>
-    </w:p>
-    <w:p>
-      <w:pPr>
-        <w:pStyle w:val="ListParagraph"/>
-        <w:jc w:val="center"/>
-        <w:rPr>
-          <w:lang w:val="en-US"/>
-        </w:rPr>
-      </w:pPr>
-    </w:p>
-    <w:p>
-      <w:r>
-        <w:rPr>
-          <w:b/>
-          <w:bCs/>
-        </w:rPr>
-        <w:t>Runtime Data Area:</w:t>
-      </w:r>
-      <w:r>
-        <w:t xml:space="preserve"> </w:t>
-      </w:r>
-      <w:r>
-        <w:t>the memory area used by JVM during program execution</w:t>
-      </w:r>
-      <w:r>
-        <w:t xml:space="preserve"> &amp; represent the storage for class file to be executed</w:t>
-      </w:r>
-      <w:r>
-        <w:t>.</w:t>
-      </w:r>
-    </w:p>
-    <w:p>
-      <w:r>
-        <w:rPr>
-          <w:b/>
-          <w:bCs/>
-        </w:rPr>
-        <w:t>Execution Engine:</w:t>
-      </w:r>
-      <w:r>
-        <w:t xml:space="preserve"> </w:t>
-      </w:r>
-      <w:r>
-        <w:t>the part of JVM that executes</w:t>
-      </w:r>
-      <w:r>
-        <w:t xml:space="preserve"> line-by-line</w:t>
-      </w:r>
-      <w:r>
-        <w:t xml:space="preserve"> the bytecode after it is loaded.</w:t>
-      </w:r>
-    </w:p>
-    <w:p>
-      <w:r>
-        <w:rPr>
-          <w:b/>
-          <w:bCs/>
-        </w:rPr>
-        <w:t>Native Method Interface (JNI)</w:t>
-      </w:r>
-      <w:r>
-        <w:rPr>
-          <w:b/>
-          <w:bCs/>
-        </w:rPr>
-        <w:t xml:space="preserve">: </w:t>
-      </w:r>
-      <w:r>
-        <w:t xml:space="preserve">is JVM component </w:t>
-      </w:r>
-      <w:r>
-        <w:t>that allows Java code to communicate with code written in other programming languages like C or C++.</w:t>
-      </w:r>
-    </w:p>
-    <w:p>
-      <w:r>
-        <w:rPr>
-          <w:b/>
-          <w:bCs/>
-        </w:rPr>
-        <w:lastRenderedPageBreak/>
-        <w:t>Native Method Library</w:t>
-      </w:r>
-      <w:r>
-        <w:rPr>
-          <w:b/>
-          <w:bCs/>
-        </w:rPr>
-        <w:t xml:space="preserve">: </w:t>
-      </w:r>
-      <w:r>
-        <w:t>a collection of pre-written code written in languages like C or C++, which Java can use through JNI</w:t>
-      </w:r>
-      <w:r>
-        <w:t xml:space="preserve"> (Java Native Interface)</w:t>
-      </w:r>
-      <w:r>
-        <w:t>.</w:t>
-      </w:r>
-    </w:p>
-    <w:p>
-      <w:pPr>
-        <w:rPr>
-          <w:lang w:val="en-US"/>
-        </w:rPr>
-      </w:pPr>
+        <w:rPr>
+          <w:sz w:val="24"/>
+          <w:szCs w:val="24"/>
+        </w:rPr>
+        <w:t xml:space="preserve"> class. It allows developers to </w:t>
+      </w:r>
+      <w:r>
+        <w:rPr>
+          <w:b/>
+          <w:bCs/>
+          <w:sz w:val="24"/>
+          <w:szCs w:val="24"/>
+        </w:rPr>
+        <w:t>load classes in a custom way</w:t>
+      </w:r>
+      <w:r>
+        <w:rPr>
+          <w:sz w:val="24"/>
+          <w:szCs w:val="24"/>
+        </w:rPr>
+        <w:t xml:space="preserve"> instead of using the default JVM class loaders (Bootstrap, Platform, Application).</w:t>
+      </w:r>
+    </w:p>
+    <w:p>
+      <w:pPr>
+        <w:rPr>
+          <w:sz w:val="24"/>
+          <w:szCs w:val="24"/>
+        </w:rPr>
+      </w:pPr>
+    </w:p>
+    <w:p>
+      <w:pPr>
+        <w:pStyle w:val="ListParagraph"/>
+        <w:numPr>
+          <w:ilvl w:val="0"/>
+          <w:numId w:val="3"/>
+        </w:numPr>
+        <w:rPr>
+          <w:sz w:val="24"/>
+          <w:szCs w:val="24"/>
+        </w:rPr>
+      </w:pPr>
+      <w:r>
+        <w:rPr>
+          <w:sz w:val="24"/>
+          <w:szCs w:val="24"/>
+        </w:rPr>
+        <w:t xml:space="preserve">Used in application servers like Tomcat, JBoss, WebLogic to isolate multiple applications. </w:t>
+      </w:r>
+    </w:p>
+    <w:p>
+      <w:pPr>
+        <w:pStyle w:val="ListParagraph"/>
+        <w:numPr>
+          <w:ilvl w:val="0"/>
+          <w:numId w:val="3"/>
+        </w:numPr>
+        <w:rPr>
+          <w:sz w:val="24"/>
+          <w:szCs w:val="24"/>
+        </w:rPr>
+      </w:pPr>
+      <w:r>
+        <w:rPr>
+          <w:sz w:val="24"/>
+          <w:szCs w:val="24"/>
+        </w:rPr>
+        <w:t xml:space="preserve">Used in plugin systems (Eclipse, IntelliJ, Minecraft mods) to load features dynamically at runtime. </w:t>
+      </w:r>
+    </w:p>
+    <w:p>
+      <w:pPr>
+        <w:pStyle w:val="ListParagraph"/>
+        <w:numPr>
+          <w:ilvl w:val="0"/>
+          <w:numId w:val="3"/>
+        </w:numPr>
+        <w:rPr>
+          <w:sz w:val="24"/>
+          <w:szCs w:val="24"/>
+        </w:rPr>
+      </w:pPr>
+      <w:r>
+        <w:rPr>
+          <w:sz w:val="24"/>
+          <w:szCs w:val="24"/>
+        </w:rPr>
+        <w:t xml:space="preserve">Used in frameworks like Spring and Hibernate for dynamic class loading and scanning. </w:t>
+      </w:r>
+    </w:p>
+    <w:p>
+      <w:pPr>
+        <w:pStyle w:val="ListParagraph"/>
+        <w:numPr>
+          <w:ilvl w:val="0"/>
+          <w:numId w:val="3"/>
+        </w:numPr>
+        <w:rPr>
+          <w:sz w:val="24"/>
+          <w:szCs w:val="24"/>
+        </w:rPr>
+      </w:pPr>
+      <w:r>
+        <w:rPr>
+          <w:sz w:val="24"/>
+          <w:szCs w:val="24"/>
+        </w:rPr>
+        <w:t xml:space="preserve">Used in security systems to restrict or control which classes can be loaded. </w:t>
+      </w:r>
+    </w:p>
+    <w:p>
+      <w:pPr>
+        <w:pStyle w:val="ListParagraph"/>
+        <w:numPr>
+          <w:ilvl w:val="0"/>
+          <w:numId w:val="3"/>
+        </w:numPr>
+        <w:rPr>
+          <w:sz w:val="24"/>
+          <w:szCs w:val="24"/>
+        </w:rPr>
+      </w:pPr>
+      <w:r>
+        <w:rPr>
+          <w:sz w:val="24"/>
+          <w:szCs w:val="24"/>
+        </w:rPr>
+        <w:t xml:space="preserve">Used for loading encrypted or obfuscated classes by decrypting bytecode before loading. </w:t>
+      </w:r>
+    </w:p>
+    <w:p>
+      <w:pPr>
+        <w:pStyle w:val="ListParagraph"/>
+        <w:numPr>
+          <w:ilvl w:val="0"/>
+          <w:numId w:val="3"/>
+        </w:numPr>
+        <w:rPr>
+          <w:sz w:val="24"/>
+          <w:szCs w:val="24"/>
+        </w:rPr>
+      </w:pPr>
+      <w:r>
+        <w:rPr>
+          <w:sz w:val="24"/>
+          <w:szCs w:val="24"/>
+        </w:rPr>
+        <w:t xml:space="preserve">Used in cloud and microservice platforms for module isolation. </w:t>
+      </w:r>
+    </w:p>
+    <w:p>
+      <w:pPr>
+        <w:pStyle w:val="ListParagraph"/>
+        <w:numPr>
+          <w:ilvl w:val="0"/>
+          <w:numId w:val="3"/>
+        </w:numPr>
+        <w:rPr>
+          <w:sz w:val="24"/>
+          <w:szCs w:val="24"/>
+        </w:rPr>
+      </w:pPr>
+      <w:r>
+        <w:rPr>
+          <w:sz w:val="24"/>
+          <w:szCs w:val="24"/>
+        </w:rPr>
+        <w:t xml:space="preserve">Used for hot deployment, allowing class updates without restarting the JVM. </w:t>
+      </w:r>
+    </w:p>
+    <w:p>
+      <w:pPr>
+        <w:pStyle w:val="ListParagraph"/>
+        <w:numPr>
+          <w:ilvl w:val="0"/>
+          <w:numId w:val="3"/>
+        </w:numPr>
+        <w:rPr>
+          <w:sz w:val="24"/>
+          <w:szCs w:val="24"/>
+          <w:lang w:val="en-US"/>
+        </w:rPr>
+      </w:pPr>
+      <w:r>
+        <w:rPr>
+          <w:sz w:val="24"/>
+          <w:szCs w:val="24"/>
+        </w:rPr>
+        <w:t>Used in modular systems (like OSGi) to manage independent components.</w:t>
+      </w:r>
     </w:p>
     <w:sectPr>
       <w:pgSz w:w="11906" w:h="16838"/>
-      <w:pgMar w:top="1440" w:right="991" w:bottom="1440" w:left="851" w:header="708" w:footer="708" w:gutter="0"/>
+      <w:pgMar w:top="568" w:right="849" w:bottom="1440" w:left="851" w:header="708" w:footer="708" w:gutter="0"/>
       <w:cols w:space="708"/>
       <w:docGrid w:linePitch="360"/>
     </w:sectPr>
@@ -1792,7 +3858,7 @@
   <w:abstractNum w:abstractNumId="0" w15:restartNumberingAfterBreak="0">
     <w:nsid w:val="14D0182F"/>
     <w:multiLevelType w:val="hybridMultilevel"/>
-    <w:tmpl w:val="648E1D72"/>
+    <w:tmpl w:val="A0C29CB6"/>
     <w:lvl w:ilvl="0" w:tplc="4C090001">
       <w:start w:val="1"/>
       <w:numFmt w:val="bullet"/>

</xml_diff>